<commit_message>
docs: atualiza a História Completa em Word com as mudanças do Bunker
Co-Authored-By: Claude Opus 5.5 <noreply@anthropic.com>
</commit_message>
<xml_diff>
--- a/docs/historia/História_Completa.docx
+++ b/docs/historia/História_Completa.docx
@@ -420,11 +420,7 @@
           <w:hyperlink w:history="1" w:anchor="_Toc1">
             <w:r>
               <w:t xml:space="preserve">Sobre este documento</w:t>
-            </w:r>
-            <w:r>
               <w:tab/>
-            </w:r>
-            <w:r>
               <w:fldChar w:fldCharType="begin" w:dirty="true"/>
               <w:instrText xml:space="preserve">PAGEREF _Toc1 \h</w:instrText>
               <w:fldChar w:fldCharType="separate"/>
@@ -442,11 +438,7 @@
           <w:hyperlink w:history="1" w:anchor="_Toc2">
             <w:r>
               <w:t xml:space="preserve">1. A história em um parágrafo</w:t>
-            </w:r>
-            <w:r>
               <w:tab/>
-            </w:r>
-            <w:r>
               <w:fldChar w:fldCharType="begin" w:dirty="true"/>
               <w:instrText xml:space="preserve">PAGEREF _Toc2 \h</w:instrText>
               <w:fldChar w:fldCharType="separate"/>
@@ -464,11 +456,7 @@
           <w:hyperlink w:history="1" w:anchor="_Toc3">
             <w:r>
               <w:t xml:space="preserve">2. O mundo</w:t>
-            </w:r>
-            <w:r>
               <w:tab/>
-            </w:r>
-            <w:r>
               <w:fldChar w:fldCharType="begin" w:dirty="true"/>
               <w:instrText xml:space="preserve">PAGEREF _Toc3 \h</w:instrText>
               <w:fldChar w:fldCharType="separate"/>
@@ -487,11 +475,7 @@
           <w:hyperlink w:history="1" w:anchor="_Toc4">
             <w:r>
               <w:t xml:space="preserve">2.1 A Terra em 3026</w:t>
-            </w:r>
-            <w:r>
               <w:tab/>
-            </w:r>
-            <w:r>
               <w:fldChar w:fldCharType="begin" w:dirty="true"/>
               <w:instrText xml:space="preserve">PAGEREF _Toc4 \h</w:instrText>
               <w:fldChar w:fldCharType="separate"/>
@@ -510,11 +494,7 @@
           <w:hyperlink w:history="1" w:anchor="_Toc5">
             <w:r>
               <w:t xml:space="preserve">2.2 O campus em 3026</w:t>
-            </w:r>
-            <w:r>
               <w:tab/>
-            </w:r>
-            <w:r>
               <w:fldChar w:fldCharType="begin" w:dirty="true"/>
               <w:instrText xml:space="preserve">PAGEREF _Toc5 \h</w:instrText>
               <w:fldChar w:fldCharType="separate"/>
@@ -533,11 +513,7 @@
           <w:hyperlink w:history="1" w:anchor="_Toc6">
             <w:r>
               <w:t xml:space="preserve">2.3 Os robôs</w:t>
-            </w:r>
-            <w:r>
               <w:tab/>
-            </w:r>
-            <w:r>
               <w:fldChar w:fldCharType="begin" w:dirty="true"/>
               <w:instrText xml:space="preserve">PAGEREF _Toc6 \h</w:instrText>
               <w:fldChar w:fldCharType="separate"/>
@@ -556,11 +532,7 @@
           <w:hyperlink w:history="1" w:anchor="_Toc7">
             <w:r>
               <w:t xml:space="preserve">2.4 Os Faroleiros e o símbolo deles</w:t>
-            </w:r>
-            <w:r>
               <w:tab/>
-            </w:r>
-            <w:r>
               <w:fldChar w:fldCharType="begin" w:dirty="true"/>
               <w:instrText xml:space="preserve">PAGEREF _Toc7 \h</w:instrText>
               <w:fldChar w:fldCharType="separate"/>
@@ -578,11 +550,7 @@
           <w:hyperlink w:history="1" w:anchor="_Toc8">
             <w:r>
               <w:t xml:space="preserve">3. A Âncora e a fenda</w:t>
-            </w:r>
-            <w:r>
               <w:tab/>
-            </w:r>
-            <w:r>
               <w:fldChar w:fldCharType="begin" w:dirty="true"/>
               <w:instrText xml:space="preserve">PAGEREF _Toc8 \h</w:instrText>
               <w:fldChar w:fldCharType="separate"/>
@@ -601,11 +569,7 @@
           <w:hyperlink w:history="1" w:anchor="_Toc9">
             <w:r>
               <w:t xml:space="preserve">3.1 Como voltar: cada um traz uma parte</w:t>
-            </w:r>
-            <w:r>
               <w:tab/>
-            </w:r>
-            <w:r>
               <w:fldChar w:fldCharType="begin" w:dirty="true"/>
               <w:instrText xml:space="preserve">PAGEREF _Toc9 \h</w:instrText>
               <w:fldChar w:fldCharType="separate"/>
@@ -623,11 +587,7 @@
           <w:hyperlink w:history="1" w:anchor="_Toc10">
             <w:r>
               <w:t xml:space="preserve">4. Os personagens</w:t>
-            </w:r>
-            <w:r>
               <w:tab/>
-            </w:r>
-            <w:r>
               <w:fldChar w:fldCharType="begin" w:dirty="true"/>
               <w:instrText xml:space="preserve">PAGEREF _Toc10 \h</w:instrText>
               <w:fldChar w:fldCharType="separate"/>
@@ -646,11 +606,7 @@
           <w:hyperlink w:history="1" w:anchor="_Toc11">
             <w:r>
               <w:t xml:space="preserve">4.1 Regras para todos</w:t>
-            </w:r>
-            <w:r>
               <w:tab/>
-            </w:r>
-            <w:r>
               <w:fldChar w:fldCharType="begin" w:dirty="true"/>
               <w:instrText xml:space="preserve">PAGEREF _Toc11 \h</w:instrText>
               <w:fldChar w:fldCharType="separate"/>
@@ -669,11 +625,7 @@
           <w:hyperlink w:history="1" w:anchor="_Toc12">
             <w:r>
               <w:t xml:space="preserve">4.2 Fichas</w:t>
-            </w:r>
-            <w:r>
               <w:tab/>
-            </w:r>
-            <w:r>
               <w:fldChar w:fldCharType="begin" w:dirty="true"/>
               <w:instrText xml:space="preserve">PAGEREF _Toc12 \h</w:instrText>
               <w:fldChar w:fldCharType="separate"/>
@@ -692,11 +644,7 @@
           <w:hyperlink w:history="1" w:anchor="_Toc13">
             <w:r>
               <w:t xml:space="preserve">4.3 O Carlos, o antagonista</w:t>
-            </w:r>
-            <w:r>
               <w:tab/>
-            </w:r>
-            <w:r>
               <w:fldChar w:fldCharType="begin" w:dirty="true"/>
               <w:instrText xml:space="preserve">PAGEREF _Toc13 \h</w:instrText>
               <w:fldChar w:fldCharType="separate"/>
@@ -714,11 +662,7 @@
           <w:hyperlink w:history="1" w:anchor="_Toc14">
             <w:r>
               <w:t xml:space="preserve">5. A família Magalhães</w:t>
-            </w:r>
-            <w:r>
               <w:tab/>
-            </w:r>
-            <w:r>
               <w:fldChar w:fldCharType="begin" w:dirty="true"/>
               <w:instrText xml:space="preserve">PAGEREF _Toc14 \h</w:instrText>
               <w:fldChar w:fldCharType="separate"/>
@@ -736,11 +680,7 @@
           <w:hyperlink w:history="1" w:anchor="_Toc15">
             <w:r>
               <w:t xml:space="preserve">6. Os esconderijos</w:t>
-            </w:r>
-            <w:r>
               <w:tab/>
-            </w:r>
-            <w:r>
               <w:fldChar w:fldCharType="begin" w:dirty="true"/>
               <w:instrText xml:space="preserve">PAGEREF _Toc15 \h</w:instrText>
               <w:fldChar w:fldCharType="separate"/>
@@ -759,11 +699,7 @@
           <w:hyperlink w:history="1" w:anchor="_Toc16">
             <w:r>
               <w:t xml:space="preserve">6.1 Como eles se comunicam</w:t>
-            </w:r>
-            <w:r>
               <w:tab/>
-            </w:r>
-            <w:r>
               <w:fldChar w:fldCharType="begin" w:dirty="true"/>
               <w:instrText xml:space="preserve">PAGEREF _Toc16 \h</w:instrText>
               <w:fldChar w:fldCharType="separate"/>
@@ -781,11 +717,7 @@
           <w:hyperlink w:history="1" w:anchor="_Toc17">
             <w:r>
               <w:t xml:space="preserve">7. Linha do tempo</w:t>
-            </w:r>
-            <w:r>
               <w:tab/>
-            </w:r>
-            <w:r>
               <w:fldChar w:fldCharType="begin" w:dirty="true"/>
               <w:instrText xml:space="preserve">PAGEREF _Toc17 \h</w:instrText>
               <w:fldChar w:fldCharType="separate"/>
@@ -804,11 +736,7 @@
           <w:hyperlink w:history="1" w:anchor="_Toc18">
             <w:r>
               <w:t xml:space="preserve">7.1 Quem esteve no ponto</w:t>
-            </w:r>
-            <w:r>
               <w:tab/>
-            </w:r>
-            <w:r>
               <w:fldChar w:fldCharType="begin" w:dirty="true"/>
               <w:instrText xml:space="preserve">PAGEREF _Toc18 \h</w:instrText>
               <w:fldChar w:fldCharType="separate"/>
@@ -827,11 +755,7 @@
           <w:hyperlink w:history="1" w:anchor="_Toc19">
             <w:r>
               <w:t xml:space="preserve">7.2 Ordem dos acontecimentos</w:t>
-            </w:r>
-            <w:r>
               <w:tab/>
-            </w:r>
-            <w:r>
               <w:fldChar w:fldCharType="begin" w:dirty="true"/>
               <w:instrText xml:space="preserve">PAGEREF _Toc19 \h</w:instrText>
               <w:fldChar w:fldCharType="separate"/>
@@ -849,11 +773,7 @@
           <w:hyperlink w:history="1" w:anchor="_Toc20">
             <w:r>
               <w:t xml:space="preserve">8. Estrutura da história</w:t>
-            </w:r>
-            <w:r>
               <w:tab/>
-            </w:r>
-            <w:r>
               <w:fldChar w:fldCharType="begin" w:dirty="true"/>
               <w:instrText xml:space="preserve">PAGEREF _Toc20 \h</w:instrText>
               <w:fldChar w:fldCharType="separate"/>
@@ -872,11 +792,7 @@
           <w:hyperlink w:history="1" w:anchor="_Toc21">
             <w:r>
               <w:t xml:space="preserve">Ato 1 — Acordar (Biblioteca)</w:t>
-            </w:r>
-            <w:r>
               <w:tab/>
-            </w:r>
-            <w:r>
               <w:fldChar w:fldCharType="begin" w:dirty="true"/>
               <w:instrText xml:space="preserve">PAGEREF _Toc21 \h</w:instrText>
               <w:fldChar w:fldCharType="separate"/>
@@ -895,11 +811,7 @@
           <w:hyperlink w:history="1" w:anchor="_Toc22">
             <w:r>
               <w:t xml:space="preserve">Ato 2 — Encontrar os outros (Bloco de salas, Labirinto e Centro de Convivência)</w:t>
-            </w:r>
-            <w:r>
               <w:tab/>
-            </w:r>
-            <w:r>
               <w:fldChar w:fldCharType="begin" w:dirty="true"/>
               <w:instrText xml:space="preserve">PAGEREF _Toc22 \h</w:instrText>
               <w:fldChar w:fldCharType="separate"/>
@@ -918,11 +830,7 @@
           <w:hyperlink w:history="1" w:anchor="_Toc23">
             <w:r>
               <w:t xml:space="preserve">Ato 3 — O esconderijo (Bunker)</w:t>
-            </w:r>
-            <w:r>
               <w:tab/>
-            </w:r>
-            <w:r>
               <w:fldChar w:fldCharType="begin" w:dirty="true"/>
               <w:instrText xml:space="preserve">PAGEREF _Toc23 \h</w:instrText>
               <w:fldChar w:fldCharType="separate"/>
@@ -941,11 +849,7 @@
           <w:hyperlink w:history="1" w:anchor="_Toc24">
             <w:r>
               <w:t xml:space="preserve">A virada — A mentira do Henrique</w:t>
-            </w:r>
-            <w:r>
               <w:tab/>
-            </w:r>
-            <w:r>
               <w:fldChar w:fldCharType="begin" w:dirty="true"/>
               <w:instrText xml:space="preserve">PAGEREF _Toc24 \h</w:instrText>
               <w:fldChar w:fldCharType="separate"/>
@@ -964,11 +868,7 @@
           <w:hyperlink w:history="1" w:anchor="_Toc25">
             <w:r>
               <w:t xml:space="preserve">Ato 4 — Consertar a Âncora e voltar (Núcleo)</w:t>
-            </w:r>
-            <w:r>
               <w:tab/>
-            </w:r>
-            <w:r>
               <w:fldChar w:fldCharType="begin" w:dirty="true"/>
               <w:instrText xml:space="preserve">PAGEREF _Toc25 \h</w:instrText>
               <w:fldChar w:fldCharType="separate"/>
@@ -986,11 +886,7 @@
           <w:hyperlink w:history="1" w:anchor="_Toc26">
             <w:r>
               <w:t xml:space="preserve">9. Vocabulário oficial</w:t>
-            </w:r>
-            <w:r>
               <w:tab/>
-            </w:r>
-            <w:r>
               <w:fldChar w:fldCharType="begin" w:dirty="true"/>
               <w:instrText xml:space="preserve">PAGEREF _Toc26 \h</w:instrText>
               <w:fldChar w:fldCharType="separate"/>
@@ -1008,11 +904,7 @@
           <w:hyperlink w:history="1" w:anchor="_Toc27">
             <w:r>
               <w:t xml:space="preserve">10. Pendências: o que falta decidir na história</w:t>
-            </w:r>
-            <w:r>
               <w:tab/>
-            </w:r>
-            <w:r>
               <w:fldChar w:fldCharType="begin" w:dirty="true"/>
               <w:instrText xml:space="preserve">PAGEREF _Toc27 \h</w:instrText>
               <w:fldChar w:fldCharType="separate"/>
@@ -1031,11 +923,7 @@
           <w:hyperlink w:history="1" w:anchor="_Toc28">
             <w:r>
               <w:t xml:space="preserve">10.1 O mundo de 3026</w:t>
-            </w:r>
-            <w:r>
               <w:tab/>
-            </w:r>
-            <w:r>
               <w:fldChar w:fldCharType="begin" w:dirty="true"/>
               <w:instrText xml:space="preserve">PAGEREF _Toc28 \h</w:instrText>
               <w:fldChar w:fldCharType="separate"/>
@@ -1054,11 +942,7 @@
           <w:hyperlink w:history="1" w:anchor="_Toc29">
             <w:r>
               <w:t xml:space="preserve">10.2 O Carlos</w:t>
-            </w:r>
-            <w:r>
               <w:tab/>
-            </w:r>
-            <w:r>
               <w:fldChar w:fldCharType="begin" w:dirty="true"/>
               <w:instrText xml:space="preserve">PAGEREF _Toc29 \h</w:instrText>
               <w:fldChar w:fldCharType="separate"/>
@@ -1077,11 +961,7 @@
           <w:hyperlink w:history="1" w:anchor="_Toc30">
             <w:r>
               <w:t xml:space="preserve">10.3 O Henrique e a mentira</w:t>
-            </w:r>
-            <w:r>
               <w:tab/>
-            </w:r>
-            <w:r>
               <w:fldChar w:fldCharType="begin" w:dirty="true"/>
               <w:instrText xml:space="preserve">PAGEREF _Toc30 \h</w:instrText>
               <w:fldChar w:fldCharType="separate"/>
@@ -1100,11 +980,7 @@
           <w:hyperlink w:history="1" w:anchor="_Toc31">
             <w:r>
               <w:t xml:space="preserve">10.4 Os outros personagens</w:t>
-            </w:r>
-            <w:r>
               <w:tab/>
-            </w:r>
-            <w:r>
               <w:fldChar w:fldCharType="begin" w:dirty="true"/>
               <w:instrText xml:space="preserve">PAGEREF _Toc31 \h</w:instrText>
               <w:fldChar w:fldCharType="separate"/>
@@ -1123,11 +999,7 @@
           <w:hyperlink w:history="1" w:anchor="_Toc32">
             <w:r>
               <w:t xml:space="preserve">10.5 A estrutura da história</w:t>
-            </w:r>
-            <w:r>
               <w:tab/>
-            </w:r>
-            <w:r>
               <w:fldChar w:fldCharType="begin" w:dirty="true"/>
               <w:instrText xml:space="preserve">PAGEREF _Toc32 \h</w:instrText>
               <w:fldChar w:fldCharType="separate"/>
@@ -1146,11 +1018,7 @@
           <w:hyperlink w:history="1" w:anchor="_Toc33">
             <w:r>
               <w:t xml:space="preserve">10.6 A volta e o fim</w:t>
-            </w:r>
-            <w:r>
               <w:tab/>
-            </w:r>
-            <w:r>
               <w:fldChar w:fldCharType="begin" w:dirty="true"/>
               <w:instrText xml:space="preserve">PAGEREF _Toc33 \h</w:instrText>
               <w:fldChar w:fldCharType="separate"/>
@@ -6734,7 +6602,7 @@
                 <w:sz w:val="19"/>
                 <w:szCs w:val="19"/>
               </w:rPr>
-              <w:t xml:space="preserve">, com as câmeras do campus e o rádio. Diz que está escondido ali tentando consertar tudo. O Carlos nunca vai lá. O Zane chega depois do Labirinto, com Gabriel</w:t>
+              <w:t xml:space="preserve">, com as câmeras do campus e o rádio. Diz que está escondido ali tentando consertar tudo. O Carlos nunca vai lá. O Zane chega depois do Labirinto, com Gabriel. No fim do Bunker, o grupo todo se encontra ali pela primeira vez (Ato 3)</w:t>
             </w:r>
           </w:p>
         </w:tc>
@@ -9791,16 +9659,70 @@
           <w:i w:val="false"/>
           <w:iCs w:val="false"/>
         </w:rPr>
-        <w:t xml:space="preserve"> no bunker há uma ou mais salas montadas como </w:t>
-      </w:r>
-      <w:r>
-        <w:rPr>
-          <w:b/>
-          <w:bCs/>
-          <w:i w:val="false"/>
-          <w:iCs w:val="false"/>
-        </w:rPr>
-        <w:t xml:space="preserve">interiores de casas e lugares antigos dos séculos XIX e XX</w:t>
+        <w:t xml:space="preserve"> no bunker há </w:t>
+      </w:r>
+      <w:r>
+        <w:rPr>
+          <w:b/>
+          <w:bCs/>
+          <w:i w:val="false"/>
+          <w:iCs w:val="false"/>
+        </w:rPr>
+        <w:t xml:space="preserve">duas</w:t>
+      </w:r>
+      <w:r>
+        <w:rPr>
+          <w:b w:val="false"/>
+          <w:bCs w:val="false"/>
+          <w:i w:val="false"/>
+          <w:iCs w:val="false"/>
+        </w:rPr>
+        <w:t xml:space="preserve"> salas montadas como </w:t>
+      </w:r>
+      <w:r>
+        <w:rPr>
+          <w:b/>
+          <w:bCs/>
+          <w:i w:val="false"/>
+          <w:iCs w:val="false"/>
+        </w:rPr>
+        <w:t xml:space="preserve">interiores de casa</w:t>
+      </w:r>
+      <w:r>
+        <w:rPr>
+          <w:b w:val="false"/>
+          <w:bCs w:val="false"/>
+          <w:i w:val="false"/>
+          <w:iCs w:val="false"/>
+        </w:rPr>
+        <w:t xml:space="preserve">: a </w:t>
+      </w:r>
+      <w:r>
+        <w:rPr>
+          <w:b/>
+          <w:bCs/>
+          <w:i w:val="false"/>
+          <w:iCs w:val="false"/>
+        </w:rPr>
+        <w:t xml:space="preserve">sala de visitas de um casarão do fim do século XIX</w:t>
+      </w:r>
+      <w:r>
+        <w:rPr>
+          <w:b w:val="false"/>
+          <w:bCs w:val="false"/>
+          <w:i w:val="false"/>
+          <w:iCs w:val="false"/>
+        </w:rPr>
+        <w:t xml:space="preserve"> e a </w:t>
+      </w:r>
+      <w:r>
+        <w:rPr>
+          <w:b/>
+          <w:bCs/>
+          <w:i w:val="false"/>
+          <w:iCs w:val="false"/>
+        </w:rPr>
+        <w:t xml:space="preserve">sala de estar de uma casa dos anos 80</w:t>
       </w:r>
       <w:r>
         <w:rPr>
@@ -9846,34 +9768,16 @@
           <w:i w:val="false"/>
           <w:iCs w:val="false"/>
         </w:rPr>
-        <w:t xml:space="preserve">De onde Gabriel chega aqui:</w:t>
-      </w:r>
-      <w:r>
-        <w:rPr>
-          <w:b w:val="false"/>
-          <w:bCs w:val="false"/>
-          <w:i w:val="false"/>
-          <w:iCs w:val="false"/>
-        </w:rPr>
-        <w:t xml:space="preserve"> pela rampa técnica do subsolo aberta no fim do </w:t>
-      </w:r>
-      <w:r>
-        <w:rPr>
-          <w:b/>
-          <w:bCs/>
-          <w:i w:val="false"/>
-          <w:iCs w:val="false"/>
-        </w:rPr>
-        <w:t xml:space="preserve">Centro de Convivência</w:t>
-      </w:r>
-      <w:r>
-        <w:rPr>
-          <w:b w:val="false"/>
-          <w:bCs w:val="false"/>
-          <w:i w:val="false"/>
-          <w:iCs w:val="false"/>
-        </w:rPr>
-        <w:t xml:space="preserve">.</w:t>
+        <w:t xml:space="preserve">As marcas dos Faroleiros:</w:t>
+      </w:r>
+      <w:r>
+        <w:rPr>
+          <w:b w:val="false"/>
+          <w:bCs w:val="false"/>
+          <w:i w:val="false"/>
+          <w:iCs w:val="false"/>
+        </w:rPr>
+        <w:t xml:space="preserve"> nas paredes do bunker há marcas dos Faroleiros pintadas em âmbar (seção 2.4): o farol inteiro perto da sala segura e o farol apagado perto da comporta do núcleo. Os Faroleiros passaram por ali; o jogo não diz quando.</w:t>
       </w:r>
     </w:p>
     <w:p>
@@ -9892,6 +9796,52 @@
           <w:i w:val="false"/>
           <w:iCs w:val="false"/>
         </w:rPr>
+        <w:t xml:space="preserve">De onde Gabriel chega aqui:</w:t>
+      </w:r>
+      <w:r>
+        <w:rPr>
+          <w:b w:val="false"/>
+          <w:bCs w:val="false"/>
+          <w:i w:val="false"/>
+          <w:iCs w:val="false"/>
+        </w:rPr>
+        <w:t xml:space="preserve"> pela rampa técnica do subsolo aberta no fim do </w:t>
+      </w:r>
+      <w:r>
+        <w:rPr>
+          <w:b/>
+          <w:bCs/>
+          <w:i w:val="false"/>
+          <w:iCs w:val="false"/>
+        </w:rPr>
+        <w:t xml:space="preserve">Centro de Convivência</w:t>
+      </w:r>
+      <w:r>
+        <w:rPr>
+          <w:b w:val="false"/>
+          <w:bCs w:val="false"/>
+          <w:i w:val="false"/>
+          <w:iCs w:val="false"/>
+        </w:rPr>
+        <w:t xml:space="preserve">.</w:t>
+      </w:r>
+    </w:p>
+    <w:p>
+      <w:pPr>
+        <w:pStyle w:val="Corpo"/>
+        <w:numPr>
+          <w:ilvl w:val="0"/>
+          <w:numId w:val="2"/>
+        </w:numPr>
+        <w:spacing w:after="70"/>
+      </w:pPr>
+      <w:r>
+        <w:rPr>
+          <w:b/>
+          <w:bCs/>
+          <w:i w:val="false"/>
+          <w:iCs w:val="false"/>
+        </w:rPr>
         <w:t xml:space="preserve">O Gabriel já encontrou o Zane em pessoa no Labirinto</w:t>
       </w:r>
       <w:r>
@@ -9956,6 +9906,111 @@
           <w:iCs w:val="false"/>
         </w:rPr>
         <w:t xml:space="preserve">, com o acesso às câmeras do campus, e é quem Gabriel encontra em pessoa aqui. Gabriel o reconhece pela lenda: é o aluno que sumiu em 2019 (seção 7.2). O Carlos nunca vai ao bunker.</w:t>
+      </w:r>
+    </w:p>
+    <w:p>
+      <w:pPr>
+        <w:pStyle w:val="Corpo"/>
+        <w:numPr>
+          <w:ilvl w:val="0"/>
+          <w:numId w:val="2"/>
+        </w:numPr>
+        <w:spacing w:after="70"/>
+      </w:pPr>
+      <w:r>
+        <w:rPr>
+          <w:b/>
+          <w:bCs/>
+          <w:i w:val="false"/>
+          <w:iCs w:val="false"/>
+        </w:rPr>
+        <w:t xml:space="preserve">O encontro (fim da fase):</w:t>
+      </w:r>
+      <w:r>
+        <w:rPr>
+          <w:b w:val="false"/>
+          <w:bCs w:val="false"/>
+          <w:i w:val="false"/>
+          <w:iCs w:val="false"/>
+        </w:rPr>
+        <w:t xml:space="preserve"> Gabriel religa a energia do bunker e, com ela, o </w:t>
+      </w:r>
+      <w:r>
+        <w:rPr>
+          <w:b/>
+          <w:bCs/>
+          <w:i w:val="false"/>
+          <w:iCs w:val="false"/>
+        </w:rPr>
+        <w:t xml:space="preserve">Zane quebra a senha do setor B</w:t>
+      </w:r>
+      <w:r>
+        <w:rPr>
+          <w:b w:val="false"/>
+          <w:bCs w:val="false"/>
+          <w:i w:val="false"/>
+          <w:iCs w:val="false"/>
+        </w:rPr>
+        <w:t xml:space="preserve">. Na sala de dados, o grupo se encontra </w:t>
+      </w:r>
+      <w:r>
+        <w:rPr>
+          <w:b/>
+          <w:bCs/>
+          <w:i w:val="false"/>
+          <w:iCs w:val="false"/>
+        </w:rPr>
+        <w:t xml:space="preserve">pela primeira vez numa sala só</w:t>
+      </w:r>
+      <w:r>
+        <w:rPr>
+          <w:b w:val="false"/>
+          <w:bCs w:val="false"/>
+          <w:i w:val="false"/>
+          <w:iCs w:val="false"/>
+        </w:rPr>
+        <w:t xml:space="preserve">: Gabriel, o Henrique, o Zane, a Clarice e a Diana. Dali descem pela comporta do núcleo. </w:t>
+      </w:r>
+      <w:r>
+        <w:rPr>
+          <w:b/>
+          <w:bCs/>
+          <w:i w:val="false"/>
+          <w:iCs w:val="false"/>
+        </w:rPr>
+        <w:t xml:space="preserve">A cena é provisória:</w:t>
+      </w:r>
+      <w:r>
+        <w:rPr>
+          <w:b w:val="false"/>
+          <w:bCs w:val="false"/>
+          <w:i w:val="false"/>
+          <w:iCs w:val="false"/>
+        </w:rPr>
+        <w:t xml:space="preserve"> o conteúdo da conversa (rascunho em </w:t>
+      </w:r>
+      <w:r>
+        <w:rPr>
+          <w:rFonts w:ascii="Courier New" w:cs="Courier New" w:eastAsia="Courier New" w:hAnsi="Courier New"/>
+          <w:b w:val="false"/>
+          <w:bCs w:val="false"/>
+          <w:i w:val="false"/>
+          <w:iCs w:val="false"/>
+          <w:color w:val="2A7F8E"/>
+          <w:sz w:val="19"/>
+          <w:szCs w:val="19"/>
+          <w:shd w:fill="EEF2F5" w:color="auto" w:val="clear"/>
+        </w:rPr>
+        <w:t xml:space="preserve">dados/dialogos/bunker_encontro.json</w:t>
+      </w:r>
+      <w:r>
+        <w:rPr>
+          <w:b w:val="false"/>
+          <w:bCs w:val="false"/>
+          <w:i w:val="false"/>
+          <w:iCs w:val="false"/>
+        </w:rPr>
+        <w:t xml:space="preserve">) e como a Clarice e a Diana chegam ao bunker ficam em aberto para o grupo mudar.</w:t>
       </w:r>
     </w:p>
     <w:p>
@@ -12436,7 +12491,7 @@
           <w:i w:val="false"/>
           <w:iCs w:val="false"/>
         </w:rPr>
-        <w:t xml:space="preserve"> o que fazia no ponto quando foi puxado? O que ele teme, agora que a IA não tem consciência? Qual é o final dele (ficar em 3026 para guardar a Âncora, ficar para se juntar aos Faroleiros, ou voltar para 2123)? O que ele faz quando chega ao bunker, depois do Labirinto?</w:t>
+        <w:t xml:space="preserve"> o que fazia no ponto quando foi puxado? O que ele teme, agora que a IA não tem consciência? Qual é o final dele (ficar em 3026 para guardar a Âncora, ficar para se juntar aos Faroleiros, ou voltar para 2123)? As falas dele no bunker (a chamada pelo rádio e o encontro) são rascunho.</w:t>
       </w:r>
     </w:p>
     <w:p>
@@ -12492,7 +12547,7 @@
           <w:i w:val="false"/>
           <w:iCs w:val="false"/>
         </w:rPr>
-        <w:t xml:space="preserve"> continuam na 103 até o fim, ou se juntam ao grupo mais tarde?</w:t>
+        <w:t xml:space="preserve"> já decidido que se juntam ao grupo no encontro do fim do Bunker (Ato 3). Como chegam até lá, e o que fazem depois?</w:t>
       </w:r>
     </w:p>
     <w:p>
@@ -12539,34 +12594,6 @@
           <w:iCs w:val="false"/>
         </w:rPr>
         <w:t xml:space="preserve">? (Se sim, vira um shader, bom para a apresentação de Computação Gráfica.)</w:t>
-      </w:r>
-    </w:p>
-    <w:p>
-      <w:pPr>
-        <w:pStyle w:val="Corpo"/>
-        <w:numPr>
-          <w:ilvl w:val="0"/>
-          <w:numId w:val="5"/>
-        </w:numPr>
-        <w:spacing w:after="70"/>
-      </w:pPr>
-      <w:r>
-        <w:rPr>
-          <w:b/>
-          <w:bCs/>
-          <w:i w:val="false"/>
-          <w:iCs w:val="false"/>
-        </w:rPr>
-        <w:t xml:space="preserve">As pichações "C." no bunker</w:t>
-      </w:r>
-      <w:r>
-        <w:rPr>
-          <w:b w:val="false"/>
-          <w:bCs w:val="false"/>
-          <w:i w:val="false"/>
-          <w:iCs w:val="false"/>
-        </w:rPr>
-        <w:t xml:space="preserve"> ("NÃO CONFIE NAS LUZES"): quem fez? Não podem ser da Clarice, que está na 103 desde que chegou. Uma opção é virarem marcas antigas dos Faroleiros; a outra é saírem.</w:t>
       </w:r>
     </w:p>
     <w:p>

</xml_diff>

<commit_message>
docs: atualiza a História Completa em Word com as mudanças do Bunker (#148)
Co-authored-by: Claude Opus 5.5 <noreply@anthropic.com>
</commit_message>
<xml_diff>
--- a/docs/historia/História_Completa.docx
+++ b/docs/historia/História_Completa.docx
@@ -420,11 +420,7 @@
           <w:hyperlink w:history="1" w:anchor="_Toc1">
             <w:r>
               <w:t xml:space="preserve">Sobre este documento</w:t>
-            </w:r>
-            <w:r>
               <w:tab/>
-            </w:r>
-            <w:r>
               <w:fldChar w:fldCharType="begin" w:dirty="true"/>
               <w:instrText xml:space="preserve">PAGEREF _Toc1 \h</w:instrText>
               <w:fldChar w:fldCharType="separate"/>
@@ -442,11 +438,7 @@
           <w:hyperlink w:history="1" w:anchor="_Toc2">
             <w:r>
               <w:t xml:space="preserve">1. A história em um parágrafo</w:t>
-            </w:r>
-            <w:r>
               <w:tab/>
-            </w:r>
-            <w:r>
               <w:fldChar w:fldCharType="begin" w:dirty="true"/>
               <w:instrText xml:space="preserve">PAGEREF _Toc2 \h</w:instrText>
               <w:fldChar w:fldCharType="separate"/>
@@ -464,11 +456,7 @@
           <w:hyperlink w:history="1" w:anchor="_Toc3">
             <w:r>
               <w:t xml:space="preserve">2. O mundo</w:t>
-            </w:r>
-            <w:r>
               <w:tab/>
-            </w:r>
-            <w:r>
               <w:fldChar w:fldCharType="begin" w:dirty="true"/>
               <w:instrText xml:space="preserve">PAGEREF _Toc3 \h</w:instrText>
               <w:fldChar w:fldCharType="separate"/>
@@ -487,11 +475,7 @@
           <w:hyperlink w:history="1" w:anchor="_Toc4">
             <w:r>
               <w:t xml:space="preserve">2.1 A Terra em 3026</w:t>
-            </w:r>
-            <w:r>
               <w:tab/>
-            </w:r>
-            <w:r>
               <w:fldChar w:fldCharType="begin" w:dirty="true"/>
               <w:instrText xml:space="preserve">PAGEREF _Toc4 \h</w:instrText>
               <w:fldChar w:fldCharType="separate"/>
@@ -510,11 +494,7 @@
           <w:hyperlink w:history="1" w:anchor="_Toc5">
             <w:r>
               <w:t xml:space="preserve">2.2 O campus em 3026</w:t>
-            </w:r>
-            <w:r>
               <w:tab/>
-            </w:r>
-            <w:r>
               <w:fldChar w:fldCharType="begin" w:dirty="true"/>
               <w:instrText xml:space="preserve">PAGEREF _Toc5 \h</w:instrText>
               <w:fldChar w:fldCharType="separate"/>
@@ -533,11 +513,7 @@
           <w:hyperlink w:history="1" w:anchor="_Toc6">
             <w:r>
               <w:t xml:space="preserve">2.3 Os robôs</w:t>
-            </w:r>
-            <w:r>
               <w:tab/>
-            </w:r>
-            <w:r>
               <w:fldChar w:fldCharType="begin" w:dirty="true"/>
               <w:instrText xml:space="preserve">PAGEREF _Toc6 \h</w:instrText>
               <w:fldChar w:fldCharType="separate"/>
@@ -556,11 +532,7 @@
           <w:hyperlink w:history="1" w:anchor="_Toc7">
             <w:r>
               <w:t xml:space="preserve">2.4 Os Faroleiros e o símbolo deles</w:t>
-            </w:r>
-            <w:r>
               <w:tab/>
-            </w:r>
-            <w:r>
               <w:fldChar w:fldCharType="begin" w:dirty="true"/>
               <w:instrText xml:space="preserve">PAGEREF _Toc7 \h</w:instrText>
               <w:fldChar w:fldCharType="separate"/>
@@ -578,11 +550,7 @@
           <w:hyperlink w:history="1" w:anchor="_Toc8">
             <w:r>
               <w:t xml:space="preserve">3. A Âncora e a fenda</w:t>
-            </w:r>
-            <w:r>
               <w:tab/>
-            </w:r>
-            <w:r>
               <w:fldChar w:fldCharType="begin" w:dirty="true"/>
               <w:instrText xml:space="preserve">PAGEREF _Toc8 \h</w:instrText>
               <w:fldChar w:fldCharType="separate"/>
@@ -601,11 +569,7 @@
           <w:hyperlink w:history="1" w:anchor="_Toc9">
             <w:r>
               <w:t xml:space="preserve">3.1 Como voltar: cada um traz uma parte</w:t>
-            </w:r>
-            <w:r>
               <w:tab/>
-            </w:r>
-            <w:r>
               <w:fldChar w:fldCharType="begin" w:dirty="true"/>
               <w:instrText xml:space="preserve">PAGEREF _Toc9 \h</w:instrText>
               <w:fldChar w:fldCharType="separate"/>
@@ -623,11 +587,7 @@
           <w:hyperlink w:history="1" w:anchor="_Toc10">
             <w:r>
               <w:t xml:space="preserve">4. Os personagens</w:t>
-            </w:r>
-            <w:r>
               <w:tab/>
-            </w:r>
-            <w:r>
               <w:fldChar w:fldCharType="begin" w:dirty="true"/>
               <w:instrText xml:space="preserve">PAGEREF _Toc10 \h</w:instrText>
               <w:fldChar w:fldCharType="separate"/>
@@ -646,11 +606,7 @@
           <w:hyperlink w:history="1" w:anchor="_Toc11">
             <w:r>
               <w:t xml:space="preserve">4.1 Regras para todos</w:t>
-            </w:r>
-            <w:r>
               <w:tab/>
-            </w:r>
-            <w:r>
               <w:fldChar w:fldCharType="begin" w:dirty="true"/>
               <w:instrText xml:space="preserve">PAGEREF _Toc11 \h</w:instrText>
               <w:fldChar w:fldCharType="separate"/>
@@ -669,11 +625,7 @@
           <w:hyperlink w:history="1" w:anchor="_Toc12">
             <w:r>
               <w:t xml:space="preserve">4.2 Fichas</w:t>
-            </w:r>
-            <w:r>
               <w:tab/>
-            </w:r>
-            <w:r>
               <w:fldChar w:fldCharType="begin" w:dirty="true"/>
               <w:instrText xml:space="preserve">PAGEREF _Toc12 \h</w:instrText>
               <w:fldChar w:fldCharType="separate"/>
@@ -692,11 +644,7 @@
           <w:hyperlink w:history="1" w:anchor="_Toc13">
             <w:r>
               <w:t xml:space="preserve">4.3 O Carlos, o antagonista</w:t>
-            </w:r>
-            <w:r>
               <w:tab/>
-            </w:r>
-            <w:r>
               <w:fldChar w:fldCharType="begin" w:dirty="true"/>
               <w:instrText xml:space="preserve">PAGEREF _Toc13 \h</w:instrText>
               <w:fldChar w:fldCharType="separate"/>
@@ -714,11 +662,7 @@
           <w:hyperlink w:history="1" w:anchor="_Toc14">
             <w:r>
               <w:t xml:space="preserve">5. A família Magalhães</w:t>
-            </w:r>
-            <w:r>
               <w:tab/>
-            </w:r>
-            <w:r>
               <w:fldChar w:fldCharType="begin" w:dirty="true"/>
               <w:instrText xml:space="preserve">PAGEREF _Toc14 \h</w:instrText>
               <w:fldChar w:fldCharType="separate"/>
@@ -736,11 +680,7 @@
           <w:hyperlink w:history="1" w:anchor="_Toc15">
             <w:r>
               <w:t xml:space="preserve">6. Os esconderijos</w:t>
-            </w:r>
-            <w:r>
               <w:tab/>
-            </w:r>
-            <w:r>
               <w:fldChar w:fldCharType="begin" w:dirty="true"/>
               <w:instrText xml:space="preserve">PAGEREF _Toc15 \h</w:instrText>
               <w:fldChar w:fldCharType="separate"/>
@@ -759,11 +699,7 @@
           <w:hyperlink w:history="1" w:anchor="_Toc16">
             <w:r>
               <w:t xml:space="preserve">6.1 Como eles se comunicam</w:t>
-            </w:r>
-            <w:r>
               <w:tab/>
-            </w:r>
-            <w:r>
               <w:fldChar w:fldCharType="begin" w:dirty="true"/>
               <w:instrText xml:space="preserve">PAGEREF _Toc16 \h</w:instrText>
               <w:fldChar w:fldCharType="separate"/>
@@ -781,11 +717,7 @@
           <w:hyperlink w:history="1" w:anchor="_Toc17">
             <w:r>
               <w:t xml:space="preserve">7. Linha do tempo</w:t>
-            </w:r>
-            <w:r>
               <w:tab/>
-            </w:r>
-            <w:r>
               <w:fldChar w:fldCharType="begin" w:dirty="true"/>
               <w:instrText xml:space="preserve">PAGEREF _Toc17 \h</w:instrText>
               <w:fldChar w:fldCharType="separate"/>
@@ -804,11 +736,7 @@
           <w:hyperlink w:history="1" w:anchor="_Toc18">
             <w:r>
               <w:t xml:space="preserve">7.1 Quem esteve no ponto</w:t>
-            </w:r>
-            <w:r>
               <w:tab/>
-            </w:r>
-            <w:r>
               <w:fldChar w:fldCharType="begin" w:dirty="true"/>
               <w:instrText xml:space="preserve">PAGEREF _Toc18 \h</w:instrText>
               <w:fldChar w:fldCharType="separate"/>
@@ -827,11 +755,7 @@
           <w:hyperlink w:history="1" w:anchor="_Toc19">
             <w:r>
               <w:t xml:space="preserve">7.2 Ordem dos acontecimentos</w:t>
-            </w:r>
-            <w:r>
               <w:tab/>
-            </w:r>
-            <w:r>
               <w:fldChar w:fldCharType="begin" w:dirty="true"/>
               <w:instrText xml:space="preserve">PAGEREF _Toc19 \h</w:instrText>
               <w:fldChar w:fldCharType="separate"/>
@@ -849,11 +773,7 @@
           <w:hyperlink w:history="1" w:anchor="_Toc20">
             <w:r>
               <w:t xml:space="preserve">8. Estrutura da história</w:t>
-            </w:r>
-            <w:r>
               <w:tab/>
-            </w:r>
-            <w:r>
               <w:fldChar w:fldCharType="begin" w:dirty="true"/>
               <w:instrText xml:space="preserve">PAGEREF _Toc20 \h</w:instrText>
               <w:fldChar w:fldCharType="separate"/>
@@ -872,11 +792,7 @@
           <w:hyperlink w:history="1" w:anchor="_Toc21">
             <w:r>
               <w:t xml:space="preserve">Ato 1 — Acordar (Biblioteca)</w:t>
-            </w:r>
-            <w:r>
               <w:tab/>
-            </w:r>
-            <w:r>
               <w:fldChar w:fldCharType="begin" w:dirty="true"/>
               <w:instrText xml:space="preserve">PAGEREF _Toc21 \h</w:instrText>
               <w:fldChar w:fldCharType="separate"/>
@@ -895,11 +811,7 @@
           <w:hyperlink w:history="1" w:anchor="_Toc22">
             <w:r>
               <w:t xml:space="preserve">Ato 2 — Encontrar os outros (Bloco de salas, Labirinto e Centro de Convivência)</w:t>
-            </w:r>
-            <w:r>
               <w:tab/>
-            </w:r>
-            <w:r>
               <w:fldChar w:fldCharType="begin" w:dirty="true"/>
               <w:instrText xml:space="preserve">PAGEREF _Toc22 \h</w:instrText>
               <w:fldChar w:fldCharType="separate"/>
@@ -918,11 +830,7 @@
           <w:hyperlink w:history="1" w:anchor="_Toc23">
             <w:r>
               <w:t xml:space="preserve">Ato 3 — O esconderijo (Bunker)</w:t>
-            </w:r>
-            <w:r>
               <w:tab/>
-            </w:r>
-            <w:r>
               <w:fldChar w:fldCharType="begin" w:dirty="true"/>
               <w:instrText xml:space="preserve">PAGEREF _Toc23 \h</w:instrText>
               <w:fldChar w:fldCharType="separate"/>
@@ -941,11 +849,7 @@
           <w:hyperlink w:history="1" w:anchor="_Toc24">
             <w:r>
               <w:t xml:space="preserve">A virada — A mentira do Henrique</w:t>
-            </w:r>
-            <w:r>
               <w:tab/>
-            </w:r>
-            <w:r>
               <w:fldChar w:fldCharType="begin" w:dirty="true"/>
               <w:instrText xml:space="preserve">PAGEREF _Toc24 \h</w:instrText>
               <w:fldChar w:fldCharType="separate"/>
@@ -964,11 +868,7 @@
           <w:hyperlink w:history="1" w:anchor="_Toc25">
             <w:r>
               <w:t xml:space="preserve">Ato 4 — Consertar a Âncora e voltar (Núcleo)</w:t>
-            </w:r>
-            <w:r>
               <w:tab/>
-            </w:r>
-            <w:r>
               <w:fldChar w:fldCharType="begin" w:dirty="true"/>
               <w:instrText xml:space="preserve">PAGEREF _Toc25 \h</w:instrText>
               <w:fldChar w:fldCharType="separate"/>
@@ -986,11 +886,7 @@
           <w:hyperlink w:history="1" w:anchor="_Toc26">
             <w:r>
               <w:t xml:space="preserve">9. Vocabulário oficial</w:t>
-            </w:r>
-            <w:r>
               <w:tab/>
-            </w:r>
-            <w:r>
               <w:fldChar w:fldCharType="begin" w:dirty="true"/>
               <w:instrText xml:space="preserve">PAGEREF _Toc26 \h</w:instrText>
               <w:fldChar w:fldCharType="separate"/>
@@ -1008,11 +904,7 @@
           <w:hyperlink w:history="1" w:anchor="_Toc27">
             <w:r>
               <w:t xml:space="preserve">10. Pendências: o que falta decidir na história</w:t>
-            </w:r>
-            <w:r>
               <w:tab/>
-            </w:r>
-            <w:r>
               <w:fldChar w:fldCharType="begin" w:dirty="true"/>
               <w:instrText xml:space="preserve">PAGEREF _Toc27 \h</w:instrText>
               <w:fldChar w:fldCharType="separate"/>
@@ -1031,11 +923,7 @@
           <w:hyperlink w:history="1" w:anchor="_Toc28">
             <w:r>
               <w:t xml:space="preserve">10.1 O mundo de 3026</w:t>
-            </w:r>
-            <w:r>
               <w:tab/>
-            </w:r>
-            <w:r>
               <w:fldChar w:fldCharType="begin" w:dirty="true"/>
               <w:instrText xml:space="preserve">PAGEREF _Toc28 \h</w:instrText>
               <w:fldChar w:fldCharType="separate"/>
@@ -1054,11 +942,7 @@
           <w:hyperlink w:history="1" w:anchor="_Toc29">
             <w:r>
               <w:t xml:space="preserve">10.2 O Carlos</w:t>
-            </w:r>
-            <w:r>
               <w:tab/>
-            </w:r>
-            <w:r>
               <w:fldChar w:fldCharType="begin" w:dirty="true"/>
               <w:instrText xml:space="preserve">PAGEREF _Toc29 \h</w:instrText>
               <w:fldChar w:fldCharType="separate"/>
@@ -1077,11 +961,7 @@
           <w:hyperlink w:history="1" w:anchor="_Toc30">
             <w:r>
               <w:t xml:space="preserve">10.3 O Henrique e a mentira</w:t>
-            </w:r>
-            <w:r>
               <w:tab/>
-            </w:r>
-            <w:r>
               <w:fldChar w:fldCharType="begin" w:dirty="true"/>
               <w:instrText xml:space="preserve">PAGEREF _Toc30 \h</w:instrText>
               <w:fldChar w:fldCharType="separate"/>
@@ -1100,11 +980,7 @@
           <w:hyperlink w:history="1" w:anchor="_Toc31">
             <w:r>
               <w:t xml:space="preserve">10.4 Os outros personagens</w:t>
-            </w:r>
-            <w:r>
               <w:tab/>
-            </w:r>
-            <w:r>
               <w:fldChar w:fldCharType="begin" w:dirty="true"/>
               <w:instrText xml:space="preserve">PAGEREF _Toc31 \h</w:instrText>
               <w:fldChar w:fldCharType="separate"/>
@@ -1123,11 +999,7 @@
           <w:hyperlink w:history="1" w:anchor="_Toc32">
             <w:r>
               <w:t xml:space="preserve">10.5 A estrutura da história</w:t>
-            </w:r>
-            <w:r>
               <w:tab/>
-            </w:r>
-            <w:r>
               <w:fldChar w:fldCharType="begin" w:dirty="true"/>
               <w:instrText xml:space="preserve">PAGEREF _Toc32 \h</w:instrText>
               <w:fldChar w:fldCharType="separate"/>
@@ -1146,11 +1018,7 @@
           <w:hyperlink w:history="1" w:anchor="_Toc33">
             <w:r>
               <w:t xml:space="preserve">10.6 A volta e o fim</w:t>
-            </w:r>
-            <w:r>
               <w:tab/>
-            </w:r>
-            <w:r>
               <w:fldChar w:fldCharType="begin" w:dirty="true"/>
               <w:instrText xml:space="preserve">PAGEREF _Toc33 \h</w:instrText>
               <w:fldChar w:fldCharType="separate"/>
@@ -6734,7 +6602,7 @@
                 <w:sz w:val="19"/>
                 <w:szCs w:val="19"/>
               </w:rPr>
-              <w:t xml:space="preserve">, com as câmeras do campus e o rádio. Diz que está escondido ali tentando consertar tudo. O Carlos nunca vai lá. O Zane chega depois do Labirinto, com Gabriel</w:t>
+              <w:t xml:space="preserve">, com as câmeras do campus e o rádio. Diz que está escondido ali tentando consertar tudo. O Carlos nunca vai lá. O Zane chega depois do Labirinto, com Gabriel. No fim do Bunker, o grupo todo se encontra ali pela primeira vez (Ato 3)</w:t>
             </w:r>
           </w:p>
         </w:tc>
@@ -9791,16 +9659,70 @@
           <w:i w:val="false"/>
           <w:iCs w:val="false"/>
         </w:rPr>
-        <w:t xml:space="preserve"> no bunker há uma ou mais salas montadas como </w:t>
-      </w:r>
-      <w:r>
-        <w:rPr>
-          <w:b/>
-          <w:bCs/>
-          <w:i w:val="false"/>
-          <w:iCs w:val="false"/>
-        </w:rPr>
-        <w:t xml:space="preserve">interiores de casas e lugares antigos dos séculos XIX e XX</w:t>
+        <w:t xml:space="preserve"> no bunker há </w:t>
+      </w:r>
+      <w:r>
+        <w:rPr>
+          <w:b/>
+          <w:bCs/>
+          <w:i w:val="false"/>
+          <w:iCs w:val="false"/>
+        </w:rPr>
+        <w:t xml:space="preserve">duas</w:t>
+      </w:r>
+      <w:r>
+        <w:rPr>
+          <w:b w:val="false"/>
+          <w:bCs w:val="false"/>
+          <w:i w:val="false"/>
+          <w:iCs w:val="false"/>
+        </w:rPr>
+        <w:t xml:space="preserve"> salas montadas como </w:t>
+      </w:r>
+      <w:r>
+        <w:rPr>
+          <w:b/>
+          <w:bCs/>
+          <w:i w:val="false"/>
+          <w:iCs w:val="false"/>
+        </w:rPr>
+        <w:t xml:space="preserve">interiores de casa</w:t>
+      </w:r>
+      <w:r>
+        <w:rPr>
+          <w:b w:val="false"/>
+          <w:bCs w:val="false"/>
+          <w:i w:val="false"/>
+          <w:iCs w:val="false"/>
+        </w:rPr>
+        <w:t xml:space="preserve">: a </w:t>
+      </w:r>
+      <w:r>
+        <w:rPr>
+          <w:b/>
+          <w:bCs/>
+          <w:i w:val="false"/>
+          <w:iCs w:val="false"/>
+        </w:rPr>
+        <w:t xml:space="preserve">sala de visitas de um casarão do fim do século XIX</w:t>
+      </w:r>
+      <w:r>
+        <w:rPr>
+          <w:b w:val="false"/>
+          <w:bCs w:val="false"/>
+          <w:i w:val="false"/>
+          <w:iCs w:val="false"/>
+        </w:rPr>
+        <w:t xml:space="preserve"> e a </w:t>
+      </w:r>
+      <w:r>
+        <w:rPr>
+          <w:b/>
+          <w:bCs/>
+          <w:i w:val="false"/>
+          <w:iCs w:val="false"/>
+        </w:rPr>
+        <w:t xml:space="preserve">sala de estar de uma casa dos anos 80</w:t>
       </w:r>
       <w:r>
         <w:rPr>
@@ -9846,34 +9768,16 @@
           <w:i w:val="false"/>
           <w:iCs w:val="false"/>
         </w:rPr>
-        <w:t xml:space="preserve">De onde Gabriel chega aqui:</w:t>
-      </w:r>
-      <w:r>
-        <w:rPr>
-          <w:b w:val="false"/>
-          <w:bCs w:val="false"/>
-          <w:i w:val="false"/>
-          <w:iCs w:val="false"/>
-        </w:rPr>
-        <w:t xml:space="preserve"> pela rampa técnica do subsolo aberta no fim do </w:t>
-      </w:r>
-      <w:r>
-        <w:rPr>
-          <w:b/>
-          <w:bCs/>
-          <w:i w:val="false"/>
-          <w:iCs w:val="false"/>
-        </w:rPr>
-        <w:t xml:space="preserve">Centro de Convivência</w:t>
-      </w:r>
-      <w:r>
-        <w:rPr>
-          <w:b w:val="false"/>
-          <w:bCs w:val="false"/>
-          <w:i w:val="false"/>
-          <w:iCs w:val="false"/>
-        </w:rPr>
-        <w:t xml:space="preserve">.</w:t>
+        <w:t xml:space="preserve">As marcas dos Faroleiros:</w:t>
+      </w:r>
+      <w:r>
+        <w:rPr>
+          <w:b w:val="false"/>
+          <w:bCs w:val="false"/>
+          <w:i w:val="false"/>
+          <w:iCs w:val="false"/>
+        </w:rPr>
+        <w:t xml:space="preserve"> nas paredes do bunker há marcas dos Faroleiros pintadas em âmbar (seção 2.4): o farol inteiro perto da sala segura e o farol apagado perto da comporta do núcleo. Os Faroleiros passaram por ali; o jogo não diz quando.</w:t>
       </w:r>
     </w:p>
     <w:p>
@@ -9892,6 +9796,52 @@
           <w:i w:val="false"/>
           <w:iCs w:val="false"/>
         </w:rPr>
+        <w:t xml:space="preserve">De onde Gabriel chega aqui:</w:t>
+      </w:r>
+      <w:r>
+        <w:rPr>
+          <w:b w:val="false"/>
+          <w:bCs w:val="false"/>
+          <w:i w:val="false"/>
+          <w:iCs w:val="false"/>
+        </w:rPr>
+        <w:t xml:space="preserve"> pela rampa técnica do subsolo aberta no fim do </w:t>
+      </w:r>
+      <w:r>
+        <w:rPr>
+          <w:b/>
+          <w:bCs/>
+          <w:i w:val="false"/>
+          <w:iCs w:val="false"/>
+        </w:rPr>
+        <w:t xml:space="preserve">Centro de Convivência</w:t>
+      </w:r>
+      <w:r>
+        <w:rPr>
+          <w:b w:val="false"/>
+          <w:bCs w:val="false"/>
+          <w:i w:val="false"/>
+          <w:iCs w:val="false"/>
+        </w:rPr>
+        <w:t xml:space="preserve">.</w:t>
+      </w:r>
+    </w:p>
+    <w:p>
+      <w:pPr>
+        <w:pStyle w:val="Corpo"/>
+        <w:numPr>
+          <w:ilvl w:val="0"/>
+          <w:numId w:val="2"/>
+        </w:numPr>
+        <w:spacing w:after="70"/>
+      </w:pPr>
+      <w:r>
+        <w:rPr>
+          <w:b/>
+          <w:bCs/>
+          <w:i w:val="false"/>
+          <w:iCs w:val="false"/>
+        </w:rPr>
         <w:t xml:space="preserve">O Gabriel já encontrou o Zane em pessoa no Labirinto</w:t>
       </w:r>
       <w:r>
@@ -9956,6 +9906,111 @@
           <w:iCs w:val="false"/>
         </w:rPr>
         <w:t xml:space="preserve">, com o acesso às câmeras do campus, e é quem Gabriel encontra em pessoa aqui. Gabriel o reconhece pela lenda: é o aluno que sumiu em 2019 (seção 7.2). O Carlos nunca vai ao bunker.</w:t>
+      </w:r>
+    </w:p>
+    <w:p>
+      <w:pPr>
+        <w:pStyle w:val="Corpo"/>
+        <w:numPr>
+          <w:ilvl w:val="0"/>
+          <w:numId w:val="2"/>
+        </w:numPr>
+        <w:spacing w:after="70"/>
+      </w:pPr>
+      <w:r>
+        <w:rPr>
+          <w:b/>
+          <w:bCs/>
+          <w:i w:val="false"/>
+          <w:iCs w:val="false"/>
+        </w:rPr>
+        <w:t xml:space="preserve">O encontro (fim da fase):</w:t>
+      </w:r>
+      <w:r>
+        <w:rPr>
+          <w:b w:val="false"/>
+          <w:bCs w:val="false"/>
+          <w:i w:val="false"/>
+          <w:iCs w:val="false"/>
+        </w:rPr>
+        <w:t xml:space="preserve"> Gabriel religa a energia do bunker e, com ela, o </w:t>
+      </w:r>
+      <w:r>
+        <w:rPr>
+          <w:b/>
+          <w:bCs/>
+          <w:i w:val="false"/>
+          <w:iCs w:val="false"/>
+        </w:rPr>
+        <w:t xml:space="preserve">Zane quebra a senha do setor B</w:t>
+      </w:r>
+      <w:r>
+        <w:rPr>
+          <w:b w:val="false"/>
+          <w:bCs w:val="false"/>
+          <w:i w:val="false"/>
+          <w:iCs w:val="false"/>
+        </w:rPr>
+        <w:t xml:space="preserve">. Na sala de dados, o grupo se encontra </w:t>
+      </w:r>
+      <w:r>
+        <w:rPr>
+          <w:b/>
+          <w:bCs/>
+          <w:i w:val="false"/>
+          <w:iCs w:val="false"/>
+        </w:rPr>
+        <w:t xml:space="preserve">pela primeira vez numa sala só</w:t>
+      </w:r>
+      <w:r>
+        <w:rPr>
+          <w:b w:val="false"/>
+          <w:bCs w:val="false"/>
+          <w:i w:val="false"/>
+          <w:iCs w:val="false"/>
+        </w:rPr>
+        <w:t xml:space="preserve">: Gabriel, o Henrique, o Zane, a Clarice e a Diana. Dali descem pela comporta do núcleo. </w:t>
+      </w:r>
+      <w:r>
+        <w:rPr>
+          <w:b/>
+          <w:bCs/>
+          <w:i w:val="false"/>
+          <w:iCs w:val="false"/>
+        </w:rPr>
+        <w:t xml:space="preserve">A cena é provisória:</w:t>
+      </w:r>
+      <w:r>
+        <w:rPr>
+          <w:b w:val="false"/>
+          <w:bCs w:val="false"/>
+          <w:i w:val="false"/>
+          <w:iCs w:val="false"/>
+        </w:rPr>
+        <w:t xml:space="preserve"> o conteúdo da conversa (rascunho em </w:t>
+      </w:r>
+      <w:r>
+        <w:rPr>
+          <w:rFonts w:ascii="Courier New" w:cs="Courier New" w:eastAsia="Courier New" w:hAnsi="Courier New"/>
+          <w:b w:val="false"/>
+          <w:bCs w:val="false"/>
+          <w:i w:val="false"/>
+          <w:iCs w:val="false"/>
+          <w:color w:val="2A7F8E"/>
+          <w:sz w:val="19"/>
+          <w:szCs w:val="19"/>
+          <w:shd w:fill="EEF2F5" w:color="auto" w:val="clear"/>
+        </w:rPr>
+        <w:t xml:space="preserve">dados/dialogos/bunker_encontro.json</w:t>
+      </w:r>
+      <w:r>
+        <w:rPr>
+          <w:b w:val="false"/>
+          <w:bCs w:val="false"/>
+          <w:i w:val="false"/>
+          <w:iCs w:val="false"/>
+        </w:rPr>
+        <w:t xml:space="preserve">) e como a Clarice e a Diana chegam ao bunker ficam em aberto para o grupo mudar.</w:t>
       </w:r>
     </w:p>
     <w:p>
@@ -12436,7 +12491,7 @@
           <w:i w:val="false"/>
           <w:iCs w:val="false"/>
         </w:rPr>
-        <w:t xml:space="preserve"> o que fazia no ponto quando foi puxado? O que ele teme, agora que a IA não tem consciência? Qual é o final dele (ficar em 3026 para guardar a Âncora, ficar para se juntar aos Faroleiros, ou voltar para 2123)? O que ele faz quando chega ao bunker, depois do Labirinto?</w:t>
+        <w:t xml:space="preserve"> o que fazia no ponto quando foi puxado? O que ele teme, agora que a IA não tem consciência? Qual é o final dele (ficar em 3026 para guardar a Âncora, ficar para se juntar aos Faroleiros, ou voltar para 2123)? As falas dele no bunker (a chamada pelo rádio e o encontro) são rascunho.</w:t>
       </w:r>
     </w:p>
     <w:p>
@@ -12492,7 +12547,7 @@
           <w:i w:val="false"/>
           <w:iCs w:val="false"/>
         </w:rPr>
-        <w:t xml:space="preserve"> continuam na 103 até o fim, ou se juntam ao grupo mais tarde?</w:t>
+        <w:t xml:space="preserve"> já decidido que se juntam ao grupo no encontro do fim do Bunker (Ato 3). Como chegam até lá, e o que fazem depois?</w:t>
       </w:r>
     </w:p>
     <w:p>
@@ -12539,34 +12594,6 @@
           <w:iCs w:val="false"/>
         </w:rPr>
         <w:t xml:space="preserve">? (Se sim, vira um shader, bom para a apresentação de Computação Gráfica.)</w:t>
-      </w:r>
-    </w:p>
-    <w:p>
-      <w:pPr>
-        <w:pStyle w:val="Corpo"/>
-        <w:numPr>
-          <w:ilvl w:val="0"/>
-          <w:numId w:val="5"/>
-        </w:numPr>
-        <w:spacing w:after="70"/>
-      </w:pPr>
-      <w:r>
-        <w:rPr>
-          <w:b/>
-          <w:bCs/>
-          <w:i w:val="false"/>
-          <w:iCs w:val="false"/>
-        </w:rPr>
-        <w:t xml:space="preserve">As pichações "C." no bunker</w:t>
-      </w:r>
-      <w:r>
-        <w:rPr>
-          <w:b w:val="false"/>
-          <w:bCs w:val="false"/>
-          <w:i w:val="false"/>
-          <w:iCs w:val="false"/>
-        </w:rPr>
-        <w:t xml:space="preserve"> ("NÃO CONFIE NAS LUZES"): quem fez? Não podem ser da Clarice, que está na 103 desde que chegou. Uma opção é virarem marcas antigas dos Faroleiros; a outra é saírem.</w:t>
       </w:r>
     </w:p>
     <w:p>

</xml_diff>

<commit_message>
docs: gírias e medo do Zane, relações novas e roteiro com todos os diálogos
Fichas do Zane, da Clarice, da Diana e do Gabriel e o resumo. História
Completa (md e docx): frequência aberta, alguém de 1750 e o recado do
Henrique; o medo do Zane sai das pendências. Roteiro.docx 0.8 com as
conversas novas e o Bunker inteiro transcrito.

Co-Authored-By: Claude Opus 5.5 <noreply@anthropic.com>
</commit_message>
<xml_diff>
--- a/docs/historia/História_Completa.docx
+++ b/docs/historia/História_Completa.docx
@@ -9510,7 +9510,7 @@
           <w:i w:val="false"/>
           <w:iCs w:val="false"/>
         </w:rPr>
-        <w:t xml:space="preserve"> a Clarice fala pelo rádio na Biblioteca e no Bloco de salas, e o Zane mantém a frequência da oficina, ligando pelos telefones velhos e guiando Gabriel pelo rádio no Labirinto e no Centro de Convivência.</w:t>
+        <w:t xml:space="preserve"> a Clarice fala pelo rádio na Biblioteca e no Bloco de salas, e o Zane mantém a frequência da oficina, ligando pelos telefones velhos e guiando Gabriel pelo rádio no Labirinto e no Centro de Convivência. A frequência é aberta: a Diana, a Clarice e o Zane conversam entre si e com Gabriel. O Henrique não fala nela: o que ele diz chega pela Clarice (seção 6.1).</w:t>
       </w:r>
     </w:p>
     <w:p>
@@ -9529,72 +9529,16 @@
           <w:i w:val="false"/>
           <w:iCs w:val="false"/>
         </w:rPr>
-        <w:t xml:space="preserve">O anel:</w:t>
-      </w:r>
-      <w:r>
-        <w:rPr>
-          <w:b w:val="false"/>
-          <w:bCs w:val="false"/>
-          <w:i w:val="false"/>
-          <w:iCs w:val="false"/>
-        </w:rPr>
-        <w:t xml:space="preserve"> em algum ponto, Gabriel encontra o Baltazar e descobre o parentesco.</w:t>
-      </w:r>
-    </w:p>
-    <w:p>
-      <w:pPr>
-        <w:pStyle w:val="Heading2"/>
-      </w:pPr>
-      <w:bookmarkStart w:name="_Toc23" w:id="23"/>
-      <w:r>
-        <w:t xml:space="preserve">Ato 3 — O esconderijo (Bunker)</w:t>
-      </w:r>
-      <w:bookmarkEnd w:id="23"/>
-    </w:p>
-    <w:p>
-      <w:pPr>
-        <w:pStyle w:val="Corpo"/>
-      </w:pPr>
-      <w:r>
-        <w:rPr>
-          <w:b/>
-          <w:bCs/>
-          <w:i w:val="false"/>
-          <w:iCs w:val="false"/>
-        </w:rPr>
-        <w:t xml:space="preserve">Quinta fase.</w:t>
-      </w:r>
-      <w:r>
-        <w:rPr>
-          <w:b w:val="false"/>
-          <w:bCs w:val="false"/>
-          <w:i w:val="false"/>
-          <w:iCs w:val="false"/>
-        </w:rPr>
-        <w:t xml:space="preserve"> </w:t>
-      </w:r>
-      <w:r>
-        <w:rPr>
-          <w:rFonts w:ascii="Courier New" w:cs="Courier New" w:eastAsia="Courier New" w:hAnsi="Courier New"/>
-          <w:b w:val="false"/>
-          <w:bCs w:val="false"/>
-          <w:i w:val="false"/>
-          <w:iCs w:val="false"/>
-          <w:color w:val="2A7F8E"/>
-          <w:sz w:val="19"/>
-          <w:szCs w:val="19"/>
-          <w:shd w:fill="EEF2F5" w:color="auto" w:val="clear"/>
-        </w:rPr>
-        <w:t xml:space="preserve">../fases/bunker.md</w:t>
-      </w:r>
-      <w:r>
-        <w:rPr>
-          <w:b w:val="false"/>
-          <w:bCs w:val="false"/>
-          <w:i w:val="false"/>
-          <w:iCs w:val="false"/>
-        </w:rPr>
-        <w:t xml:space="preserve">.</w:t>
+        <w:t xml:space="preserve">Alguém de 1750:</w:t>
+      </w:r>
+      <w:r>
+        <w:rPr>
+          <w:b w:val="false"/>
+          <w:bCs w:val="false"/>
+          <w:i w:val="false"/>
+          <w:iCs w:val="false"/>
+        </w:rPr>
+        <w:t xml:space="preserve"> no Labirinto, Gabriel conta pelo rádio do acampamento e do diário que achou na Biblioteca. Ninguém na frequência é de 1750: o grupo descobre que há mais alguém no campus, sozinho e fora da rede. Onde ele está e quando Gabriel o encontra continua pendente (seção 10.5).</w:t>
       </w:r>
     </w:p>
     <w:p>
@@ -9608,21 +9552,68 @@
       </w:pPr>
       <w:r>
         <w:rPr>
-          <w:b w:val="false"/>
-          <w:bCs w:val="false"/>
-          <w:i w:val="false"/>
-          <w:iCs w:val="false"/>
-        </w:rPr>
-        <w:t xml:space="preserve">O bunker de pesquisa embaixo do núcleo da Âncora ("ÂNCORA-03"), com dois setores. É difícil de alcançar, e </w:t>
-      </w:r>
-      <w:r>
-        <w:rPr>
-          <w:b/>
-          <w:bCs/>
-          <w:i w:val="false"/>
-          <w:iCs w:val="false"/>
-        </w:rPr>
-        <w:t xml:space="preserve">os robôs patrulham aqui também</w:t>
+          <w:b/>
+          <w:bCs/>
+          <w:i w:val="false"/>
+          <w:iCs w:val="false"/>
+        </w:rPr>
+        <w:t xml:space="preserve">O anel:</w:t>
+      </w:r>
+      <w:r>
+        <w:rPr>
+          <w:b w:val="false"/>
+          <w:bCs w:val="false"/>
+          <w:i w:val="false"/>
+          <w:iCs w:val="false"/>
+        </w:rPr>
+        <w:t xml:space="preserve"> em algum ponto, Gabriel encontra o Baltazar e descobre o parentesco.</w:t>
+      </w:r>
+    </w:p>
+    <w:p>
+      <w:pPr>
+        <w:pStyle w:val="Heading2"/>
+      </w:pPr>
+      <w:bookmarkStart w:name="_Toc23" w:id="23"/>
+      <w:r>
+        <w:t xml:space="preserve">Ato 3 — O esconderijo (Bunker)</w:t>
+      </w:r>
+      <w:bookmarkEnd w:id="23"/>
+    </w:p>
+    <w:p>
+      <w:pPr>
+        <w:pStyle w:val="Corpo"/>
+      </w:pPr>
+      <w:r>
+        <w:rPr>
+          <w:b/>
+          <w:bCs/>
+          <w:i w:val="false"/>
+          <w:iCs w:val="false"/>
+        </w:rPr>
+        <w:t xml:space="preserve">Quinta fase.</w:t>
+      </w:r>
+      <w:r>
+        <w:rPr>
+          <w:b w:val="false"/>
+          <w:bCs w:val="false"/>
+          <w:i w:val="false"/>
+          <w:iCs w:val="false"/>
+        </w:rPr>
+        <w:t xml:space="preserve"> </w:t>
+      </w:r>
+      <w:r>
+        <w:rPr>
+          <w:rFonts w:ascii="Courier New" w:cs="Courier New" w:eastAsia="Courier New" w:hAnsi="Courier New"/>
+          <w:b w:val="false"/>
+          <w:bCs w:val="false"/>
+          <w:i w:val="false"/>
+          <w:iCs w:val="false"/>
+          <w:color w:val="2A7F8E"/>
+          <w:sz w:val="19"/>
+          <w:szCs w:val="19"/>
+          <w:shd w:fill="EEF2F5" w:color="auto" w:val="clear"/>
+        </w:rPr>
+        <w:t xml:space="preserve">../fases/bunker.md</w:t>
       </w:r>
       <w:r>
         <w:rPr>
@@ -9645,111 +9636,30 @@
       </w:pPr>
       <w:r>
         <w:rPr>
-          <w:b/>
-          <w:bCs/>
-          <w:i w:val="false"/>
-          <w:iCs w:val="false"/>
-        </w:rPr>
-        <w:t xml:space="preserve">As salas antigas:</w:t>
-      </w:r>
-      <w:r>
-        <w:rPr>
-          <w:b w:val="false"/>
-          <w:bCs w:val="false"/>
-          <w:i w:val="false"/>
-          <w:iCs w:val="false"/>
-        </w:rPr>
-        <w:t xml:space="preserve"> no bunker há </w:t>
-      </w:r>
-      <w:r>
-        <w:rPr>
-          <w:b/>
-          <w:bCs/>
-          <w:i w:val="false"/>
-          <w:iCs w:val="false"/>
-        </w:rPr>
-        <w:t xml:space="preserve">duas</w:t>
-      </w:r>
-      <w:r>
-        <w:rPr>
-          <w:b w:val="false"/>
-          <w:bCs w:val="false"/>
-          <w:i w:val="false"/>
-          <w:iCs w:val="false"/>
-        </w:rPr>
-        <w:t xml:space="preserve"> salas montadas como </w:t>
-      </w:r>
-      <w:r>
-        <w:rPr>
-          <w:b/>
-          <w:bCs/>
-          <w:i w:val="false"/>
-          <w:iCs w:val="false"/>
-        </w:rPr>
-        <w:t xml:space="preserve">interiores de casa</w:t>
-      </w:r>
-      <w:r>
-        <w:rPr>
-          <w:b w:val="false"/>
-          <w:bCs w:val="false"/>
-          <w:i w:val="false"/>
-          <w:iCs w:val="false"/>
-        </w:rPr>
-        <w:t xml:space="preserve">: a </w:t>
-      </w:r>
-      <w:r>
-        <w:rPr>
-          <w:b/>
-          <w:bCs/>
-          <w:i w:val="false"/>
-          <w:iCs w:val="false"/>
-        </w:rPr>
-        <w:t xml:space="preserve">sala de visitas de um casarão do fim do século XIX</w:t>
-      </w:r>
-      <w:r>
-        <w:rPr>
-          <w:b w:val="false"/>
-          <w:bCs w:val="false"/>
-          <w:i w:val="false"/>
-          <w:iCs w:val="false"/>
-        </w:rPr>
-        <w:t xml:space="preserve"> e a </w:t>
-      </w:r>
-      <w:r>
-        <w:rPr>
-          <w:b/>
-          <w:bCs/>
-          <w:i w:val="false"/>
-          <w:iCs w:val="false"/>
-        </w:rPr>
-        <w:t xml:space="preserve">sala de estar de uma casa dos anos 80</w:t>
-      </w:r>
-      <w:r>
-        <w:rPr>
-          <w:b w:val="false"/>
-          <w:bCs w:val="false"/>
-          <w:i w:val="false"/>
-          <w:iCs w:val="false"/>
-        </w:rPr>
-        <w:t xml:space="preserve">. Mostram a obsessão do Carlos pelo passado, </w:t>
-      </w:r>
-      <w:r>
-        <w:rPr>
-          <w:b/>
-          <w:bCs/>
-          <w:i w:val="false"/>
-          <w:iCs w:val="false"/>
-        </w:rPr>
-        <w:t xml:space="preserve">sem explicar</w:t>
-      </w:r>
-      <w:r>
-        <w:rPr>
-          <w:b w:val="false"/>
-          <w:bCs w:val="false"/>
-          <w:i w:val="false"/>
-          <w:iCs w:val="false"/>
-        </w:rPr>
-        <w:t xml:space="preserve">: o jogo não diz quem as montou nem por quê.</w:t>
+          <w:b w:val="false"/>
+          <w:bCs w:val="false"/>
+          <w:i w:val="false"/>
+          <w:iCs w:val="false"/>
+        </w:rPr>
+        <w:t xml:space="preserve">O bunker de pesquisa embaixo do núcleo da Âncora ("ÂNCORA-03"), com dois setores. É difícil de alcançar, e </w:t>
+      </w:r>
+      <w:r>
+        <w:rPr>
+          <w:b/>
+          <w:bCs/>
+          <w:i w:val="false"/>
+          <w:iCs w:val="false"/>
+        </w:rPr>
+        <w:t xml:space="preserve">os robôs patrulham aqui também</w:t>
+      </w:r>
+      <w:r>
+        <w:rPr>
+          <w:b w:val="false"/>
+          <w:bCs w:val="false"/>
+          <w:i w:val="false"/>
+          <w:iCs w:val="false"/>
+        </w:rPr>
+        <w:t xml:space="preserve">.</w:t>
       </w:r>
     </w:p>
     <w:p>
@@ -9768,16 +9678,106 @@
           <w:i w:val="false"/>
           <w:iCs w:val="false"/>
         </w:rPr>
-        <w:t xml:space="preserve">As marcas dos Faroleiros:</w:t>
-      </w:r>
-      <w:r>
-        <w:rPr>
-          <w:b w:val="false"/>
-          <w:bCs w:val="false"/>
-          <w:i w:val="false"/>
-          <w:iCs w:val="false"/>
-        </w:rPr>
-        <w:t xml:space="preserve"> nas paredes do bunker há marcas dos Faroleiros pintadas em âmbar (seção 2.4): o farol inteiro perto da sala segura e o farol apagado perto da comporta do núcleo. Os Faroleiros passaram por ali; o jogo não diz quando.</w:t>
+        <w:t xml:space="preserve">As salas antigas:</w:t>
+      </w:r>
+      <w:r>
+        <w:rPr>
+          <w:b w:val="false"/>
+          <w:bCs w:val="false"/>
+          <w:i w:val="false"/>
+          <w:iCs w:val="false"/>
+        </w:rPr>
+        <w:t xml:space="preserve"> no bunker há </w:t>
+      </w:r>
+      <w:r>
+        <w:rPr>
+          <w:b/>
+          <w:bCs/>
+          <w:i w:val="false"/>
+          <w:iCs w:val="false"/>
+        </w:rPr>
+        <w:t xml:space="preserve">duas</w:t>
+      </w:r>
+      <w:r>
+        <w:rPr>
+          <w:b w:val="false"/>
+          <w:bCs w:val="false"/>
+          <w:i w:val="false"/>
+          <w:iCs w:val="false"/>
+        </w:rPr>
+        <w:t xml:space="preserve"> salas montadas como </w:t>
+      </w:r>
+      <w:r>
+        <w:rPr>
+          <w:b/>
+          <w:bCs/>
+          <w:i w:val="false"/>
+          <w:iCs w:val="false"/>
+        </w:rPr>
+        <w:t xml:space="preserve">interiores de casa</w:t>
+      </w:r>
+      <w:r>
+        <w:rPr>
+          <w:b w:val="false"/>
+          <w:bCs w:val="false"/>
+          <w:i w:val="false"/>
+          <w:iCs w:val="false"/>
+        </w:rPr>
+        <w:t xml:space="preserve">: a </w:t>
+      </w:r>
+      <w:r>
+        <w:rPr>
+          <w:b/>
+          <w:bCs/>
+          <w:i w:val="false"/>
+          <w:iCs w:val="false"/>
+        </w:rPr>
+        <w:t xml:space="preserve">sala de visitas de um casarão do fim do século XIX</w:t>
+      </w:r>
+      <w:r>
+        <w:rPr>
+          <w:b w:val="false"/>
+          <w:bCs w:val="false"/>
+          <w:i w:val="false"/>
+          <w:iCs w:val="false"/>
+        </w:rPr>
+        <w:t xml:space="preserve"> e a </w:t>
+      </w:r>
+      <w:r>
+        <w:rPr>
+          <w:b/>
+          <w:bCs/>
+          <w:i w:val="false"/>
+          <w:iCs w:val="false"/>
+        </w:rPr>
+        <w:t xml:space="preserve">sala de estar de uma casa dos anos 80</w:t>
+      </w:r>
+      <w:r>
+        <w:rPr>
+          <w:b w:val="false"/>
+          <w:bCs w:val="false"/>
+          <w:i w:val="false"/>
+          <w:iCs w:val="false"/>
+        </w:rPr>
+        <w:t xml:space="preserve">. Mostram a obsessão do Carlos pelo passado, </w:t>
+      </w:r>
+      <w:r>
+        <w:rPr>
+          <w:b/>
+          <w:bCs/>
+          <w:i w:val="false"/>
+          <w:iCs w:val="false"/>
+        </w:rPr>
+        <w:t xml:space="preserve">sem explicar</w:t>
+      </w:r>
+      <w:r>
+        <w:rPr>
+          <w:b w:val="false"/>
+          <w:bCs w:val="false"/>
+          <w:i w:val="false"/>
+          <w:iCs w:val="false"/>
+        </w:rPr>
+        <w:t xml:space="preserve">: o jogo não diz quem as montou nem por quê.</w:t>
       </w:r>
     </w:p>
     <w:p>
@@ -9796,34 +9796,16 @@
           <w:i w:val="false"/>
           <w:iCs w:val="false"/>
         </w:rPr>
-        <w:t xml:space="preserve">De onde Gabriel chega aqui:</w:t>
-      </w:r>
-      <w:r>
-        <w:rPr>
-          <w:b w:val="false"/>
-          <w:bCs w:val="false"/>
-          <w:i w:val="false"/>
-          <w:iCs w:val="false"/>
-        </w:rPr>
-        <w:t xml:space="preserve"> pela rampa técnica do subsolo aberta no fim do </w:t>
-      </w:r>
-      <w:r>
-        <w:rPr>
-          <w:b/>
-          <w:bCs/>
-          <w:i w:val="false"/>
-          <w:iCs w:val="false"/>
-        </w:rPr>
-        <w:t xml:space="preserve">Centro de Convivência</w:t>
-      </w:r>
-      <w:r>
-        <w:rPr>
-          <w:b w:val="false"/>
-          <w:bCs w:val="false"/>
-          <w:i w:val="false"/>
-          <w:iCs w:val="false"/>
-        </w:rPr>
-        <w:t xml:space="preserve">.</w:t>
+        <w:t xml:space="preserve">As marcas dos Faroleiros:</w:t>
+      </w:r>
+      <w:r>
+        <w:rPr>
+          <w:b w:val="false"/>
+          <w:bCs w:val="false"/>
+          <w:i w:val="false"/>
+          <w:iCs w:val="false"/>
+        </w:rPr>
+        <w:t xml:space="preserve"> nas paredes do bunker há marcas dos Faroleiros pintadas em âmbar (seção 2.4): o farol inteiro perto da sala segura e o farol apagado perto da comporta do núcleo. Os Faroleiros passaram por ali; o jogo não diz quando.</w:t>
       </w:r>
     </w:p>
     <w:p>
@@ -9842,70 +9824,34 @@
           <w:i w:val="false"/>
           <w:iCs w:val="false"/>
         </w:rPr>
-        <w:t xml:space="preserve">O Gabriel já encontrou o Zane em pessoa no Labirinto</w:t>
-      </w:r>
-      <w:r>
-        <w:rPr>
-          <w:b w:val="false"/>
-          <w:bCs w:val="false"/>
-          <w:i w:val="false"/>
-          <w:iCs w:val="false"/>
-        </w:rPr>
-        <w:t xml:space="preserve">. O </w:t>
-      </w:r>
-      <w:r>
-        <w:rPr>
-          <w:b/>
-          <w:bCs/>
-          <w:i w:val="false"/>
-          <w:iCs w:val="false"/>
-        </w:rPr>
-        <w:t xml:space="preserve">Henrique</w:t>
-      </w:r>
-      <w:r>
-        <w:rPr>
-          <w:b w:val="false"/>
-          <w:bCs w:val="false"/>
-          <w:i w:val="false"/>
-          <w:iCs w:val="false"/>
-        </w:rPr>
-        <w:t xml:space="preserve"> fica </w:t>
-      </w:r>
-      <w:r>
-        <w:rPr>
-          <w:b/>
-          <w:bCs/>
-          <w:i w:val="false"/>
-          <w:iCs w:val="false"/>
-        </w:rPr>
-        <w:t xml:space="preserve">sozinho</w:t>
-      </w:r>
-      <w:r>
-        <w:rPr>
-          <w:b w:val="false"/>
-          <w:bCs w:val="false"/>
-          <w:i w:val="false"/>
-          <w:iCs w:val="false"/>
-        </w:rPr>
-        <w:t xml:space="preserve"> numa sala de dados </w:t>
-      </w:r>
-      <w:r>
-        <w:rPr>
-          <w:b/>
-          <w:bCs/>
-          <w:i w:val="false"/>
-          <w:iCs w:val="false"/>
-        </w:rPr>
-        <w:t xml:space="preserve">trancada</w:t>
-      </w:r>
-      <w:r>
-        <w:rPr>
-          <w:b w:val="false"/>
-          <w:bCs w:val="false"/>
-          <w:i w:val="false"/>
-          <w:iCs w:val="false"/>
-        </w:rPr>
-        <w:t xml:space="preserve">, com o acesso às câmeras do campus, e é quem Gabriel encontra em pessoa aqui. Gabriel o reconhece pela lenda: é o aluno que sumiu em 2019 (seção 7.2). O Carlos nunca vai ao bunker.</w:t>
+        <w:t xml:space="preserve">De onde Gabriel chega aqui:</w:t>
+      </w:r>
+      <w:r>
+        <w:rPr>
+          <w:b w:val="false"/>
+          <w:bCs w:val="false"/>
+          <w:i w:val="false"/>
+          <w:iCs w:val="false"/>
+        </w:rPr>
+        <w:t xml:space="preserve"> pela rampa técnica do subsolo aberta no fim do </w:t>
+      </w:r>
+      <w:r>
+        <w:rPr>
+          <w:b/>
+          <w:bCs/>
+          <w:i w:val="false"/>
+          <w:iCs w:val="false"/>
+        </w:rPr>
+        <w:t xml:space="preserve">Centro de Convivência</w:t>
+      </w:r>
+      <w:r>
+        <w:rPr>
+          <w:b w:val="false"/>
+          <w:bCs w:val="false"/>
+          <w:i w:val="false"/>
+          <w:iCs w:val="false"/>
+        </w:rPr>
+        <w:t xml:space="preserve">.</w:t>
       </w:r>
     </w:p>
     <w:p>
@@ -9924,93 +9870,70 @@
           <w:i w:val="false"/>
           <w:iCs w:val="false"/>
         </w:rPr>
-        <w:t xml:space="preserve">O encontro (fim da fase):</w:t>
-      </w:r>
-      <w:r>
-        <w:rPr>
-          <w:b w:val="false"/>
-          <w:bCs w:val="false"/>
-          <w:i w:val="false"/>
-          <w:iCs w:val="false"/>
-        </w:rPr>
-        <w:t xml:space="preserve"> Gabriel religa a energia do bunker e, com ela, o </w:t>
-      </w:r>
-      <w:r>
-        <w:rPr>
-          <w:b/>
-          <w:bCs/>
-          <w:i w:val="false"/>
-          <w:iCs w:val="false"/>
-        </w:rPr>
-        <w:t xml:space="preserve">Zane quebra a senha do setor B</w:t>
-      </w:r>
-      <w:r>
-        <w:rPr>
-          <w:b w:val="false"/>
-          <w:bCs w:val="false"/>
-          <w:i w:val="false"/>
-          <w:iCs w:val="false"/>
-        </w:rPr>
-        <w:t xml:space="preserve">. Na sala de dados, o grupo se encontra </w:t>
-      </w:r>
-      <w:r>
-        <w:rPr>
-          <w:b/>
-          <w:bCs/>
-          <w:i w:val="false"/>
-          <w:iCs w:val="false"/>
-        </w:rPr>
-        <w:t xml:space="preserve">pela primeira vez numa sala só</w:t>
-      </w:r>
-      <w:r>
-        <w:rPr>
-          <w:b w:val="false"/>
-          <w:bCs w:val="false"/>
-          <w:i w:val="false"/>
-          <w:iCs w:val="false"/>
-        </w:rPr>
-        <w:t xml:space="preserve">: Gabriel, o Henrique, o Zane, a Clarice e a Diana. Dali descem pela comporta do núcleo. </w:t>
-      </w:r>
-      <w:r>
-        <w:rPr>
-          <w:b/>
-          <w:bCs/>
-          <w:i w:val="false"/>
-          <w:iCs w:val="false"/>
-        </w:rPr>
-        <w:t xml:space="preserve">A cena é provisória:</w:t>
-      </w:r>
-      <w:r>
-        <w:rPr>
-          <w:b w:val="false"/>
-          <w:bCs w:val="false"/>
-          <w:i w:val="false"/>
-          <w:iCs w:val="false"/>
-        </w:rPr>
-        <w:t xml:space="preserve"> o conteúdo da conversa (rascunho em </w:t>
-      </w:r>
-      <w:r>
-        <w:rPr>
-          <w:rFonts w:ascii="Courier New" w:cs="Courier New" w:eastAsia="Courier New" w:hAnsi="Courier New"/>
-          <w:b w:val="false"/>
-          <w:bCs w:val="false"/>
-          <w:i w:val="false"/>
-          <w:iCs w:val="false"/>
-          <w:color w:val="2A7F8E"/>
-          <w:sz w:val="19"/>
-          <w:szCs w:val="19"/>
-          <w:shd w:fill="EEF2F5" w:color="auto" w:val="clear"/>
-        </w:rPr>
-        <w:t xml:space="preserve">dados/dialogos/bunker_encontro.json</w:t>
-      </w:r>
-      <w:r>
-        <w:rPr>
-          <w:b w:val="false"/>
-          <w:bCs w:val="false"/>
-          <w:i w:val="false"/>
-          <w:iCs w:val="false"/>
-        </w:rPr>
-        <w:t xml:space="preserve">) e como a Clarice e a Diana chegam ao bunker ficam em aberto para o grupo mudar.</w:t>
+        <w:t xml:space="preserve">O Gabriel já encontrou o Zane em pessoa no Labirinto</w:t>
+      </w:r>
+      <w:r>
+        <w:rPr>
+          <w:b w:val="false"/>
+          <w:bCs w:val="false"/>
+          <w:i w:val="false"/>
+          <w:iCs w:val="false"/>
+        </w:rPr>
+        <w:t xml:space="preserve">. O </w:t>
+      </w:r>
+      <w:r>
+        <w:rPr>
+          <w:b/>
+          <w:bCs/>
+          <w:i w:val="false"/>
+          <w:iCs w:val="false"/>
+        </w:rPr>
+        <w:t xml:space="preserve">Henrique</w:t>
+      </w:r>
+      <w:r>
+        <w:rPr>
+          <w:b w:val="false"/>
+          <w:bCs w:val="false"/>
+          <w:i w:val="false"/>
+          <w:iCs w:val="false"/>
+        </w:rPr>
+        <w:t xml:space="preserve"> fica </w:t>
+      </w:r>
+      <w:r>
+        <w:rPr>
+          <w:b/>
+          <w:bCs/>
+          <w:i w:val="false"/>
+          <w:iCs w:val="false"/>
+        </w:rPr>
+        <w:t xml:space="preserve">sozinho</w:t>
+      </w:r>
+      <w:r>
+        <w:rPr>
+          <w:b w:val="false"/>
+          <w:bCs w:val="false"/>
+          <w:i w:val="false"/>
+          <w:iCs w:val="false"/>
+        </w:rPr>
+        <w:t xml:space="preserve"> numa sala de dados </w:t>
+      </w:r>
+      <w:r>
+        <w:rPr>
+          <w:b/>
+          <w:bCs/>
+          <w:i w:val="false"/>
+          <w:iCs w:val="false"/>
+        </w:rPr>
+        <w:t xml:space="preserve">trancada</w:t>
+      </w:r>
+      <w:r>
+        <w:rPr>
+          <w:b w:val="false"/>
+          <w:bCs w:val="false"/>
+          <w:i w:val="false"/>
+          <w:iCs w:val="false"/>
+        </w:rPr>
+        <w:t xml:space="preserve">, com o acesso às câmeras do campus, e é quem Gabriel encontra em pessoa aqui. Gabriel o reconhece pela lenda: é o aluno que sumiu em 2019 (seção 7.2). O Carlos nunca vai ao bunker.</w:t>
       </w:r>
     </w:p>
     <w:p>
@@ -10024,59 +9947,99 @@
       </w:pPr>
       <w:r>
         <w:rPr>
-          <w:b w:val="false"/>
-          <w:bCs w:val="false"/>
-          <w:i w:val="false"/>
-          <w:iCs w:val="false"/>
-        </w:rPr>
-        <w:t xml:space="preserve">O </w:t>
-      </w:r>
-      <w:r>
-        <w:rPr>
-          <w:b/>
-          <w:bCs/>
-          <w:i w:val="false"/>
-          <w:iCs w:val="false"/>
-        </w:rPr>
-        <w:t xml:space="preserve">setor B</w:t>
-      </w:r>
-      <w:r>
-        <w:rPr>
-          <w:b w:val="false"/>
-          <w:bCs w:val="false"/>
-          <w:i w:val="false"/>
-          <w:iCs w:val="false"/>
-        </w:rPr>
-        <w:t xml:space="preserve"> (laboratório, arquivo e a comporta do núcleo) leva à reta final: a comporta no fim do Corredor B abre o acesso à sexta fase, o </w:t>
-      </w:r>
-      <w:r>
-        <w:rPr>
-          <w:b/>
-          <w:bCs/>
-          <w:i w:val="false"/>
-          <w:iCs w:val="false"/>
-        </w:rPr>
-        <w:t xml:space="preserve">Laboratório (D-Tec)</w:t>
-      </w:r>
-      <w:r>
-        <w:rPr>
-          <w:b w:val="false"/>
-          <w:bCs w:val="false"/>
-          <w:i w:val="false"/>
-          <w:iCs w:val="false"/>
-        </w:rPr>
-        <w:t xml:space="preserve">.</w:t>
-      </w:r>
-    </w:p>
-    <w:p>
-      <w:pPr>
-        <w:pStyle w:val="Heading2"/>
-      </w:pPr>
-      <w:bookmarkStart w:name="_Toc24" w:id="24"/>
-      <w:r>
-        <w:t xml:space="preserve">A virada — A mentira do Henrique</w:t>
-      </w:r>
-      <w:bookmarkEnd w:id="24"/>
+          <w:b/>
+          <w:bCs/>
+          <w:i w:val="false"/>
+          <w:iCs w:val="false"/>
+        </w:rPr>
+        <w:t xml:space="preserve">O encontro (fim da fase):</w:t>
+      </w:r>
+      <w:r>
+        <w:rPr>
+          <w:b w:val="false"/>
+          <w:bCs w:val="false"/>
+          <w:i w:val="false"/>
+          <w:iCs w:val="false"/>
+        </w:rPr>
+        <w:t xml:space="preserve"> Gabriel religa a energia do bunker e, com ela, o </w:t>
+      </w:r>
+      <w:r>
+        <w:rPr>
+          <w:b/>
+          <w:bCs/>
+          <w:i w:val="false"/>
+          <w:iCs w:val="false"/>
+        </w:rPr>
+        <w:t xml:space="preserve">Zane quebra a senha do setor B</w:t>
+      </w:r>
+      <w:r>
+        <w:rPr>
+          <w:b w:val="false"/>
+          <w:bCs w:val="false"/>
+          <w:i w:val="false"/>
+          <w:iCs w:val="false"/>
+        </w:rPr>
+        <w:t xml:space="preserve">. Na sala de dados, o grupo se encontra </w:t>
+      </w:r>
+      <w:r>
+        <w:rPr>
+          <w:b/>
+          <w:bCs/>
+          <w:i w:val="false"/>
+          <w:iCs w:val="false"/>
+        </w:rPr>
+        <w:t xml:space="preserve">pela primeira vez numa sala só</w:t>
+      </w:r>
+      <w:r>
+        <w:rPr>
+          <w:b w:val="false"/>
+          <w:bCs w:val="false"/>
+          <w:i w:val="false"/>
+          <w:iCs w:val="false"/>
+        </w:rPr>
+        <w:t xml:space="preserve">: Gabriel, o Henrique, o Zane, a Clarice e a Diana. Dali descem pela comporta do núcleo. </w:t>
+      </w:r>
+      <w:r>
+        <w:rPr>
+          <w:b/>
+          <w:bCs/>
+          <w:i w:val="false"/>
+          <w:iCs w:val="false"/>
+        </w:rPr>
+        <w:t xml:space="preserve">A cena é provisória:</w:t>
+      </w:r>
+      <w:r>
+        <w:rPr>
+          <w:b w:val="false"/>
+          <w:bCs w:val="false"/>
+          <w:i w:val="false"/>
+          <w:iCs w:val="false"/>
+        </w:rPr>
+        <w:t xml:space="preserve"> o conteúdo da conversa (rascunho em </w:t>
+      </w:r>
+      <w:r>
+        <w:rPr>
+          <w:rFonts w:ascii="Courier New" w:cs="Courier New" w:eastAsia="Courier New" w:hAnsi="Courier New"/>
+          <w:b w:val="false"/>
+          <w:bCs w:val="false"/>
+          <w:i w:val="false"/>
+          <w:iCs w:val="false"/>
+          <w:color w:val="2A7F8E"/>
+          <w:sz w:val="19"/>
+          <w:szCs w:val="19"/>
+          <w:shd w:fill="EEF2F5" w:color="auto" w:val="clear"/>
+        </w:rPr>
+        <w:t xml:space="preserve">dados/dialogos/bunker_encontro.json</w:t>
+      </w:r>
+      <w:r>
+        <w:rPr>
+          <w:b w:val="false"/>
+          <w:bCs w:val="false"/>
+          <w:i w:val="false"/>
+          <w:iCs w:val="false"/>
+        </w:rPr>
+        <w:t xml:space="preserve">) e como a Clarice e a Diana chegam ao bunker ficam em aberto para o grupo mudar.</w:t>
+      </w:r>
     </w:p>
     <w:p>
       <w:pPr>
@@ -10103,71 +10066,45 @@
           <w:i w:val="false"/>
           <w:iCs w:val="false"/>
         </w:rPr>
-        <w:t xml:space="preserve">Henrique</w:t>
-      </w:r>
-      <w:r>
-        <w:rPr>
-          <w:b w:val="false"/>
-          <w:bCs w:val="false"/>
-          <w:i w:val="false"/>
-          <w:iCs w:val="false"/>
-        </w:rPr>
-        <w:t xml:space="preserve"> engana o grupo: </w:t>
-      </w:r>
-      <w:r>
-        <w:rPr>
-          <w:b/>
-          <w:bCs/>
-          <w:i w:val="false"/>
-          <w:iCs w:val="false"/>
-        </w:rPr>
-        <w:t xml:space="preserve">trabalha para o Carlos</w:t>
-      </w:r>
-      <w:r>
-        <w:rPr>
-          <w:b w:val="false"/>
-          <w:bCs w:val="false"/>
-          <w:i w:val="false"/>
-          <w:iCs w:val="false"/>
-        </w:rPr>
-        <w:t xml:space="preserve">. Quando caiu, o primeiro de todos, o Carlos prometeu levá-lo de volta </w:t>
-      </w:r>
-      <w:r>
-        <w:rPr>
-          <w:b/>
-          <w:bCs/>
-          <w:i w:val="false"/>
-          <w:iCs w:val="false"/>
-        </w:rPr>
-        <w:t xml:space="preserve">para antes da morte da mãe dele</w:t>
-      </w:r>
-      <w:r>
-        <w:rPr>
-          <w:b w:val="false"/>
-          <w:bCs w:val="false"/>
-          <w:i w:val="false"/>
-          <w:iCs w:val="false"/>
-        </w:rPr>
-        <w:t xml:space="preserve">, e ele aceitou. O Carlos só o usa: a função do Henrique é </w:t>
-      </w:r>
-      <w:r>
-        <w:rPr>
-          <w:b/>
-          <w:bCs/>
-          <w:i w:val="false"/>
-          <w:iCs w:val="false"/>
-        </w:rPr>
-        <w:t xml:space="preserve">atrasar os outros</w:t>
-      </w:r>
-      <w:r>
-        <w:rPr>
-          <w:b w:val="false"/>
-          <w:bCs w:val="false"/>
-          <w:i w:val="false"/>
-          <w:iCs w:val="false"/>
-        </w:rPr>
-        <w:t xml:space="preserve"> enquanto o Carlos conserta a Âncora para si.</w:t>
-      </w:r>
+        <w:t xml:space="preserve">setor B</w:t>
+      </w:r>
+      <w:r>
+        <w:rPr>
+          <w:b w:val="false"/>
+          <w:bCs w:val="false"/>
+          <w:i w:val="false"/>
+          <w:iCs w:val="false"/>
+        </w:rPr>
+        <w:t xml:space="preserve"> (laboratório, arquivo e a comporta do núcleo) leva à reta final: a comporta no fim do Corredor B abre o acesso à sexta fase, o </w:t>
+      </w:r>
+      <w:r>
+        <w:rPr>
+          <w:b/>
+          <w:bCs/>
+          <w:i w:val="false"/>
+          <w:iCs w:val="false"/>
+        </w:rPr>
+        <w:t xml:space="preserve">Laboratório (D-Tec)</w:t>
+      </w:r>
+      <w:r>
+        <w:rPr>
+          <w:b w:val="false"/>
+          <w:bCs w:val="false"/>
+          <w:i w:val="false"/>
+          <w:iCs w:val="false"/>
+        </w:rPr>
+        <w:t xml:space="preserve">.</w:t>
+      </w:r>
+    </w:p>
+    <w:p>
+      <w:pPr>
+        <w:pStyle w:val="Heading2"/>
+      </w:pPr>
+      <w:bookmarkStart w:name="_Toc24" w:id="24"/>
+      <w:r>
+        <w:t xml:space="preserve">A virada — A mentira do Henrique</w:t>
+      </w:r>
+      <w:bookmarkEnd w:id="24"/>
     </w:p>
     <w:p>
       <w:pPr>
@@ -10180,6 +10117,97 @@
       </w:pPr>
       <w:r>
         <w:rPr>
+          <w:b w:val="false"/>
+          <w:bCs w:val="false"/>
+          <w:i w:val="false"/>
+          <w:iCs w:val="false"/>
+        </w:rPr>
+        <w:t xml:space="preserve">O </w:t>
+      </w:r>
+      <w:r>
+        <w:rPr>
+          <w:b/>
+          <w:bCs/>
+          <w:i w:val="false"/>
+          <w:iCs w:val="false"/>
+        </w:rPr>
+        <w:t xml:space="preserve">Henrique</w:t>
+      </w:r>
+      <w:r>
+        <w:rPr>
+          <w:b w:val="false"/>
+          <w:bCs w:val="false"/>
+          <w:i w:val="false"/>
+          <w:iCs w:val="false"/>
+        </w:rPr>
+        <w:t xml:space="preserve"> engana o grupo: </w:t>
+      </w:r>
+      <w:r>
+        <w:rPr>
+          <w:b/>
+          <w:bCs/>
+          <w:i w:val="false"/>
+          <w:iCs w:val="false"/>
+        </w:rPr>
+        <w:t xml:space="preserve">trabalha para o Carlos</w:t>
+      </w:r>
+      <w:r>
+        <w:rPr>
+          <w:b w:val="false"/>
+          <w:bCs w:val="false"/>
+          <w:i w:val="false"/>
+          <w:iCs w:val="false"/>
+        </w:rPr>
+        <w:t xml:space="preserve">. Quando caiu, o primeiro de todos, o Carlos prometeu levá-lo de volta </w:t>
+      </w:r>
+      <w:r>
+        <w:rPr>
+          <w:b/>
+          <w:bCs/>
+          <w:i w:val="false"/>
+          <w:iCs w:val="false"/>
+        </w:rPr>
+        <w:t xml:space="preserve">para antes da morte da mãe dele</w:t>
+      </w:r>
+      <w:r>
+        <w:rPr>
+          <w:b w:val="false"/>
+          <w:bCs w:val="false"/>
+          <w:i w:val="false"/>
+          <w:iCs w:val="false"/>
+        </w:rPr>
+        <w:t xml:space="preserve">, e ele aceitou. O Carlos só o usa: a função do Henrique é </w:t>
+      </w:r>
+      <w:r>
+        <w:rPr>
+          <w:b/>
+          <w:bCs/>
+          <w:i w:val="false"/>
+          <w:iCs w:val="false"/>
+        </w:rPr>
+        <w:t xml:space="preserve">atrasar os outros</w:t>
+      </w:r>
+      <w:r>
+        <w:rPr>
+          <w:b w:val="false"/>
+          <w:bCs w:val="false"/>
+          <w:i w:val="false"/>
+          <w:iCs w:val="false"/>
+        </w:rPr>
+        <w:t xml:space="preserve"> enquanto o Carlos conserta a Âncora para si.</w:t>
+      </w:r>
+    </w:p>
+    <w:p>
+      <w:pPr>
+        <w:pStyle w:val="Corpo"/>
+        <w:numPr>
+          <w:ilvl w:val="0"/>
+          <w:numId w:val="2"/>
+        </w:numPr>
+        <w:spacing w:after="70"/>
+      </w:pPr>
+      <w:r>
+        <w:rPr>
           <w:b/>
           <w:bCs/>
           <w:i w:val="false"/>
@@ -10324,7 +10352,7 @@
           <w:i w:val="false"/>
           <w:iCs w:val="false"/>
         </w:rPr>
-        <w:t xml:space="preserve"> as dicas de patrulha são verdadeiras (é assim que ganha a confiança), mas ele mantém cada um no seu canto, e tudo o que o grupo sabe passa por ele. </w:t>
+        <w:t xml:space="preserve"> as dicas de patrulha são verdadeiras (é assim que ganha a confiança), mas ele mantém cada um no seu canto, e tudo o que o grupo sabe passa por ele. Quando Gabriel liga o elevador do Centro de Convivência, o Henrique pede, pela Clarice, que ele não desça ao bunker. </w:t>
       </w:r>
       <w:r>
         <w:rPr>
@@ -12491,7 +12519,7 @@
           <w:i w:val="false"/>
           <w:iCs w:val="false"/>
         </w:rPr>
-        <w:t xml:space="preserve"> o que fazia no ponto quando foi puxado? O que ele teme, agora que a IA não tem consciência? Qual é o final dele (ficar em 3026 para guardar a Âncora, ficar para se juntar aos Faroleiros, ou voltar para 2123)? As falas dele no bunker (a chamada pelo rádio e o encontro) são rascunho.</w:t>
+        <w:t xml:space="preserve"> o que fazia no ponto quando foi puxado? Qual é o final dele (ficar em 3026 para guardar a Âncora, ficar para se juntar aos Faroleiros, ou voltar para 2123)? As falas dele no bunker (a chamada pelo rádio e o encontro) são rascunho.</w:t>
       </w:r>
     </w:p>
     <w:p>

</xml_diff>

<commit_message>
docs: História_Completa.docx igual ao .md
Leva para o Word o que só estava no .md: o esconderijo do Baltazar no
Labirinto, a Folha de calibração do Carlos, a Diana de Direito, o anel
para depois do primeiro encontro e o aviso do Zane sobre as duas salas.

Co-Authored-By: Claude Opus 5.5 <noreply@anthropic.com>
</commit_message>
<xml_diff>
--- a/docs/historia/História_Completa.docx
+++ b/docs/historia/História_Completa.docx
@@ -4412,8 +4412,6 @@
                 <w:bCs w:val="false"/>
                 <w:i w:val="false"/>
                 <w:iCs w:val="false"/>
-                <w:sz w:val="19"/>
-                <w:szCs w:val="19"/>
               </w:rPr>
               <w:t xml:space="preserve">Diana (1978)</w:t>
             </w:r>
@@ -4447,10 +4445,8 @@
                 <w:bCs w:val="false"/>
                 <w:i w:val="false"/>
                 <w:iCs w:val="false"/>
-                <w:sz w:val="19"/>
-                <w:szCs w:val="19"/>
-              </w:rPr>
-              <w:t xml:space="preserve">As plantas: estagiária de arquitetura na obra, conhece as galerias de 1978, que não aparecem nos mapas de 3026, e descobre por elas onde fica o núcleo e as passagens até lá</w:t>
+              </w:rPr>
+              <w:t xml:space="preserve">O mapa das galerias: estudante de Direito que cresceu cortando caminho pela obra, conhece as galerias de 1978, que não aparecem nos mapas de 3026, e descobre por elas onde fica o núcleo e as passagens até lá</w:t>
             </w:r>
           </w:p>
         </w:tc>
@@ -6096,6 +6092,106 @@
       </w:pPr>
       <w:r>
         <w:rPr>
+          <w:b/>
+          <w:bCs/>
+          <w:i w:val="false"/>
+          <w:iCs w:val="false"/>
+        </w:rPr>
+        <w:t xml:space="preserve">O primeiro registro dele:</w:t>
+      </w:r>
+      <w:r>
+        <w:rPr>
+          <w:b w:val="false"/>
+          <w:bCs w:val="false"/>
+          <w:i w:val="false"/>
+          <w:iCs w:val="false"/>
+        </w:rPr>
+        <w:t xml:space="preserve"> a </w:t>
+      </w:r>
+      <w:r>
+        <w:rPr>
+          <w:b/>
+          <w:bCs/>
+          <w:i w:val="false"/>
+          <w:iCs w:val="false"/>
+        </w:rPr>
+        <w:t xml:space="preserve">Folha de calibração</w:t>
+      </w:r>
+      <w:r>
+        <w:rPr>
+          <w:b w:val="false"/>
+          <w:bCs w:val="false"/>
+          <w:i w:val="false"/>
+          <w:iCs w:val="false"/>
+        </w:rPr>
+        <w:t xml:space="preserve">, no Corredor do Tempo do Labirinto (opcional). Ali ele testava a calibração da Âncora com objetos dos anos 80 (um Genius, os três quadros de </w:t>
+      </w:r>
+      <w:r>
+        <w:rPr>
+          <w:b w:val="false"/>
+          <w:bCs w:val="false"/>
+          <w:i/>
+          <w:iCs/>
+        </w:rPr>
+        <w:t xml:space="preserve">De Volta para o Futuro</w:t>
+      </w:r>
+      <w:r>
+        <w:rPr>
+          <w:b w:val="false"/>
+          <w:bCs w:val="false"/>
+          <w:i w:val="false"/>
+          <w:iCs w:val="false"/>
+        </w:rPr>
+        <w:t xml:space="preserve">, um micro e um telefone de disco). Na folha ele conta que a máquina errou de novo, abriu a fenda na Biblioteca e puxou alguém que ele </w:t>
+      </w:r>
+      <w:r>
+        <w:rPr>
+          <w:b/>
+          <w:bCs/>
+          <w:i w:val="false"/>
+          <w:iCs w:val="false"/>
+        </w:rPr>
+        <w:t xml:space="preserve">nem foi ver</w:t>
+      </w:r>
+      <w:r>
+        <w:rPr>
+          <w:b w:val="false"/>
+          <w:bCs w:val="false"/>
+          <w:i w:val="false"/>
+          <w:iCs w:val="false"/>
+        </w:rPr>
+        <w:t xml:space="preserve">; diz que já foi um Faroleiro e que só quer o mundo dos anos 80. </w:t>
+      </w:r>
+      <w:r>
+        <w:rPr>
+          <w:b/>
+          <w:bCs/>
+          <w:i w:val="false"/>
+          <w:iCs w:val="false"/>
+        </w:rPr>
+        <w:t xml:space="preserve">Assina só "C."</w:t>
+      </w:r>
+      <w:r>
+        <w:rPr>
+          <w:b w:val="false"/>
+          <w:bCs w:val="false"/>
+          <w:i w:val="false"/>
+          <w:iCs w:val="false"/>
+        </w:rPr>
+        <w:t xml:space="preserve">: o jogador ainda não sabe o nome dele (quando descobre continua pendente, seção 10.2).</w:t>
+      </w:r>
+    </w:p>
+    <w:p>
+      <w:pPr>
+        <w:pStyle w:val="Corpo"/>
+        <w:numPr>
+          <w:ilvl w:val="0"/>
+          <w:numId w:val="2"/>
+        </w:numPr>
+        <w:spacing w:after="70"/>
+      </w:pPr>
+      <w:r>
+        <w:rPr>
           <w:b w:val="false"/>
           <w:bCs w:val="false"/>
           <w:i w:val="false"/>
@@ -6768,21 +6864,17 @@
                 <w:bCs/>
                 <w:i w:val="false"/>
                 <w:iCs w:val="false"/>
-                <w:sz w:val="19"/>
-                <w:szCs w:val="19"/>
-              </w:rPr>
-              <w:t xml:space="preserve">Biblioteca</w:t>
-            </w:r>
-            <w:r>
-              <w:rPr>
-                <w:b w:val="false"/>
-                <w:bCs w:val="false"/>
-                <w:i w:val="false"/>
-                <w:iCs w:val="false"/>
-                <w:sz w:val="19"/>
-                <w:szCs w:val="19"/>
-              </w:rPr>
-              <w:t xml:space="preserve">, escondido numa sala que o jogador ainda não consegue abrir, com medo</w:t>
+              </w:rPr>
+              <w:t xml:space="preserve">Labirinto</w:t>
+            </w:r>
+            <w:r>
+              <w:rPr>
+                <w:b w:val="false"/>
+                <w:bCs w:val="false"/>
+                <w:i w:val="false"/>
+                <w:iCs w:val="false"/>
+              </w:rPr>
+              <w:t xml:space="preserve">, numa sala secreta atrás de um painel solto na parede, que só aparece com a lanterna apontada para ele</w:t>
             </w:r>
           </w:p>
         </w:tc>
@@ -6813,10 +6905,8 @@
                 <w:bCs w:val="false"/>
                 <w:i w:val="false"/>
                 <w:iCs w:val="false"/>
-                <w:sz w:val="19"/>
-                <w:szCs w:val="19"/>
-              </w:rPr>
-              <w:t xml:space="preserve">Baltazar, isolado dos outros, ali desde que chegou</w:t>
+              </w:rPr>
+              <w:t xml:space="preserve">Baltazar, sozinho e com medo. Deixou o acampamento da Biblioteca seguindo a luz, desceu ao subsolo e se escondeu ali. Os robôs nunca acharam a sala</w:t>
             </w:r>
           </w:p>
         </w:tc>
@@ -7351,7 +7441,7 @@
           <w:i w:val="false"/>
           <w:iCs w:val="false"/>
         </w:rPr>
-        <w:t xml:space="preserve">: não está na frequência. Gabriel só fala com ele em pessoa.</w:t>
+        <w:t xml:space="preserve">: não está na frequência. Ouve as vozes nas "caixas que falam" pelos corredores do subsolo e não responde. Gabriel só fala com ele em pessoa.</w:t>
       </w:r>
     </w:p>
     <w:p>
@@ -7663,8 +7753,6 @@
                 <w:bCs w:val="false"/>
                 <w:i w:val="false"/>
                 <w:iCs w:val="false"/>
-                <w:sz w:val="19"/>
-                <w:szCs w:val="19"/>
               </w:rPr>
               <w:t xml:space="preserve">1978</w:t>
             </w:r>
@@ -7698,8 +7786,6 @@
                 <w:bCs w:val="false"/>
                 <w:i w:val="false"/>
                 <w:iCs w:val="false"/>
-                <w:sz w:val="19"/>
-                <w:szCs w:val="19"/>
               </w:rPr>
               <w:t xml:space="preserve">Diana</w:t>
             </w:r>
@@ -7733,10 +7819,8 @@
                 <w:bCs w:val="false"/>
                 <w:i w:val="false"/>
                 <w:iCs w:val="false"/>
-                <w:sz w:val="19"/>
-                <w:szCs w:val="19"/>
-              </w:rPr>
-              <w:t xml:space="preserve">Estagiária de arquitetura na obra do campus: vigiava a obra à noite depois que um lote de material sumiu sob a responsabilidade dela</w:t>
+              </w:rPr>
+              <w:t xml:space="preserve">Estudante de Direito: estava numa aula chata de Direito Penal, quase caindo na mesa, quando do nada apareceu na Biblioteca de 3026</w:t>
             </w:r>
           </w:p>
         </w:tc>
@@ -9210,30 +9294,7 @@
           <w:i w:val="false"/>
           <w:iCs w:val="false"/>
         </w:rPr>
-        <w:t xml:space="preserve"> (</w:t>
-      </w:r>
-      <w:r>
-        <w:rPr>
-          <w:rFonts w:ascii="Courier New" w:cs="Courier New" w:eastAsia="Courier New" w:hAnsi="Courier New"/>
-          <w:b w:val="false"/>
-          <w:bCs w:val="false"/>
-          <w:i w:val="false"/>
-          <w:iCs w:val="false"/>
-          <w:color w:val="2A7F8E"/>
-          <w:sz w:val="19"/>
-          <w:szCs w:val="19"/>
-          <w:shd w:fill="EEF2F5" w:color="auto" w:val="clear"/>
-        </w:rPr>
-        <w:t xml:space="preserve">../fases/labirinto.md</w:t>
-      </w:r>
-      <w:r>
-        <w:rPr>
-          <w:b w:val="false"/>
-          <w:bCs w:val="false"/>
-          <w:i w:val="false"/>
-          <w:iCs w:val="false"/>
-        </w:rPr>
-        <w:t xml:space="preserve">): a terceira fase. Subsolo escuro do centro de pesquisa da Âncora, com seis robôs patrulhando corredores que se cruzam. Gabriel entra no subsolo e, a poucos passos, chega à </w:t>
+        <w:t xml:space="preserve"> (../fases/labirinto.md): a terceira fase. Subsolo escuro do centro de pesquisa da Âncora, com seis robôs patrulhando corredores que se cruzam. Gabriel entra no subsolo e, a poucos passos, chega à </w:t>
       </w:r>
       <w:r>
         <w:rPr>
@@ -9341,7 +9402,25 @@
           <w:i w:val="false"/>
           <w:iCs w:val="false"/>
         </w:rPr>
-        <w:t xml:space="preserve">.</w:t>
+        <w:t xml:space="preserve">. Ao entregar o notebook, o Zane avisa de duas coisas fora do mapa: uma parede no corredor de cima que esquenta como se tivesse gente atrás (é o esconderijo do Baltazar; o Zane não sabe quem está lá) e a porta âmbar do Corredor do Tempo. No meio do labirinto há uma sala opcional, o </w:t>
+      </w:r>
+      <w:r>
+        <w:rPr>
+          <w:b/>
+          <w:bCs/>
+          <w:i w:val="false"/>
+          <w:iCs w:val="false"/>
+        </w:rPr>
+        <w:t xml:space="preserve">Corredor do Tempo</w:t>
+      </w:r>
+      <w:r>
+        <w:rPr>
+          <w:b w:val="false"/>
+          <w:bCs w:val="false"/>
+          <w:i w:val="false"/>
+          <w:iCs w:val="false"/>
+        </w:rPr>
+        <w:t xml:space="preserve">: quatro salinhas onde quem construiu a Âncora testava a calibração com objetos dos anos 80. Gabriel precisa alinhar os quatro mecanismos antes que um relógio zere; quem vence encontra a Folha de calibração, assinada só "C." (seção 4.3).</w:t>
       </w:r>
     </w:p>
     <w:p>
@@ -9360,129 +9439,160 @@
           <w:i w:val="false"/>
           <w:iCs w:val="false"/>
         </w:rPr>
-        <w:t xml:space="preserve">Centro de Convivência</w:t>
-      </w:r>
-      <w:r>
-        <w:rPr>
-          <w:b w:val="false"/>
-          <w:bCs w:val="false"/>
-          <w:i w:val="false"/>
-          <w:iCs w:val="false"/>
-        </w:rPr>
-        <w:t xml:space="preserve"> (</w:t>
-      </w:r>
-      <w:r>
-        <w:rPr>
-          <w:rFonts w:ascii="Courier New" w:cs="Courier New" w:eastAsia="Courier New" w:hAnsi="Courier New"/>
-          <w:b w:val="false"/>
-          <w:bCs w:val="false"/>
-          <w:i w:val="false"/>
-          <w:iCs w:val="false"/>
-          <w:color w:val="2A7F8E"/>
-          <w:sz w:val="19"/>
-          <w:szCs w:val="19"/>
-          <w:shd w:fill="EEF2F5" w:color="auto" w:val="clear"/>
-        </w:rPr>
-        <w:t xml:space="preserve">../fases/centro_de_convivencia.md</w:t>
-      </w:r>
-      <w:r>
-        <w:rPr>
-          <w:b w:val="false"/>
-          <w:bCs w:val="false"/>
-          <w:i w:val="false"/>
-          <w:iCs w:val="false"/>
-        </w:rPr>
-        <w:t xml:space="preserve">): a quarta fase, entre o Labirinto e o Bunker. Gabriel atravessa o pátio aberto sob o luar, sem nenhum personagem em pessoa no local, sendo guiado pelo </w:t>
-      </w:r>
-      <w:r>
-        <w:rPr>
-          <w:b/>
-          <w:bCs/>
-          <w:i w:val="false"/>
-          <w:iCs w:val="false"/>
-        </w:rPr>
-        <w:t xml:space="preserve">Zane pelo rádio</w:t>
-      </w:r>
-      <w:r>
-        <w:rPr>
-          <w:b w:val="false"/>
-          <w:bCs w:val="false"/>
-          <w:i w:val="false"/>
-          <w:iCs w:val="false"/>
-        </w:rPr>
-        <w:t xml:space="preserve">. Ele encontra a Sala Segura no Posto de Manutenção, busca a </w:t>
-      </w:r>
-      <w:r>
-        <w:rPr>
-          <w:b/>
-          <w:bCs/>
-          <w:i w:val="false"/>
-          <w:iCs w:val="false"/>
-        </w:rPr>
-        <w:t xml:space="preserve">Célula de Energia</w:t>
-      </w:r>
-      <w:r>
-        <w:rPr>
-          <w:b w:val="false"/>
-          <w:bCs w:val="false"/>
-          <w:i w:val="false"/>
-          <w:iCs w:val="false"/>
-        </w:rPr>
-        <w:t xml:space="preserve"> na câmara da Cantina (contornando os cacos de vidro e o Rastreador), resolve o </w:t>
-      </w:r>
-      <w:r>
-        <w:rPr>
-          <w:b/>
-          <w:bCs/>
-          <w:i w:val="false"/>
-          <w:iCs w:val="false"/>
-        </w:rPr>
-        <w:t xml:space="preserve">Puzzle de Coloração de Grafos</w:t>
-      </w:r>
-      <w:r>
-        <w:rPr>
-          <w:b w:val="false"/>
-          <w:bCs w:val="false"/>
-          <w:i w:val="false"/>
-          <w:iCs w:val="false"/>
-        </w:rPr>
-        <w:t xml:space="preserve"> no comutador da Gráfica Rápida (o que acende os holofotes perimetrais do pátio) e abre a comporta da </w:t>
-      </w:r>
-      <w:r>
-        <w:rPr>
-          <w:b/>
-          <w:bCs/>
-          <w:i w:val="false"/>
-          <w:iCs w:val="false"/>
-        </w:rPr>
-        <w:t xml:space="preserve">Rampa do Subsolo</w:t>
-      </w:r>
-      <w:r>
-        <w:rPr>
-          <w:b w:val="false"/>
-          <w:bCs w:val="false"/>
-          <w:i w:val="false"/>
-          <w:iCs w:val="false"/>
-        </w:rPr>
-        <w:t xml:space="preserve"> que desce para o </w:t>
-      </w:r>
-      <w:r>
-        <w:rPr>
-          <w:b/>
-          <w:bCs/>
-          <w:i w:val="false"/>
-          <w:iCs w:val="false"/>
-        </w:rPr>
-        <w:t xml:space="preserve">Bunker</w:t>
-      </w:r>
-      <w:r>
-        <w:rPr>
-          <w:b w:val="false"/>
-          <w:bCs w:val="false"/>
-          <w:i w:val="false"/>
-          <w:iCs w:val="false"/>
-        </w:rPr>
-        <w:t xml:space="preserve">.</w:t>
+        <w:t xml:space="preserve">O esconderijo do Baltazar (Labirinto):</w:t>
+      </w:r>
+      <w:r>
+        <w:rPr>
+          <w:b w:val="false"/>
+          <w:bCs w:val="false"/>
+          <w:i w:val="false"/>
+          <w:iCs w:val="false"/>
+        </w:rPr>
+        <w:t xml:space="preserve"> num canto do labirinto, atrás de um </w:t>
+      </w:r>
+      <w:r>
+        <w:rPr>
+          <w:b/>
+          <w:bCs/>
+          <w:i w:val="false"/>
+          <w:iCs w:val="false"/>
+        </w:rPr>
+        <w:t xml:space="preserve">painel solto</w:t>
+      </w:r>
+      <w:r>
+        <w:rPr>
+          <w:b w:val="false"/>
+          <w:bCs w:val="false"/>
+          <w:i w:val="false"/>
+          <w:iCs w:val="false"/>
+        </w:rPr>
+        <w:t xml:space="preserve"> na parede, fica o esconderijo do </w:t>
+      </w:r>
+      <w:r>
+        <w:rPr>
+          <w:b/>
+          <w:bCs/>
+          <w:i w:val="false"/>
+          <w:iCs w:val="false"/>
+        </w:rPr>
+        <w:t xml:space="preserve">Baltazar</w:t>
+      </w:r>
+      <w:r>
+        <w:rPr>
+          <w:b w:val="false"/>
+          <w:bCs w:val="false"/>
+          <w:i w:val="false"/>
+          <w:iCs w:val="false"/>
+        </w:rPr>
+        <w:t xml:space="preserve">. O painel parece parede: só aparece com a </w:t>
+      </w:r>
+      <w:r>
+        <w:rPr>
+          <w:b/>
+          <w:bCs/>
+          <w:i w:val="false"/>
+          <w:iCs w:val="false"/>
+        </w:rPr>
+        <w:t xml:space="preserve">lanterna apontada</w:t>
+      </w:r>
+      <w:r>
+        <w:rPr>
+          <w:b w:val="false"/>
+          <w:bCs w:val="false"/>
+          <w:i w:val="false"/>
+          <w:iCs w:val="false"/>
+        </w:rPr>
+        <w:t xml:space="preserve"> para ele, riscado com o </w:t>
+      </w:r>
+      <w:r>
+        <w:rPr>
+          <w:b/>
+          <w:bCs/>
+          <w:i w:val="false"/>
+          <w:iCs w:val="false"/>
+        </w:rPr>
+        <w:t xml:space="preserve">Cruzeiro do Sul</w:t>
+      </w:r>
+      <w:r>
+        <w:rPr>
+          <w:b w:val="false"/>
+          <w:bCs w:val="false"/>
+          <w:i w:val="false"/>
+          <w:iCs w:val="false"/>
+        </w:rPr>
+        <w:t xml:space="preserve"> e uma </w:t>
+      </w:r>
+      <w:r>
+        <w:rPr>
+          <w:b/>
+          <w:bCs/>
+          <w:i w:val="false"/>
+          <w:iCs w:val="false"/>
+        </w:rPr>
+        <w:t xml:space="preserve">cruz</w:t>
+      </w:r>
+      <w:r>
+        <w:rPr>
+          <w:b w:val="false"/>
+          <w:bCs w:val="false"/>
+          <w:i w:val="false"/>
+          <w:iCs w:val="false"/>
+        </w:rPr>
+        <w:t xml:space="preserve"> (as marcas que o Baltazar fez para achar a própria porta). Dentro, uma sala bagunçada: cama de panos, um altar de velas, livros trazidos da Biblioteca, um robô desmontado e uma chapa com o céu de casa riscado a giz. É ali o </w:t>
+      </w:r>
+      <w:r>
+        <w:rPr>
+          <w:b/>
+          <w:bCs/>
+          <w:i w:val="false"/>
+          <w:iCs w:val="false"/>
+        </w:rPr>
+        <w:t xml:space="preserve">primeiro encontro</w:t>
+      </w:r>
+      <w:r>
+        <w:rPr>
+          <w:b w:val="false"/>
+          <w:bCs w:val="false"/>
+          <w:i w:val="false"/>
+          <w:iCs w:val="false"/>
+        </w:rPr>
+        <w:t xml:space="preserve"> de Gabriel com ele. O Baltazar se assusta, pergunta se é o fim do mundo, conta que seguiu a luz até o subsolo e </w:t>
+      </w:r>
+      <w:r>
+        <w:rPr>
+          <w:b/>
+          <w:bCs/>
+          <w:i w:val="false"/>
+          <w:iCs w:val="false"/>
+        </w:rPr>
+        <w:t xml:space="preserve">não quer sair</w:t>
+      </w:r>
+      <w:r>
+        <w:rPr>
+          <w:b w:val="false"/>
+          <w:bCs w:val="false"/>
+          <w:i w:val="false"/>
+          <w:iCs w:val="false"/>
+        </w:rPr>
+        <w:t xml:space="preserve">: lá fora andam os robôs, e ali dentro eles não entram. Gabriel diz só o primeiro nome, e o parentesco </w:t>
+      </w:r>
+      <w:r>
+        <w:rPr>
+          <w:b/>
+          <w:bCs/>
+          <w:i w:val="false"/>
+          <w:iCs w:val="false"/>
+        </w:rPr>
+        <w:t xml:space="preserve">ainda não aparece</w:t>
+      </w:r>
+      <w:r>
+        <w:rPr>
+          <w:b w:val="false"/>
+          <w:bCs w:val="false"/>
+          <w:i w:val="false"/>
+          <w:iCs w:val="false"/>
+        </w:rPr>
+        <w:t xml:space="preserve"> nesse encontro.</w:t>
       </w:r>
     </w:p>
     <w:p>
@@ -9501,16 +9611,129 @@
           <w:i w:val="false"/>
           <w:iCs w:val="false"/>
         </w:rPr>
-        <w:t xml:space="preserve">Rádio e telefone:</w:t>
-      </w:r>
-      <w:r>
-        <w:rPr>
-          <w:b w:val="false"/>
-          <w:bCs w:val="false"/>
-          <w:i w:val="false"/>
-          <w:iCs w:val="false"/>
-        </w:rPr>
-        <w:t xml:space="preserve"> a Clarice fala pelo rádio na Biblioteca e no Bloco de salas, e o Zane mantém a frequência da oficina, ligando pelos telefones velhos e guiando Gabriel pelo rádio no Labirinto e no Centro de Convivência. A frequência é aberta: a Diana, a Clarice e o Zane conversam entre si e com Gabriel. O Henrique não fala nela: o que ele diz chega pela Clarice (seção 6.1).</w:t>
+        <w:t xml:space="preserve">Centro de Convivência</w:t>
+      </w:r>
+      <w:r>
+        <w:rPr>
+          <w:b w:val="false"/>
+          <w:bCs w:val="false"/>
+          <w:i w:val="false"/>
+          <w:iCs w:val="false"/>
+        </w:rPr>
+        <w:t xml:space="preserve"> (</w:t>
+      </w:r>
+      <w:r>
+        <w:rPr>
+          <w:rFonts w:ascii="Courier New" w:cs="Courier New" w:eastAsia="Courier New" w:hAnsi="Courier New"/>
+          <w:b w:val="false"/>
+          <w:bCs w:val="false"/>
+          <w:i w:val="false"/>
+          <w:iCs w:val="false"/>
+          <w:color w:val="2A7F8E"/>
+          <w:sz w:val="19"/>
+          <w:szCs w:val="19"/>
+          <w:shd w:fill="EEF2F5" w:color="auto" w:val="clear"/>
+        </w:rPr>
+        <w:t xml:space="preserve">../fases/centro_de_convivencia.md</w:t>
+      </w:r>
+      <w:r>
+        <w:rPr>
+          <w:b w:val="false"/>
+          <w:bCs w:val="false"/>
+          <w:i w:val="false"/>
+          <w:iCs w:val="false"/>
+        </w:rPr>
+        <w:t xml:space="preserve">): a quarta fase, entre o Labirinto e o Bunker. Gabriel atravessa o pátio aberto sob o luar, sem nenhum personagem em pessoa no local, sendo guiado pelo </w:t>
+      </w:r>
+      <w:r>
+        <w:rPr>
+          <w:b/>
+          <w:bCs/>
+          <w:i w:val="false"/>
+          <w:iCs w:val="false"/>
+        </w:rPr>
+        <w:t xml:space="preserve">Zane pelo rádio</w:t>
+      </w:r>
+      <w:r>
+        <w:rPr>
+          <w:b w:val="false"/>
+          <w:bCs w:val="false"/>
+          <w:i w:val="false"/>
+          <w:iCs w:val="false"/>
+        </w:rPr>
+        <w:t xml:space="preserve">. Ele encontra a Sala Segura no Posto de Manutenção, busca a </w:t>
+      </w:r>
+      <w:r>
+        <w:rPr>
+          <w:b/>
+          <w:bCs/>
+          <w:i w:val="false"/>
+          <w:iCs w:val="false"/>
+        </w:rPr>
+        <w:t xml:space="preserve">Célula de Energia</w:t>
+      </w:r>
+      <w:r>
+        <w:rPr>
+          <w:b w:val="false"/>
+          <w:bCs w:val="false"/>
+          <w:i w:val="false"/>
+          <w:iCs w:val="false"/>
+        </w:rPr>
+        <w:t xml:space="preserve"> na câmara da Cantina (contornando os cacos de vidro e o Rastreador), resolve o </w:t>
+      </w:r>
+      <w:r>
+        <w:rPr>
+          <w:b/>
+          <w:bCs/>
+          <w:i w:val="false"/>
+          <w:iCs w:val="false"/>
+        </w:rPr>
+        <w:t xml:space="preserve">Puzzle de Coloração de Grafos</w:t>
+      </w:r>
+      <w:r>
+        <w:rPr>
+          <w:b w:val="false"/>
+          <w:bCs w:val="false"/>
+          <w:i w:val="false"/>
+          <w:iCs w:val="false"/>
+        </w:rPr>
+        <w:t xml:space="preserve"> no comutador da Gráfica Rápida (o que acende os holofotes perimetrais do pátio) e abre a comporta da </w:t>
+      </w:r>
+      <w:r>
+        <w:rPr>
+          <w:b/>
+          <w:bCs/>
+          <w:i w:val="false"/>
+          <w:iCs w:val="false"/>
+        </w:rPr>
+        <w:t xml:space="preserve">Rampa do Subsolo</w:t>
+      </w:r>
+      <w:r>
+        <w:rPr>
+          <w:b w:val="false"/>
+          <w:bCs w:val="false"/>
+          <w:i w:val="false"/>
+          <w:iCs w:val="false"/>
+        </w:rPr>
+        <w:t xml:space="preserve"> que desce para o </w:t>
+      </w:r>
+      <w:r>
+        <w:rPr>
+          <w:b/>
+          <w:bCs/>
+          <w:i w:val="false"/>
+          <w:iCs w:val="false"/>
+        </w:rPr>
+        <w:t xml:space="preserve">Bunker</w:t>
+      </w:r>
+      <w:r>
+        <w:rPr>
+          <w:b w:val="false"/>
+          <w:bCs w:val="false"/>
+          <w:i w:val="false"/>
+          <w:iCs w:val="false"/>
+        </w:rPr>
+        <w:t xml:space="preserve">.</w:t>
       </w:r>
     </w:p>
     <w:p>
@@ -9529,16 +9752,16 @@
           <w:i w:val="false"/>
           <w:iCs w:val="false"/>
         </w:rPr>
-        <w:t xml:space="preserve">Alguém de 1750:</w:t>
-      </w:r>
-      <w:r>
-        <w:rPr>
-          <w:b w:val="false"/>
-          <w:bCs w:val="false"/>
-          <w:i w:val="false"/>
-          <w:iCs w:val="false"/>
-        </w:rPr>
-        <w:t xml:space="preserve"> no Labirinto, Gabriel conta pelo rádio do acampamento e do diário que achou na Biblioteca. Ninguém na frequência é de 1750: o grupo descobre que há mais alguém no campus, sozinho e fora da rede. Onde ele está e quando Gabriel o encontra continua pendente (seção 10.5).</w:t>
+        <w:t xml:space="preserve">Rádio e telefone:</w:t>
+      </w:r>
+      <w:r>
+        <w:rPr>
+          <w:b w:val="false"/>
+          <w:bCs w:val="false"/>
+          <w:i w:val="false"/>
+          <w:iCs w:val="false"/>
+        </w:rPr>
+        <w:t xml:space="preserve"> a Clarice fala pelo rádio na Biblioteca e no Bloco de salas, e o Zane mantém a frequência da oficina, ligando pelos telefones velhos e guiando Gabriel pelo rádio no Labirinto e no Centro de Convivência. A frequência é aberta: a Diana, a Clarice e o Zane conversam entre si e com Gabriel. O Henrique não fala nela: o que ele diz chega pela Clarice (seção 6.1).</w:t>
       </w:r>
     </w:p>
     <w:p>
@@ -9557,6 +9780,34 @@
           <w:i w:val="false"/>
           <w:iCs w:val="false"/>
         </w:rPr>
+        <w:t xml:space="preserve">Alguém de 1750:</w:t>
+      </w:r>
+      <w:r>
+        <w:rPr>
+          <w:b w:val="false"/>
+          <w:bCs w:val="false"/>
+          <w:i w:val="false"/>
+          <w:iCs w:val="false"/>
+        </w:rPr>
+        <w:t xml:space="preserve"> no Labirinto, Gabriel conta pelo rádio do acampamento e do diário que achou na Biblioteca. Ninguém na frequência é de 1750: o grupo descobre que há mais alguém no campus, sozinho e fora da rede. Esse alguém é o Baltazar, escondido numa sala secreta do próprio Labirinto (Ato 2); se e como o grupo o traz para junto fica pendente (seção 10.4).</w:t>
+      </w:r>
+    </w:p>
+    <w:p>
+      <w:pPr>
+        <w:pStyle w:val="Corpo"/>
+        <w:numPr>
+          <w:ilvl w:val="0"/>
+          <w:numId w:val="2"/>
+        </w:numPr>
+        <w:spacing w:after="70"/>
+      </w:pPr>
+      <w:r>
+        <w:rPr>
+          <w:b/>
+          <w:bCs/>
+          <w:i w:val="false"/>
+          <w:iCs w:val="false"/>
+        </w:rPr>
         <w:t xml:space="preserve">O anel:</w:t>
       </w:r>
       <w:r>
@@ -9566,7 +9817,7 @@
           <w:i w:val="false"/>
           <w:iCs w:val="false"/>
         </w:rPr>
-        <w:t xml:space="preserve"> em algum ponto, Gabriel encontra o Baltazar e descobre o parentesco.</w:t>
+        <w:t xml:space="preserve"> Gabriel conhece o Baltazar no Labirinto, mas o parentesco fica para depois: em algum ponto, ele compara os dois anéis e descobre (seção 10.5).</w:t>
       </w:r>
     </w:p>
     <w:p>
@@ -12547,7 +12798,25 @@
           <w:i w:val="false"/>
           <w:iCs w:val="false"/>
         </w:rPr>
-        <w:t xml:space="preserve"> em que posição da ordem de chegada ele está? (Já decidido: o Henrique é o primeiro, o Zane vem antes da Clarice, a Diana depois da Clarice, e Gabriel é o último; não precisa seguir a ordem dos anos. Cada chegada vem 3 dias depois da anterior, então a posição dele muda quantos dias cada um está lá.) Qual sala da Biblioteca é o esconderijo dele (a sala de obras raras, barrada por dentro, é a candidata), e quando ela se abre? Ele está ali desde que chegou: o acampamento vazio do começo foi o primeiro abrigo, e a última página do diário ("Hei de seguir a luz até onde ella nasce") combina com ficar, porque a luz nasce no chão da Biblioteca.</w:t>
+        <w:t xml:space="preserve"> em que posição da ordem de chegada ele está? (Já decidido: o Henrique é o primeiro, o Zane vem antes da Clarice, a Diana depois da Clarice, e Gabriel é o último; não precisa seguir a ordem dos anos. Cada chegada vem 3 dias depois da anterior, então a posição dele muda quantos dias cada um está lá.) Já decidido: o esconderijo dele é a sala secreta do Labirinto, e o primeiro encontro é lá. Hoje a sala é secreta, então o encontro é </w:t>
+      </w:r>
+      <w:r>
+        <w:rPr>
+          <w:b/>
+          <w:bCs/>
+          <w:i w:val="false"/>
+          <w:iCs w:val="false"/>
+        </w:rPr>
+        <w:t xml:space="preserve">opcional</w:t>
+      </w:r>
+      <w:r>
+        <w:rPr>
+          <w:b w:val="false"/>
+          <w:bCs w:val="false"/>
+          <w:i w:val="false"/>
+          <w:iCs w:val="false"/>
+        </w:rPr>
+        <w:t xml:space="preserve">: ele precisa ser obrigatório, já que o Baltazar traz as estrelas para consertar a Âncora? Como ele sai do esconderijo e se junta ao grupo? E a sala de obras raras da Biblioteca, barrada por dentro, que era a candidata ao esconderijo dele: quem (ou o quê) está do outro lado agora?</w:t>
       </w:r>
     </w:p>
     <w:p>
@@ -12701,7 +12970,7 @@
           <w:i w:val="false"/>
           <w:iCs w:val="false"/>
         </w:rPr>
-        <w:t xml:space="preserve">Em que momento Gabriel encontra o Baltazar e descobre o parentesco?</w:t>
+        <w:t xml:space="preserve">Em que momento Gabriel descobre o parentesco com o Baltazar? (O primeiro encontro já é no Labirinto, Ato 2.)</w:t>
       </w:r>
     </w:p>
     <w:p>

</xml_diff>

<commit_message>
docs: a Grande Separação e o Baltazar só em rastros na História Completa
Nome oficial da partida dos Homo sideralis, a regra das relações cada
vez mais frias, o Baltazar que desaparece na Âncora e é descoberto pelo
anel desenhado numa carta, e o desentendimento do Carlos com os
Faroleiros. Registro em decisoes.md.

Co-Authored-By: Claude Opus 5.5 <noreply@anthropic.com>
</commit_message>
<xml_diff>
--- a/docs/historia/História_Completa.docx
+++ b/docs/historia/História_Completa.docx
@@ -1339,8 +1339,6 @@
                 <w:bCs/>
                 <w:i w:val="false"/>
                 <w:iCs w:val="false"/>
-                <w:sz w:val="20"/>
-                <w:szCs w:val="20"/>
               </w:rPr>
               <w:t xml:space="preserve">Status:</w:t>
             </w:r>
@@ -1350,8 +1348,6 @@
                 <w:bCs w:val="false"/>
                 <w:i w:val="false"/>
                 <w:iCs w:val="false"/>
-                <w:sz w:val="20"/>
-                <w:szCs w:val="20"/>
               </w:rPr>
               <w:t xml:space="preserve"> reescrito em 2026-10-06, quando a história mudou de rumo: saíram os loops e a revelação de "Gabriel é o paradoxo", e a fenda passou a ser </w:t>
             </w:r>
@@ -1361,8 +1357,6 @@
                 <w:bCs/>
                 <w:i w:val="false"/>
                 <w:iCs w:val="false"/>
-                <w:sz w:val="20"/>
-                <w:szCs w:val="20"/>
               </w:rPr>
               <w:t xml:space="preserve">um acaso</w:t>
             </w:r>
@@ -1372,8 +1366,6 @@
                 <w:bCs w:val="false"/>
                 <w:i w:val="false"/>
                 <w:iCs w:val="false"/>
-                <w:sz w:val="20"/>
-                <w:szCs w:val="20"/>
               </w:rPr>
               <w:t xml:space="preserve"> para quem cai nela. Em 2026-10-07 entrou o antagonista, o </w:t>
             </w:r>
@@ -1383,8 +1375,6 @@
                 <w:bCs/>
                 <w:i w:val="false"/>
                 <w:iCs w:val="false"/>
-                <w:sz w:val="20"/>
-                <w:szCs w:val="20"/>
               </w:rPr>
               <w:t xml:space="preserve">Carlos</w:t>
             </w:r>
@@ -1394,8 +1384,6 @@
                 <w:bCs w:val="false"/>
                 <w:i w:val="false"/>
                 <w:iCs w:val="false"/>
-                <w:sz w:val="20"/>
-                <w:szCs w:val="20"/>
               </w:rPr>
               <w:t xml:space="preserve">. Em 2026-10-15 entraram os </w:t>
             </w:r>
@@ -1405,8 +1393,6 @@
                 <w:bCs/>
                 <w:i/>
                 <w:iCs/>
-                <w:sz w:val="20"/>
-                <w:szCs w:val="20"/>
               </w:rPr>
               <w:t xml:space="preserve">Homo sideralis</w:t>
             </w:r>
@@ -1416,8 +1402,6 @@
                 <w:bCs w:val="false"/>
                 <w:i w:val="false"/>
                 <w:iCs w:val="false"/>
-                <w:sz w:val="20"/>
-                <w:szCs w:val="20"/>
               </w:rPr>
               <w:t xml:space="preserve"> (quem foi embora), os </w:t>
             </w:r>
@@ -1427,8 +1411,6 @@
                 <w:bCs/>
                 <w:i w:val="false"/>
                 <w:iCs w:val="false"/>
-                <w:sz w:val="20"/>
-                <w:szCs w:val="20"/>
               </w:rPr>
               <w:t xml:space="preserve">Faroleiros</w:t>
             </w:r>
@@ -1438,8 +1420,6 @@
                 <w:bCs w:val="false"/>
                 <w:i w:val="false"/>
                 <w:iCs w:val="false"/>
-                <w:sz w:val="20"/>
-                <w:szCs w:val="20"/>
               </w:rPr>
               <w:t xml:space="preserve"> (quem ficou) e o conteúdo da mentira do </w:t>
             </w:r>
@@ -1449,8 +1429,6 @@
                 <w:bCs/>
                 <w:i w:val="false"/>
                 <w:iCs w:val="false"/>
-                <w:sz w:val="20"/>
-                <w:szCs w:val="20"/>
               </w:rPr>
               <w:t xml:space="preserve">Henrique</w:t>
             </w:r>
@@ -1460,8 +1438,60 @@
                 <w:bCs w:val="false"/>
                 <w:i w:val="false"/>
                 <w:iCs w:val="false"/>
-                <w:sz w:val="20"/>
-                <w:szCs w:val="20"/>
+              </w:rPr>
+              <w:t xml:space="preserve">. Em 2026-10-30, o </w:t>
+            </w:r>
+            <w:r>
+              <w:rPr>
+                <w:b/>
+                <w:bCs/>
+                <w:i w:val="false"/>
+                <w:iCs w:val="false"/>
+              </w:rPr>
+              <w:t xml:space="preserve">Baltazar</w:t>
+            </w:r>
+            <w:r>
+              <w:rPr>
+                <w:b w:val="false"/>
+                <w:bCs w:val="false"/>
+                <w:i w:val="false"/>
+                <w:iCs w:val="false"/>
+              </w:rPr>
+              <w:t xml:space="preserve"> deixou de aparecer em pessoa (só os rastros dele) e entrou o nome da partida dos </w:t>
+            </w:r>
+            <w:r>
+              <w:rPr>
+                <w:b w:val="false"/>
+                <w:bCs w:val="false"/>
+                <w:i/>
+                <w:iCs/>
+              </w:rPr>
+              <w:t xml:space="preserve">Homo sideralis</w:t>
+            </w:r>
+            <w:r>
+              <w:rPr>
+                <w:b w:val="false"/>
+                <w:bCs w:val="false"/>
+                <w:i w:val="false"/>
+                <w:iCs w:val="false"/>
+              </w:rPr>
+              <w:t xml:space="preserve">: a </w:t>
+            </w:r>
+            <w:r>
+              <w:rPr>
+                <w:b/>
+                <w:bCs/>
+                <w:i w:val="false"/>
+                <w:iCs w:val="false"/>
+              </w:rPr>
+              <w:t xml:space="preserve">Grande Separação</w:t>
+            </w:r>
+            <w:r>
+              <w:rPr>
+                <w:b w:val="false"/>
+                <w:bCs w:val="false"/>
+                <w:i w:val="false"/>
+                <w:iCs w:val="false"/>
               </w:rPr>
               <w:t xml:space="preserve">.</w:t>
             </w:r>
@@ -1628,7 +1658,25 @@
           <w:i w:val="false"/>
           <w:iCs w:val="false"/>
         </w:rPr>
-        <w:t xml:space="preserve">, no mesmo lugar, agora uma ruína tomada pela natureza. A sociedade e o planeta ficaram tão ruins que a humanidade se dividiu: os </w:t>
+        <w:t xml:space="preserve">, no mesmo lugar, agora uma ruína tomada pela natureza. A sociedade e o planeta ficaram tão ruins que a humanidade se dividiu, na </w:t>
+      </w:r>
+      <w:r>
+        <w:rPr>
+          <w:b/>
+          <w:bCs/>
+          <w:i w:val="false"/>
+          <w:iCs w:val="false"/>
+        </w:rPr>
+        <w:t xml:space="preserve">Grande Separação</w:t>
+      </w:r>
+      <w:r>
+        <w:rPr>
+          <w:b w:val="false"/>
+          <w:bCs w:val="false"/>
+          <w:i w:val="false"/>
+          <w:iCs w:val="false"/>
+        </w:rPr>
+        <w:t xml:space="preserve">: os </w:t>
       </w:r>
       <w:r>
         <w:rPr>
@@ -1682,7 +1730,7 @@
           <w:i w:val="false"/>
           <w:iCs w:val="false"/>
         </w:rPr>
-        <w:t xml:space="preserve">. Um deles se afastou do grupo e se isolou na Unifor: </w:t>
+        <w:t xml:space="preserve">. Um deles brigou com o grupo e se isolou na Unifor, abandonada havia muito tempo: </w:t>
       </w:r>
       <w:r>
         <w:rPr>
@@ -1790,7 +1838,7 @@
           <w:i w:val="false"/>
           <w:iCs w:val="false"/>
         </w:rPr>
-        <w:t xml:space="preserve">: o Carlos não escolhe ninguém. Gabriel não é o único: outros jovens de épocas diferentes caíram ali com dias de diferença, e cada um está tentando sobreviver num canto do campus. Os robôs, controlados pelo Carlos, caçam qualquer humano que aparecer. Gabriel precisa encontrar os outros, descobrir o que aconteceu e achar um jeito de todos voltarem para suas épocas. No caminho descobre que um deles é seu antepassado, que outro mente para o grupo a serviço do Carlos, e que por trás de tudo existe alguém.</w:t>
+        <w:t xml:space="preserve">: o Carlos não escolhe ninguém. Gabriel não é o único: outros jovens de épocas diferentes caíram ali com dias de diferença, e cada um está tentando sobreviver num canto do campus. Os robôs, controlados pelo Carlos, caçam qualquer humano que aparecer. Gabriel precisa encontrar os outros, descobrir o que aconteceu e achar um jeito de todos voltarem para suas épocas. No caminho segue os rastros de um antepassado que passou por ali antes dele e desapareceu, descobre que um dos outros mente para o grupo a serviço do Carlos, e que por trás de tudo existe alguém.</w:t>
       </w:r>
     </w:p>
     <w:p>
@@ -1938,7 +1986,25 @@
           <w:i w:val="false"/>
           <w:iCs w:val="false"/>
         </w:rPr>
-        <w:t xml:space="preserve">.</w:t>
+        <w:t xml:space="preserve">. Essa partida se chama </w:t>
+      </w:r>
+      <w:r>
+        <w:rPr>
+          <w:b/>
+          <w:bCs/>
+          <w:i w:val="false"/>
+          <w:iCs w:val="false"/>
+        </w:rPr>
+        <w:t xml:space="preserve">Grande Separação</w:t>
+      </w:r>
+      <w:r>
+        <w:rPr>
+          <w:b w:val="false"/>
+          <w:bCs w:val="false"/>
+          <w:i w:val="false"/>
+          <w:iCs w:val="false"/>
+        </w:rPr>
+        <w:t xml:space="preserve">: separou famílias e amigos, que nunca mais se viram.</w:t>
       </w:r>
     </w:p>
     <w:p>
@@ -2057,6 +2123,52 @@
           <w:i w:val="false"/>
           <w:iCs w:val="false"/>
         </w:rPr>
+        <w:t xml:space="preserve">Quanto mais no futuro, mais frias as relações.</w:t>
+      </w:r>
+      <w:r>
+        <w:rPr>
+          <w:b w:val="false"/>
+          <w:bCs w:val="false"/>
+          <w:i w:val="false"/>
+          <w:iCs w:val="false"/>
+        </w:rPr>
+        <w:t xml:space="preserve"> Do passado para o futuro, as relações entre as pessoas esfriam: em 2123 já são mornas, mediadas por máquinas (é daí que vem o jeito do Zane), e em 3026, depois da Grande Separação, são geladas. Os </w:t>
+      </w:r>
+      <w:r>
+        <w:rPr>
+          <w:b/>
+          <w:bCs/>
+          <w:i w:val="false"/>
+          <w:iCs w:val="false"/>
+        </w:rPr>
+        <w:t xml:space="preserve">Faroleiros</w:t>
+      </w:r>
+      <w:r>
+        <w:rPr>
+          <w:b w:val="false"/>
+          <w:bCs w:val="false"/>
+          <w:i w:val="false"/>
+          <w:iCs w:val="false"/>
+        </w:rPr>
+        <w:t xml:space="preserve"> são a exceção: mantêm a luz acesa, e as cartas deles são quentes.</w:t>
+      </w:r>
+    </w:p>
+    <w:p>
+      <w:pPr>
+        <w:pStyle w:val="Corpo"/>
+        <w:numPr>
+          <w:ilvl w:val="0"/>
+          <w:numId w:val="2"/>
+        </w:numPr>
+        <w:spacing w:after="70"/>
+      </w:pPr>
+      <w:r>
+        <w:rPr>
+          <w:b/>
+          <w:bCs/>
+          <w:i w:val="false"/>
+          <w:iCs w:val="false"/>
+        </w:rPr>
         <w:t xml:space="preserve">O Carlos era um Faroleiro.</w:t>
       </w:r>
       <w:r>
@@ -2066,7 +2178,25 @@
           <w:i w:val="false"/>
           <w:iCs w:val="false"/>
         </w:rPr>
-        <w:t xml:space="preserve"> Saiu do grupo e se isolou na Unifor, sozinho, durante anos, para usar a Âncora e ir viver nos anos 80 (seção 4.3).</w:t>
+        <w:t xml:space="preserve"> Há alguns anos teve um </w:t>
+      </w:r>
+      <w:r>
+        <w:rPr>
+          <w:b/>
+          <w:bCs/>
+          <w:i w:val="false"/>
+          <w:iCs w:val="false"/>
+        </w:rPr>
+        <w:t xml:space="preserve">desentendimento</w:t>
+      </w:r>
+      <w:r>
+        <w:rPr>
+          <w:b w:val="false"/>
+          <w:bCs w:val="false"/>
+          <w:i w:val="false"/>
+          <w:iCs w:val="false"/>
+        </w:rPr>
+        <w:t xml:space="preserve"> com o grupo (o motivo fica em aberto no jogo) e se isolou na Unifor, abandonada havia muito tempo, para usar a Âncora e ir viver nos anos 80 (seção 4.3).</w:t>
       </w:r>
     </w:p>
     <w:p>
@@ -4372,10 +4502,26 @@
                 <w:bCs w:val="false"/>
                 <w:i w:val="false"/>
                 <w:iCs w:val="false"/>
-                <w:sz w:val="19"/>
-                <w:szCs w:val="19"/>
-              </w:rPr>
-              <w:t xml:space="preserve">As estrelas: o céu é o único relógio que não muda, e é por ele que se acerta a data de volta de cada um</w:t>
+              </w:rPr>
+              <w:t xml:space="preserve">As estrelas: o céu é o único relógio que não muda, e é por ele que se acerta a data de volta de cada um. O Baltazar não está lá para entregar: o grupo usa a </w:t>
+            </w:r>
+            <w:r>
+              <w:rPr>
+                <w:b/>
+                <w:bCs/>
+                <w:i w:val="false"/>
+                <w:iCs w:val="false"/>
+              </w:rPr>
+              <w:t xml:space="preserve">chapa com o céu de casa</w:t>
+            </w:r>
+            <w:r>
+              <w:rPr>
+                <w:b w:val="false"/>
+                <w:bCs w:val="false"/>
+                <w:i w:val="false"/>
+                <w:iCs w:val="false"/>
+              </w:rPr>
+              <w:t xml:space="preserve"> que ele deixou na sala do Labirinto (seção 5)</w:t>
             </w:r>
           </w:p>
         </w:tc>
@@ -4927,7 +5073,7 @@
           <w:i w:val="false"/>
           <w:iCs w:val="false"/>
         </w:rPr>
-        <w:t xml:space="preserve">. Estão todos </w:t>
+        <w:t xml:space="preserve">. Os que Gabriel encontra estão todos </w:t>
       </w:r>
       <w:r>
         <w:rPr>
@@ -4945,7 +5091,7 @@
           <w:i w:val="false"/>
           <w:iCs w:val="false"/>
         </w:rPr>
-        <w:t xml:space="preserve">, cada um sobrevivendo do seu jeito num lugar do campus, e Gabriel </w:t>
+        <w:t xml:space="preserve">, cada um sobrevivendo do seu jeito num lugar do campus, e ele </w:t>
       </w:r>
       <w:r>
         <w:rPr>
@@ -4963,7 +5109,25 @@
           <w:i w:val="false"/>
           <w:iCs w:val="false"/>
         </w:rPr>
-        <w:t xml:space="preserve">.</w:t>
+        <w:t xml:space="preserve">. O </w:t>
+      </w:r>
+      <w:r>
+        <w:rPr>
+          <w:b/>
+          <w:bCs/>
+          <w:i w:val="false"/>
+          <w:iCs w:val="false"/>
+        </w:rPr>
+        <w:t xml:space="preserve">Baltazar</w:t>
+      </w:r>
+      <w:r>
+        <w:rPr>
+          <w:b w:val="false"/>
+          <w:bCs w:val="false"/>
+          <w:i w:val="false"/>
+          <w:iCs w:val="false"/>
+        </w:rPr>
+        <w:t xml:space="preserve"> é a exceção: Gabriel só acha os rastros dele (seção 5).</w:t>
       </w:r>
     </w:p>
     <w:p>
@@ -5081,7 +5245,7 @@
           <w:i w:val="false"/>
           <w:iCs w:val="false"/>
         </w:rPr>
-        <w:t xml:space="preserve"> chegou depois da Clarice (apareceu na 103 quando a Clarice já estava lá). Só a posição do </w:t>
+        <w:t xml:space="preserve"> chegou depois da Clarice (apareceu na 103 quando a Clarice já estava lá). O </w:t>
       </w:r>
       <w:r>
         <w:rPr>
@@ -5099,7 +5263,7 @@
           <w:i w:val="false"/>
           <w:iCs w:val="false"/>
         </w:rPr>
-        <w:t xml:space="preserve"> ainda está pendente.</w:t>
+        <w:t xml:space="preserve"> fica fora dessa contagem (seção 5).</w:t>
       </w:r>
     </w:p>
     <w:p>
@@ -5163,7 +5327,7 @@
           <w:i w:val="false"/>
           <w:iCs w:val="false"/>
         </w:rPr>
-        <w:t xml:space="preserve"> dias antes dele. Sem contar o Baltazar: a Diana, 3 dias antes; a Clarice, 6; o Zane, 9; o Henrique, 12. Se o Baltazar entrar no meio da ordem, quem veio antes dele ganha mais 3 dias.</w:t>
+        <w:t xml:space="preserve"> dias antes dele. Sem contar o Baltazar: a Diana, 3 dias antes; a Clarice, 6; o Zane, 9; o Henrique, 12.</w:t>
       </w:r>
     </w:p>
     <w:p>
@@ -5995,26 +6159,25 @@
           <w:i w:val="false"/>
           <w:iCs w:val="false"/>
         </w:rPr>
-        <w:t xml:space="preserve">: saiu da resistência e se isolou na Unifor, sozinho durante anos, para ir viver nos anos 80. Quem ele é está na </w:t>
-      </w:r>
-      <w:r>
-        <w:rPr>
-          <w:b w:val="false"/>
-          <w:bCs w:val="false"/>
-          <w:i w:val="false"/>
-          <w:iCs w:val="false"/>
-          <w:color w:val="2A7F8E"/>
-        </w:rPr>
-        <w:t xml:space="preserve">ficha dele</w:t>
-      </w:r>
-      <w:r>
-        <w:rPr>
-          <w:b w:val="false"/>
-          <w:bCs w:val="false"/>
-          <w:i w:val="false"/>
-          <w:iCs w:val="false"/>
-        </w:rPr>
-        <w:t xml:space="preserve">.</w:t>
+        <w:t xml:space="preserve">: há alguns anos teve um </w:t>
+      </w:r>
+      <w:r>
+        <w:rPr>
+          <w:b/>
+          <w:bCs/>
+          <w:i w:val="false"/>
+          <w:iCs w:val="false"/>
+        </w:rPr>
+        <w:t xml:space="preserve">desentendimento</w:t>
+      </w:r>
+      <w:r>
+        <w:rPr>
+          <w:b w:val="false"/>
+          <w:bCs w:val="false"/>
+          <w:i w:val="false"/>
+          <w:iCs w:val="false"/>
+        </w:rPr>
+        <w:t xml:space="preserve"> com eles (o motivo fica em aberto no jogo) e se isolou na Unifor, abandonada havia muito tempo, sozinho durante anos, para ir viver nos anos 80. Quem ele é está na ficha dele.</w:t>
       </w:r>
     </w:p>
     <w:p>
@@ -6097,34 +6260,16 @@
           <w:i w:val="false"/>
           <w:iCs w:val="false"/>
         </w:rPr>
-        <w:t xml:space="preserve">O primeiro registro dele:</w:t>
-      </w:r>
-      <w:r>
-        <w:rPr>
-          <w:b w:val="false"/>
-          <w:bCs w:val="false"/>
-          <w:i w:val="false"/>
-          <w:iCs w:val="false"/>
-        </w:rPr>
-        <w:t xml:space="preserve"> a </w:t>
-      </w:r>
-      <w:r>
-        <w:rPr>
-          <w:b/>
-          <w:bCs/>
-          <w:i w:val="false"/>
-          <w:iCs w:val="false"/>
-        </w:rPr>
-        <w:t xml:space="preserve">Folha de calibração</w:t>
-      </w:r>
-      <w:r>
-        <w:rPr>
-          <w:b w:val="false"/>
-          <w:bCs w:val="false"/>
-          <w:i w:val="false"/>
-          <w:iCs w:val="false"/>
-        </w:rPr>
-        <w:t xml:space="preserve">, no Corredor do Tempo do Labirinto (opcional). Ali ele testava a calibração da Âncora com objetos dos anos 80 (um Genius, os três quadros de </w:t>
+        <w:t xml:space="preserve">A Grande Separação e a loucura:</w:t>
+      </w:r>
+      <w:r>
+        <w:rPr>
+          <w:b w:val="false"/>
+          <w:bCs w:val="false"/>
+          <w:i w:val="false"/>
+          <w:iCs w:val="false"/>
+        </w:rPr>
+        <w:t xml:space="preserve"> a partida dos </w:t>
       </w:r>
       <w:r>
         <w:rPr>
@@ -6133,52 +6278,88 @@
           <w:i/>
           <w:iCs/>
         </w:rPr>
-        <w:t xml:space="preserve">De Volta para o Futuro</w:t>
-      </w:r>
-      <w:r>
-        <w:rPr>
-          <w:b w:val="false"/>
-          <w:bCs w:val="false"/>
-          <w:i w:val="false"/>
-          <w:iCs w:val="false"/>
-        </w:rPr>
-        <w:t xml:space="preserve">, um micro e um telefone de disco). Na folha ele conta que a máquina errou de novo, abriu a fenda na Biblioteca e puxou alguém que ele </w:t>
-      </w:r>
-      <w:r>
-        <w:rPr>
-          <w:b/>
-          <w:bCs/>
-          <w:i w:val="false"/>
-          <w:iCs w:val="false"/>
-        </w:rPr>
-        <w:t xml:space="preserve">nem foi ver</w:t>
-      </w:r>
-      <w:r>
-        <w:rPr>
-          <w:b w:val="false"/>
-          <w:bCs w:val="false"/>
-          <w:i w:val="false"/>
-          <w:iCs w:val="false"/>
-        </w:rPr>
-        <w:t xml:space="preserve">; diz que já foi um Faroleiro e que só quer o mundo dos anos 80. </w:t>
-      </w:r>
-      <w:r>
-        <w:rPr>
-          <w:b/>
-          <w:bCs/>
-          <w:i w:val="false"/>
-          <w:iCs w:val="false"/>
-        </w:rPr>
-        <w:t xml:space="preserve">Assina só "C."</w:t>
-      </w:r>
-      <w:r>
-        <w:rPr>
-          <w:b w:val="false"/>
-          <w:bCs w:val="false"/>
-          <w:i w:val="false"/>
-          <w:iCs w:val="false"/>
-        </w:rPr>
-        <w:t xml:space="preserve">: o jogador ainda não sabe o nome dele (quando descobre continua pendente, seção 10.2).</w:t>
+        <w:t xml:space="preserve">Homo sideralis</w:t>
+      </w:r>
+      <w:r>
+        <w:rPr>
+          <w:b w:val="false"/>
+          <w:bCs w:val="false"/>
+          <w:i w:val="false"/>
+          <w:iCs w:val="false"/>
+        </w:rPr>
+        <w:t xml:space="preserve"> o separou dos amigos e das pessoas de quem gostava. Os anos sozinho, somados à frieza das relações do tempo dele, o </w:t>
+      </w:r>
+      <w:r>
+        <w:rPr>
+          <w:b/>
+          <w:bCs/>
+          <w:i w:val="false"/>
+          <w:iCs w:val="false"/>
+        </w:rPr>
+        <w:t xml:space="preserve">enlouqueceram</w:t>
+      </w:r>
+      <w:r>
+        <w:rPr>
+          <w:b w:val="false"/>
+          <w:bCs w:val="false"/>
+          <w:i w:val="false"/>
+          <w:iCs w:val="false"/>
+        </w:rPr>
+        <w:t xml:space="preserve">: acha que o passado é sempre melhor. Vive como se estivesse nos anos 80 (montou a </w:t>
+      </w:r>
+      <w:r>
+        <w:rPr>
+          <w:b/>
+          <w:bCs/>
+          <w:i w:val="false"/>
+          <w:iCs w:val="false"/>
+        </w:rPr>
+        <w:t xml:space="preserve">sala de estar dos anos 80</w:t>
+      </w:r>
+      <w:r>
+        <w:rPr>
+          <w:b w:val="false"/>
+          <w:bCs w:val="false"/>
+          <w:i w:val="false"/>
+          <w:iCs w:val="false"/>
+        </w:rPr>
+        <w:t xml:space="preserve"> do Bunker, fala sozinho como um </w:t>
+      </w:r>
+      <w:r>
+        <w:rPr>
+          <w:b/>
+          <w:bCs/>
+          <w:i w:val="false"/>
+          <w:iCs w:val="false"/>
+        </w:rPr>
+        <w:t xml:space="preserve">locutor de rádio</w:t>
+      </w:r>
+      <w:r>
+        <w:rPr>
+          <w:b w:val="false"/>
+          <w:bCs w:val="false"/>
+          <w:i w:val="false"/>
+          <w:iCs w:val="false"/>
+        </w:rPr>
+        <w:t xml:space="preserve">, sem gírias, e dá aos robôs nomes de gente da época) e tem </w:t>
+      </w:r>
+      <w:r>
+        <w:rPr>
+          <w:b/>
+          <w:bCs/>
+          <w:i w:val="false"/>
+          <w:iCs w:val="false"/>
+        </w:rPr>
+        <w:t xml:space="preserve">medo do presente</w:t>
+      </w:r>
+      <w:r>
+        <w:rPr>
+          <w:b w:val="false"/>
+          <w:bCs w:val="false"/>
+          <w:i w:val="false"/>
+          <w:iCs w:val="false"/>
+        </w:rPr>
+        <w:t xml:space="preserve">: ficar preso em 3026, frio e sozinho para sempre.</w:t>
       </w:r>
     </w:p>
     <w:p>
@@ -6192,23 +6373,94 @@
       </w:pPr>
       <w:r>
         <w:rPr>
-          <w:b w:val="false"/>
-          <w:bCs w:val="false"/>
-          <w:i w:val="false"/>
-          <w:iCs w:val="false"/>
-        </w:rPr>
-        <w:t xml:space="preserve">Muita coisa sobre o Carlos ainda está pendente (seção 10.2).</w:t>
-      </w:r>
-    </w:p>
-    <w:p>
-      <w:pPr>
-        <w:pStyle w:val="Heading1"/>
-      </w:pPr>
-      <w:bookmarkStart w:name="_Toc14" w:id="14"/>
-      <w:r>
-        <w:t xml:space="preserve">5. A família Magalhães</w:t>
-      </w:r>
-      <w:bookmarkEnd w:id="14"/>
+          <w:b/>
+          <w:bCs/>
+          <w:i w:val="false"/>
+          <w:iCs w:val="false"/>
+        </w:rPr>
+        <w:t xml:space="preserve">O primeiro registro dele:</w:t>
+      </w:r>
+      <w:r>
+        <w:rPr>
+          <w:b w:val="false"/>
+          <w:bCs w:val="false"/>
+          <w:i w:val="false"/>
+          <w:iCs w:val="false"/>
+        </w:rPr>
+        <w:t xml:space="preserve"> a </w:t>
+      </w:r>
+      <w:r>
+        <w:rPr>
+          <w:b/>
+          <w:bCs/>
+          <w:i w:val="false"/>
+          <w:iCs w:val="false"/>
+        </w:rPr>
+        <w:t xml:space="preserve">Folha de calibração</w:t>
+      </w:r>
+      <w:r>
+        <w:rPr>
+          <w:b w:val="false"/>
+          <w:bCs w:val="false"/>
+          <w:i w:val="false"/>
+          <w:iCs w:val="false"/>
+        </w:rPr>
+        <w:t xml:space="preserve">, no Corredor do Tempo do Labirinto (opcional). Ali ele testava a calibração da Âncora com objetos dos anos 80 (um Genius, os três quadros de </w:t>
+      </w:r>
+      <w:r>
+        <w:rPr>
+          <w:b w:val="false"/>
+          <w:bCs w:val="false"/>
+          <w:i/>
+          <w:iCs/>
+        </w:rPr>
+        <w:t xml:space="preserve">De Volta para o Futuro</w:t>
+      </w:r>
+      <w:r>
+        <w:rPr>
+          <w:b w:val="false"/>
+          <w:bCs w:val="false"/>
+          <w:i w:val="false"/>
+          <w:iCs w:val="false"/>
+        </w:rPr>
+        <w:t xml:space="preserve">, um micro e um telefone de disco). Na folha ele conta que a máquina errou de novo, abriu a fenda na Biblioteca e puxou alguém que ele </w:t>
+      </w:r>
+      <w:r>
+        <w:rPr>
+          <w:b/>
+          <w:bCs/>
+          <w:i w:val="false"/>
+          <w:iCs w:val="false"/>
+        </w:rPr>
+        <w:t xml:space="preserve">nem foi ver</w:t>
+      </w:r>
+      <w:r>
+        <w:rPr>
+          <w:b w:val="false"/>
+          <w:bCs w:val="false"/>
+          <w:i w:val="false"/>
+          <w:iCs w:val="false"/>
+        </w:rPr>
+        <w:t xml:space="preserve">; diz que já foi um Faroleiro e que só quer o mundo dos anos 80. </w:t>
+      </w:r>
+      <w:r>
+        <w:rPr>
+          <w:b/>
+          <w:bCs/>
+          <w:i w:val="false"/>
+          <w:iCs w:val="false"/>
+        </w:rPr>
+        <w:t xml:space="preserve">Assina só "C."</w:t>
+      </w:r>
+      <w:r>
+        <w:rPr>
+          <w:b w:val="false"/>
+          <w:bCs w:val="false"/>
+          <w:i w:val="false"/>
+          <w:iCs w:val="false"/>
+        </w:rPr>
+        <w:t xml:space="preserve">: o jogador ainda não sabe o nome dele (quando descobre continua pendente, seção 10.2).</w:t>
+      </w:r>
     </w:p>
     <w:p>
       <w:pPr>
@@ -6221,40 +6473,23 @@
       </w:pPr>
       <w:r>
         <w:rPr>
-          <w:b/>
-          <w:bCs/>
-          <w:i w:val="false"/>
-          <w:iCs w:val="false"/>
-        </w:rPr>
-        <w:t xml:space="preserve">Baltazar é antepassado de Gabriel</w:t>
-      </w:r>
-      <w:r>
-        <w:rPr>
-          <w:b w:val="false"/>
-          <w:bCs w:val="false"/>
-          <w:i w:val="false"/>
-          <w:iCs w:val="false"/>
-        </w:rPr>
-        <w:t xml:space="preserve">, umas dez gerações antes dele. O sobrenome </w:t>
-      </w:r>
-      <w:r>
-        <w:rPr>
-          <w:b/>
-          <w:bCs/>
-          <w:i w:val="false"/>
-          <w:iCs w:val="false"/>
-        </w:rPr>
-        <w:t xml:space="preserve">Magalhães</w:t>
-      </w:r>
-      <w:r>
-        <w:rPr>
-          <w:b w:val="false"/>
-          <w:bCs w:val="false"/>
-          <w:i w:val="false"/>
-          <w:iCs w:val="false"/>
-        </w:rPr>
-        <w:t xml:space="preserve"> liga a família pelos séculos.</w:t>
-      </w:r>
+          <w:b w:val="false"/>
+          <w:bCs w:val="false"/>
+          <w:i w:val="false"/>
+          <w:iCs w:val="false"/>
+        </w:rPr>
+        <w:t xml:space="preserve">Muita coisa sobre o Carlos ainda está pendente (seção 10.2).</w:t>
+      </w:r>
+    </w:p>
+    <w:p>
+      <w:pPr>
+        <w:pStyle w:val="Heading1"/>
+      </w:pPr>
+      <w:bookmarkStart w:name="_Toc14" w:id="14"/>
+      <w:r>
+        <w:t xml:space="preserve">5. A família Magalhães</w:t>
+      </w:r>
+      <w:bookmarkEnd w:id="14"/>
     </w:p>
     <w:p>
       <w:pPr>
@@ -6272,34 +6507,34 @@
           <w:i w:val="false"/>
           <w:iCs w:val="false"/>
         </w:rPr>
-        <w:t xml:space="preserve">O objeto:</w:t>
-      </w:r>
-      <w:r>
-        <w:rPr>
-          <w:b w:val="false"/>
-          <w:bCs w:val="false"/>
-          <w:i w:val="false"/>
-          <w:iCs w:val="false"/>
-        </w:rPr>
-        <w:t xml:space="preserve"> Gabriel começa o jogo com um </w:t>
-      </w:r>
-      <w:r>
-        <w:rPr>
-          <w:b/>
-          <w:bCs/>
-          <w:i w:val="false"/>
-          <w:iCs w:val="false"/>
-        </w:rPr>
-        <w:t xml:space="preserve">anel desgastado</w:t>
-      </w:r>
-      <w:r>
-        <w:rPr>
-          <w:b w:val="false"/>
-          <w:bCs w:val="false"/>
-          <w:i w:val="false"/>
-          <w:iCs w:val="false"/>
-        </w:rPr>
-        <w:t xml:space="preserve"> no inventário, que a avó deu para ele. O jogador vê o item desde o começo sem dar importância.</w:t>
+        <w:t xml:space="preserve">Baltazar é antepassado de Gabriel</w:t>
+      </w:r>
+      <w:r>
+        <w:rPr>
+          <w:b w:val="false"/>
+          <w:bCs w:val="false"/>
+          <w:i w:val="false"/>
+          <w:iCs w:val="false"/>
+        </w:rPr>
+        <w:t xml:space="preserve">, umas dez gerações antes dele. O sobrenome </w:t>
+      </w:r>
+      <w:r>
+        <w:rPr>
+          <w:b/>
+          <w:bCs/>
+          <w:i w:val="false"/>
+          <w:iCs w:val="false"/>
+        </w:rPr>
+        <w:t xml:space="preserve">Magalhães</w:t>
+      </w:r>
+      <w:r>
+        <w:rPr>
+          <w:b w:val="false"/>
+          <w:bCs w:val="false"/>
+          <w:i w:val="false"/>
+          <w:iCs w:val="false"/>
+        </w:rPr>
+        <w:t xml:space="preserve"> liga a família pelos séculos.</w:t>
       </w:r>
     </w:p>
     <w:p>
@@ -6318,16 +6553,34 @@
           <w:i w:val="false"/>
           <w:iCs w:val="false"/>
         </w:rPr>
-        <w:t xml:space="preserve">A descoberta acontece jogando</w:t>
-      </w:r>
-      <w:r>
-        <w:rPr>
-          <w:b w:val="false"/>
-          <w:bCs w:val="false"/>
-          <w:i w:val="false"/>
-          <w:iCs w:val="false"/>
-        </w:rPr>
-        <w:t xml:space="preserve">, não numa explicação: no meio do jogo, Gabriel vê o mesmo anel com o Baltazar (novo no dedo dele, gasto no de Gabriel). O jogador compara os dois e entende sozinho.</w:t>
+        <w:t xml:space="preserve">O objeto:</w:t>
+      </w:r>
+      <w:r>
+        <w:rPr>
+          <w:b w:val="false"/>
+          <w:bCs w:val="false"/>
+          <w:i w:val="false"/>
+          <w:iCs w:val="false"/>
+        </w:rPr>
+        <w:t xml:space="preserve"> Gabriel começa o jogo com um </w:t>
+      </w:r>
+      <w:r>
+        <w:rPr>
+          <w:b/>
+          <w:bCs/>
+          <w:i w:val="false"/>
+          <w:iCs w:val="false"/>
+        </w:rPr>
+        <w:t xml:space="preserve">anel desgastado</w:t>
+      </w:r>
+      <w:r>
+        <w:rPr>
+          <w:b w:val="false"/>
+          <w:bCs w:val="false"/>
+          <w:i w:val="false"/>
+          <w:iCs w:val="false"/>
+        </w:rPr>
+        <w:t xml:space="preserve"> no inventário, que a avó deu para ele. O jogador vê o item desde o começo sem dar importância.</w:t>
       </w:r>
     </w:p>
     <w:p>
@@ -6346,16 +6599,106 @@
           <w:i w:val="false"/>
           <w:iCs w:val="false"/>
         </w:rPr>
-        <w:t xml:space="preserve">Gabriel conta para o Baltazar</w:t>
-      </w:r>
-      <w:r>
-        <w:rPr>
-          <w:b w:val="false"/>
-          <w:bCs w:val="false"/>
-          <w:i w:val="false"/>
-          <w:iCs w:val="false"/>
-        </w:rPr>
-        <w:t xml:space="preserve"> que é descendente dele.</w:t>
+        <w:t xml:space="preserve">O Baltazar nunca aparece em pessoa.</w:t>
+      </w:r>
+      <w:r>
+        <w:rPr>
+          <w:b w:val="false"/>
+          <w:bCs w:val="false"/>
+          <w:i w:val="false"/>
+          <w:iCs w:val="false"/>
+        </w:rPr>
+        <w:t xml:space="preserve"> Gabriel só acha os </w:t>
+      </w:r>
+      <w:r>
+        <w:rPr>
+          <w:b/>
+          <w:bCs/>
+          <w:i w:val="false"/>
+          <w:iCs w:val="false"/>
+        </w:rPr>
+        <w:t xml:space="preserve">rastros</w:t>
+      </w:r>
+      <w:r>
+        <w:rPr>
+          <w:b w:val="false"/>
+          <w:bCs w:val="false"/>
+          <w:i w:val="false"/>
+          <w:iCs w:val="false"/>
+        </w:rPr>
+        <w:t xml:space="preserve"> dele. O Baltazar seguiu a luz ("Hei de seguir a luz até onde ella nasce") pelo </w:t>
+      </w:r>
+      <w:r>
+        <w:rPr>
+          <w:b/>
+          <w:bCs/>
+          <w:i w:val="false"/>
+          <w:iCs w:val="false"/>
+        </w:rPr>
+        <w:t xml:space="preserve">mesmo caminho que Gabriel faz</w:t>
+      </w:r>
+      <w:r>
+        <w:rPr>
+          <w:b w:val="false"/>
+          <w:bCs w:val="false"/>
+          <w:i w:val="false"/>
+          <w:iCs w:val="false"/>
+        </w:rPr>
+        <w:t xml:space="preserve">, fase por fase, até a </w:t>
+      </w:r>
+      <w:r>
+        <w:rPr>
+          <w:b/>
+          <w:bCs/>
+          <w:i w:val="false"/>
+          <w:iCs w:val="false"/>
+        </w:rPr>
+        <w:t xml:space="preserve">Âncora</w:t>
+      </w:r>
+      <w:r>
+        <w:rPr>
+          <w:b w:val="false"/>
+          <w:bCs w:val="false"/>
+          <w:i w:val="false"/>
+          <w:iCs w:val="false"/>
+        </w:rPr>
+        <w:t xml:space="preserve">, onde a luz nasce. Ali a trilha termina, e ele </w:t>
+      </w:r>
+      <w:r>
+        <w:rPr>
+          <w:b/>
+          <w:bCs/>
+          <w:i w:val="false"/>
+          <w:iCs w:val="false"/>
+        </w:rPr>
+        <w:t xml:space="preserve">desaparece</w:t>
+      </w:r>
+      <w:r>
+        <w:rPr>
+          <w:b w:val="false"/>
+          <w:bCs w:val="false"/>
+          <w:i w:val="false"/>
+          <w:iCs w:val="false"/>
+        </w:rPr>
+        <w:t xml:space="preserve">. O que aconteceu com ele fica </w:t>
+      </w:r>
+      <w:r>
+        <w:rPr>
+          <w:b/>
+          <w:bCs/>
+          <w:i w:val="false"/>
+          <w:iCs w:val="false"/>
+        </w:rPr>
+        <w:t xml:space="preserve">em aberto até o fim do jogo</w:t>
+      </w:r>
+      <w:r>
+        <w:rPr>
+          <w:b w:val="false"/>
+          <w:bCs w:val="false"/>
+          <w:i w:val="false"/>
+          <w:iCs w:val="false"/>
+        </w:rPr>
+        <w:t xml:space="preserve">.</w:t>
       </w:r>
     </w:p>
     <w:p>
@@ -6369,12 +6712,21 @@
       </w:pPr>
       <w:r>
         <w:rPr>
-          <w:b w:val="false"/>
-          <w:bCs w:val="false"/>
-          <w:i w:val="false"/>
-          <w:iCs w:val="false"/>
-        </w:rPr>
-        <w:t xml:space="preserve">Com isso, mandar todos de volta deixa de ser só ajudar os outros: se o Baltazar não voltar para 1750, a família de Gabriel pode nunca existir.</w:t>
+          <w:b/>
+          <w:bCs/>
+          <w:i w:val="false"/>
+          <w:iCs w:val="false"/>
+        </w:rPr>
+        <w:t xml:space="preserve">Os rastros pelas fases:</w:t>
+      </w:r>
+      <w:r>
+        <w:rPr>
+          <w:b w:val="false"/>
+          <w:bCs w:val="false"/>
+          <w:i w:val="false"/>
+          <w:iCs w:val="false"/>
+        </w:rPr>
+        <w:t xml:space="preserve"> na Biblioteca, o acampamento e o diário; no Bloco de salas, estrelas riscadas numa lousa, no meio das contas de 3026; no Labirinto, a sala onde ele morou, vazia, com uma carta; no Centro de Convivência, uma página perdida do diário e cera de vela num canto escondido da praça; no Bunker, a sala de visitas do século XIX, onde ele dormiu porque ela parecia casa; no D-Tec, o último rastro, perto da Âncora.</w:t>
       </w:r>
     </w:p>
     <w:p>
@@ -6393,16 +6745,90 @@
           <w:i w:val="false"/>
           <w:iCs w:val="false"/>
         </w:rPr>
-        <w:t xml:space="preserve">O Baltazar quer ficar, mas não pode.</w:t>
-      </w:r>
-      <w:r>
-        <w:rPr>
-          <w:b w:val="false"/>
-          <w:bCs w:val="false"/>
-          <w:i w:val="false"/>
-          <w:iCs w:val="false"/>
-        </w:rPr>
-        <w:t xml:space="preserve"> Para ele, 3026 é um milagre a estudar, e ele quer ficar. Só que precisa voltar, ou a família de Gabriel não existe. Gabriel tem que convencer o próprio antepassado a ir embora.</w:t>
+        <w:t xml:space="preserve">A descoberta acontece jogando</w:t>
+      </w:r>
+      <w:r>
+        <w:rPr>
+          <w:b w:val="false"/>
+          <w:bCs w:val="false"/>
+          <w:i w:val="false"/>
+          <w:iCs w:val="false"/>
+        </w:rPr>
+        <w:t xml:space="preserve">, não numa explicação: numa das </w:t>
+      </w:r>
+      <w:r>
+        <w:rPr>
+          <w:b/>
+          <w:bCs/>
+          <w:i w:val="false"/>
+          <w:iCs w:val="false"/>
+        </w:rPr>
+        <w:t xml:space="preserve">cartas</w:t>
+      </w:r>
+      <w:r>
+        <w:rPr>
+          <w:b w:val="false"/>
+          <w:bCs w:val="false"/>
+          <w:i w:val="false"/>
+          <w:iCs w:val="false"/>
+        </w:rPr>
+        <w:t xml:space="preserve">, o Baltazar desenha o anel que leva no dedo. O jogador compara o desenho com o anel gasto do Gabriel no inventário e entende sozinho que é o mesmo.</w:t>
+      </w:r>
+    </w:p>
+    <w:p>
+      <w:pPr>
+        <w:pStyle w:val="Corpo"/>
+        <w:numPr>
+          <w:ilvl w:val="0"/>
+          <w:numId w:val="2"/>
+        </w:numPr>
+        <w:spacing w:after="70"/>
+      </w:pPr>
+      <w:r>
+        <w:rPr>
+          <w:b/>
+          <w:bCs/>
+          <w:i w:val="false"/>
+          <w:iCs w:val="false"/>
+        </w:rPr>
+        <w:t xml:space="preserve">As cartas:</w:t>
+      </w:r>
+      <w:r>
+        <w:rPr>
+          <w:b w:val="false"/>
+          <w:bCs w:val="false"/>
+          <w:i w:val="false"/>
+          <w:iCs w:val="false"/>
+        </w:rPr>
+        <w:t xml:space="preserve"> ele escreve para alguém em 1750, cartas que nunca vão chegar. Mudam de tom pelo caminho: medo, curiosidade, coragem. A quem são endereçadas está pendente (seção 10.4).</w:t>
+      </w:r>
+    </w:p>
+    <w:p>
+      <w:pPr>
+        <w:pStyle w:val="Corpo"/>
+        <w:numPr>
+          <w:ilvl w:val="0"/>
+          <w:numId w:val="2"/>
+        </w:numPr>
+        <w:spacing w:after="70"/>
+      </w:pPr>
+      <w:r>
+        <w:rPr>
+          <w:b/>
+          <w:bCs/>
+          <w:i w:val="false"/>
+          <w:iCs w:val="false"/>
+        </w:rPr>
+        <w:t xml:space="preserve">A dúvida que fica:</w:t>
+      </w:r>
+      <w:r>
+        <w:rPr>
+          <w:b w:val="false"/>
+          <w:bCs w:val="false"/>
+          <w:i w:val="false"/>
+          <w:iCs w:val="false"/>
+        </w:rPr>
+        <w:t xml:space="preserve"> a única prova de que o Baltazar voltou para 1750 é o próprio Gabriel existir. Se ele não voltou, como o Gabriel está ali? O jogo não responde.</w:t>
       </w:r>
     </w:p>
     <w:p>
@@ -6906,7 +7332,25 @@
                 <w:i w:val="false"/>
                 <w:iCs w:val="false"/>
               </w:rPr>
-              <w:t xml:space="preserve">Baltazar, sozinho e com medo. Deixou o acampamento da Biblioteca seguindo a luz, desceu ao subsolo e se escondeu ali. Os robôs nunca acharam a sala</w:t>
+              <w:t xml:space="preserve">Baltazar, que </w:t>
+            </w:r>
+            <w:r>
+              <w:rPr>
+                <w:b/>
+                <w:bCs/>
+                <w:i w:val="false"/>
+                <w:iCs w:val="false"/>
+              </w:rPr>
+              <w:t xml:space="preserve">já não está lá</w:t>
+            </w:r>
+            <w:r>
+              <w:rPr>
+                <w:b w:val="false"/>
+                <w:bCs w:val="false"/>
+                <w:i w:val="false"/>
+                <w:iCs w:val="false"/>
+              </w:rPr>
+              <w:t xml:space="preserve">. Morou ali depois de deixar o acampamento da Biblioteca, seguindo a luz; ficaram as velas, a cama de panos, o robô desmontado, a chapa com o céu de casa e uma carta. Os robôs nunca acharam a sala</w:t>
             </w:r>
           </w:p>
         </w:tc>
@@ -7423,25 +7867,7 @@
           <w:i w:val="false"/>
           <w:iCs w:val="false"/>
         </w:rPr>
-        <w:t xml:space="preserve"> teve dificuldade com o rádio e com a tecnologia de 3026, ficou com medo e </w:t>
-      </w:r>
-      <w:r>
-        <w:rPr>
-          <w:b/>
-          <w:bCs/>
-          <w:i w:val="false"/>
-          <w:iCs w:val="false"/>
-        </w:rPr>
-        <w:t xml:space="preserve">se isolou</w:t>
-      </w:r>
-      <w:r>
-        <w:rPr>
-          <w:b w:val="false"/>
-          <w:bCs w:val="false"/>
-          <w:i w:val="false"/>
-          <w:iCs w:val="false"/>
-        </w:rPr>
-        <w:t xml:space="preserve">: não está na frequência. Ouve as vozes nas "caixas que falam" pelos corredores do subsolo e não responde. Gabriel só fala com ele em pessoa.</w:t>
+        <w:t xml:space="preserve"> nunca esteve na frequência: teve dificuldade com o rádio e com a tecnologia de 3026, ficou com medo e se isolou. Ouvia as vozes nas "caixas que falam" pelos corredores do subsolo e não respondia. Gabriel nunca fala com ele: só lê o que ele deixou.</w:t>
       </w:r>
     </w:p>
     <w:p>
@@ -8300,7 +8726,25 @@
           <w:i w:val="false"/>
           <w:iCs w:val="false"/>
         </w:rPr>
-        <w:t xml:space="preserve"> a sociedade e o planeta ficam muito ruins. A humanidade se divide, e os </w:t>
+        <w:t xml:space="preserve"> a sociedade e o planeta ficam muito ruins. A humanidade se divide na </w:t>
+      </w:r>
+      <w:r>
+        <w:rPr>
+          <w:b/>
+          <w:bCs/>
+          <w:i w:val="false"/>
+          <w:iCs w:val="false"/>
+        </w:rPr>
+        <w:t xml:space="preserve">Grande Separação</w:t>
+      </w:r>
+      <w:r>
+        <w:rPr>
+          <w:b w:val="false"/>
+          <w:bCs w:val="false"/>
+          <w:i w:val="false"/>
+          <w:iCs w:val="false"/>
+        </w:rPr>
+        <w:t xml:space="preserve">: os </w:t>
       </w:r>
       <w:r>
         <w:rPr>
@@ -8382,7 +8826,7 @@
           <w:i w:val="false"/>
           <w:iCs w:val="false"/>
         </w:rPr>
-        <w:t xml:space="preserve"> e se isola na Unifor. Passa anos sozinho, constrói a Âncora no D-Tec e toma o controle dos robôs.</w:t>
+        <w:t xml:space="preserve">, há alguns anos, depois de um desentendimento, e se isola na Unifor, abandonada havia muito tempo. Passa anos sozinho, constrói a Âncora no D-Tec e toma o controle dos robôs.</w:t>
       </w:r>
     </w:p>
     <w:p>
@@ -8935,7 +9379,7 @@
           <w:i w:val="false"/>
           <w:iCs w:val="false"/>
         </w:rPr>
-        <w:t xml:space="preserve"> entre as raízes da árvore. Ele não está lá.</w:t>
+        <w:t xml:space="preserve"> entre as raízes da árvore. Ele não está lá: é o primeiro rastro dele (seção 5).</w:t>
       </w:r>
     </w:p>
     <w:p>
@@ -9171,30 +9615,7 @@
           <w:i w:val="false"/>
           <w:iCs w:val="false"/>
         </w:rPr>
-        <w:t xml:space="preserve"> (</w:t>
-      </w:r>
-      <w:r>
-        <w:rPr>
-          <w:rFonts w:ascii="Courier New" w:cs="Courier New" w:eastAsia="Courier New" w:hAnsi="Courier New"/>
-          <w:b w:val="false"/>
-          <w:bCs w:val="false"/>
-          <w:i w:val="false"/>
-          <w:iCs w:val="false"/>
-          <w:color w:val="2A7F8E"/>
-          <w:sz w:val="19"/>
-          <w:szCs w:val="19"/>
-          <w:shd w:fill="EEF2F5" w:color="auto" w:val="clear"/>
-        </w:rPr>
-        <w:t xml:space="preserve">../fases/bloco_de_salas.md</w:t>
-      </w:r>
-      <w:r>
-        <w:rPr>
-          <w:b w:val="false"/>
-          <w:bCs w:val="false"/>
-          <w:i w:val="false"/>
-          <w:iCs w:val="false"/>
-        </w:rPr>
-        <w:t xml:space="preserve">): dois andares, 12 salas de aula, noite. É onde fica o esconderijo da </w:t>
+        <w:t xml:space="preserve"> (../fases/bloco_de_salas.md): dois andares, 12 salas de aula, noite. É onde fica o esconderijo da </w:t>
       </w:r>
       <w:r>
         <w:rPr>
@@ -9248,7 +9669,7 @@
           <w:i w:val="false"/>
           <w:iCs w:val="false"/>
         </w:rPr>
-        <w:t xml:space="preserve">, atrás de uma barricada. A Clarice foi para lá depois de chegar à Biblioteca; a Diana apareceu depois e foi acolhida por ela. Desde então as duas tentam descobrir o que aconteceu, com a ajuda do Henrique pelo rádio, e a Clarice conta isso a Gabriel. Gabriel ganha a confiança dela devolvendo o molho de chaves que ela perdeu (para ela, é uma permuta, não um pedido de ajuda); daí em diante a Clarice o guia pelo rádio (o que cada chave abre, por onde os robôs passam, que ela mapeou como um grafo) e fica no posto quando Gabriel sai pela porta corta-fogo do 1º andar. A saída, a porta corta-fogo do 1º andar, leva à próxima fase, o </w:t>
+        <w:t xml:space="preserve">, atrás de uma barricada. A Clarice foi para lá depois de chegar à Biblioteca; a Diana apareceu depois e foi acolhida por ela. A Diana não fica parada: sai da 103 escondida, contra as ordens da Clarice, para investigar, e a Clarice conta isso a Gabriel no primeiro encontro. Desde então as duas tentam descobrir o que aconteceu, com a ajuda do Henrique pelo rádio, e a Clarice conta isso a Gabriel. Gabriel ganha a confiança dela devolvendo o molho de chaves que ela perdeu (para ela, é uma permuta, não um pedido de ajuda); daí em diante a Clarice o guia pelo rádio (o que cada chave abre, por onde os robôs passam, que ela mapeou como um grafo) e fica no posto quando Gabriel sai pela porta corta-fogo do 1º andar. A saída, a porta corta-fogo do 1º andar, leva à próxima fase, o </w:t>
       </w:r>
       <w:r>
         <w:rPr>
@@ -9402,7 +9823,7 @@
           <w:i w:val="false"/>
           <w:iCs w:val="false"/>
         </w:rPr>
-        <w:t xml:space="preserve">. Ao entregar o notebook, o Zane avisa de duas coisas fora do mapa: uma parede no corredor de cima que esquenta como se tivesse gente atrás (é o esconderijo do Baltazar; o Zane não sabe quem está lá) e a porta âmbar do Corredor do Tempo. No meio do labirinto há uma sala opcional, o </w:t>
+        <w:t xml:space="preserve">. Ao entregar o notebook, o Zane avisa de duas coisas fora do mapa: uma parede no corredor de cima que esconde alguma coisa (é a sala onde o Baltazar morou; o Zane não sabe de quem é) e a porta âmbar do Corredor do Tempo. No meio do labirinto há uma sala opcional, o </w:t>
       </w:r>
       <w:r>
         <w:rPr>
@@ -9439,7 +9860,7 @@
           <w:i w:val="false"/>
           <w:iCs w:val="false"/>
         </w:rPr>
-        <w:t xml:space="preserve">O esconderijo do Baltazar (Labirinto):</w:t>
+        <w:t xml:space="preserve">A sala do Baltazar (Labirinto):</w:t>
       </w:r>
       <w:r>
         <w:rPr>
@@ -9466,7 +9887,7 @@
           <w:i w:val="false"/>
           <w:iCs w:val="false"/>
         </w:rPr>
-        <w:t xml:space="preserve"> na parede, fica o esconderijo do </w:t>
+        <w:t xml:space="preserve"> na parede, fica a sala onde o </w:t>
       </w:r>
       <w:r>
         <w:rPr>
@@ -9484,7 +9905,7 @@
           <w:i w:val="false"/>
           <w:iCs w:val="false"/>
         </w:rPr>
-        <w:t xml:space="preserve">. O painel parece parede: só aparece com a </w:t>
+        <w:t xml:space="preserve"> morou. O painel parece parede: só aparece com a </w:t>
       </w:r>
       <w:r>
         <w:rPr>
@@ -9538,61 +9959,43 @@
           <w:i w:val="false"/>
           <w:iCs w:val="false"/>
         </w:rPr>
-        <w:t xml:space="preserve"> (as marcas que o Baltazar fez para achar a própria porta). Dentro, uma sala bagunçada: cama de panos, um altar de velas, livros trazidos da Biblioteca, um robô desmontado e uma chapa com o céu de casa riscado a giz. É ali o </w:t>
-      </w:r>
-      <w:r>
-        <w:rPr>
-          <w:b/>
-          <w:bCs/>
-          <w:i w:val="false"/>
-          <w:iCs w:val="false"/>
-        </w:rPr>
-        <w:t xml:space="preserve">primeiro encontro</w:t>
-      </w:r>
-      <w:r>
-        <w:rPr>
-          <w:b w:val="false"/>
-          <w:bCs w:val="false"/>
-          <w:i w:val="false"/>
-          <w:iCs w:val="false"/>
-        </w:rPr>
-        <w:t xml:space="preserve"> de Gabriel com ele. O Baltazar se assusta, pergunta se é o fim do mundo, conta que seguiu a luz até o subsolo e </w:t>
-      </w:r>
-      <w:r>
-        <w:rPr>
-          <w:b/>
-          <w:bCs/>
-          <w:i w:val="false"/>
-          <w:iCs w:val="false"/>
-        </w:rPr>
-        <w:t xml:space="preserve">não quer sair</w:t>
-      </w:r>
-      <w:r>
-        <w:rPr>
-          <w:b w:val="false"/>
-          <w:bCs w:val="false"/>
-          <w:i w:val="false"/>
-          <w:iCs w:val="false"/>
-        </w:rPr>
-        <w:t xml:space="preserve">: lá fora andam os robôs, e ali dentro eles não entram. Gabriel diz só o primeiro nome, e o parentesco </w:t>
-      </w:r>
-      <w:r>
-        <w:rPr>
-          <w:b/>
-          <w:bCs/>
-          <w:i w:val="false"/>
-          <w:iCs w:val="false"/>
-        </w:rPr>
-        <w:t xml:space="preserve">ainda não aparece</w:t>
-      </w:r>
-      <w:r>
-        <w:rPr>
-          <w:b w:val="false"/>
-          <w:bCs w:val="false"/>
-          <w:i w:val="false"/>
-          <w:iCs w:val="false"/>
-        </w:rPr>
-        <w:t xml:space="preserve"> nesse encontro.</w:t>
+        <w:t xml:space="preserve"> (as marcas que o Baltazar fez para achar a própria porta). Dentro, </w:t>
+      </w:r>
+      <w:r>
+        <w:rPr>
+          <w:b/>
+          <w:bCs/>
+          <w:i w:val="false"/>
+          <w:iCs w:val="false"/>
+        </w:rPr>
+        <w:t xml:space="preserve">vazia</w:t>
+      </w:r>
+      <w:r>
+        <w:rPr>
+          <w:b w:val="false"/>
+          <w:bCs w:val="false"/>
+          <w:i w:val="false"/>
+          <w:iCs w:val="false"/>
+        </w:rPr>
+        <w:t xml:space="preserve">: cama de panos, um altar de velas gastas, livros trazidos da Biblioteca, um robô desmontado, uma chapa com o céu de casa riscado a giz e uma </w:t>
+      </w:r>
+      <w:r>
+        <w:rPr>
+          <w:b/>
+          <w:bCs/>
+          <w:i w:val="false"/>
+          <w:iCs w:val="false"/>
+        </w:rPr>
+        <w:t xml:space="preserve">carta</w:t>
+      </w:r>
+      <w:r>
+        <w:rPr>
+          <w:b w:val="false"/>
+          <w:bCs w:val="false"/>
+          <w:i w:val="false"/>
+          <w:iCs w:val="false"/>
+        </w:rPr>
+        <w:t xml:space="preserve">. Ele não está lá: é um dos rastros dele (seção 5).</w:t>
       </w:r>
     </w:p>
     <w:p>
@@ -9789,7 +10192,7 @@
           <w:i w:val="false"/>
           <w:iCs w:val="false"/>
         </w:rPr>
-        <w:t xml:space="preserve"> no Labirinto, Gabriel conta pelo rádio do acampamento e do diário que achou na Biblioteca. Ninguém na frequência é de 1750: o grupo descobre que há mais alguém no campus, sozinho e fora da rede. Esse alguém é o Baltazar, escondido numa sala secreta do próprio Labirinto (Ato 2); se e como o grupo o traz para junto fica pendente (seção 10.4).</w:t>
+        <w:t xml:space="preserve"> no Labirinto, Gabriel conta pelo rádio do acampamento e do diário que achou na Biblioteca. Ninguém na frequência é de 1750: o grupo descobre que há mais alguém no campus, sozinho e fora da rede. Esse alguém é o Baltazar, que o grupo nunca encontra: só os rastros dele (seção 5).</w:t>
       </w:r>
     </w:p>
     <w:p>
@@ -9817,7 +10220,7 @@
           <w:i w:val="false"/>
           <w:iCs w:val="false"/>
         </w:rPr>
-        <w:t xml:space="preserve"> Gabriel conhece o Baltazar no Labirinto, mas o parentesco fica para depois: em algum ponto, ele compara os dois anéis e descobre (seção 10.5).</w:t>
+        <w:t xml:space="preserve"> numa carta do Baltazar, Gabriel acha o desenho do anel e descobre o parentesco (seção 5). Em que fase fica essa carta está pendente (seção 10.5).</w:t>
       </w:r>
     </w:p>
     <w:p>
@@ -10010,25 +10413,43 @@
           <w:i w:val="false"/>
           <w:iCs w:val="false"/>
         </w:rPr>
-        <w:t xml:space="preserve">. Mostram a obsessão do Carlos pelo passado, </w:t>
-      </w:r>
-      <w:r>
-        <w:rPr>
-          <w:b/>
-          <w:bCs/>
-          <w:i w:val="false"/>
-          <w:iCs w:val="false"/>
-        </w:rPr>
-        <w:t xml:space="preserve">sem explicar</w:t>
-      </w:r>
-      <w:r>
-        <w:rPr>
-          <w:b w:val="false"/>
-          <w:bCs w:val="false"/>
-          <w:i w:val="false"/>
-          <w:iCs w:val="false"/>
-        </w:rPr>
-        <w:t xml:space="preserve">: o jogo não diz quem as montou nem por quê.</w:t>
+        <w:t xml:space="preserve">. A dos anos 80 foi o </w:t>
+      </w:r>
+      <w:r>
+        <w:rPr>
+          <w:b/>
+          <w:bCs/>
+          <w:i w:val="false"/>
+          <w:iCs w:val="false"/>
+        </w:rPr>
+        <w:t xml:space="preserve">Carlos</w:t>
+      </w:r>
+      <w:r>
+        <w:rPr>
+          <w:b w:val="false"/>
+          <w:bCs w:val="false"/>
+          <w:i w:val="false"/>
+          <w:iCs w:val="false"/>
+        </w:rPr>
+        <w:t xml:space="preserve"> quem montou (seção 4.3). Na do século XIX, o </w:t>
+      </w:r>
+      <w:r>
+        <w:rPr>
+          <w:b/>
+          <w:bCs/>
+          <w:i w:val="false"/>
+          <w:iCs w:val="false"/>
+        </w:rPr>
+        <w:t xml:space="preserve">Baltazar</w:t>
+      </w:r>
+      <w:r>
+        <w:rPr>
+          <w:b w:val="false"/>
+          <w:bCs w:val="false"/>
+          <w:i w:val="false"/>
+          <w:iCs w:val="false"/>
+        </w:rPr>
+        <w:t xml:space="preserve"> dormiu, porque ela parecia casa, e deixou um rastro (seção 5). O jogo não explica nenhuma das duas em palavras: o jogador entende pelo que vê.</w:t>
       </w:r>
     </w:p>
     <w:p>
@@ -10864,16 +11285,16 @@
           <w:i w:val="false"/>
           <w:iCs w:val="false"/>
         </w:rPr>
-        <w:t xml:space="preserve">O Baltazar volta para 1750</w:t>
-      </w:r>
-      <w:r>
-        <w:rPr>
-          <w:b w:val="false"/>
-          <w:bCs w:val="false"/>
-          <w:i w:val="false"/>
-          <w:iCs w:val="false"/>
-        </w:rPr>
-        <w:t xml:space="preserve">, mesmo querendo ficar: Gabriel precisa convencê-lo (seção 5).</w:t>
+        <w:t xml:space="preserve">O Baltazar:</w:t>
+      </w:r>
+      <w:r>
+        <w:rPr>
+          <w:b w:val="false"/>
+          <w:bCs w:val="false"/>
+          <w:i w:val="false"/>
+          <w:iCs w:val="false"/>
+        </w:rPr>
+        <w:t xml:space="preserve"> a trilha dele termina na Âncora, onde a luz nasce. O que aconteceu com ele fica em aberto (seção 5).</w:t>
       </w:r>
     </w:p>
     <w:p>
@@ -11756,6 +12177,104 @@
               <w:bottom w:val="single" w:color="BFC9D1" w:sz="4"/>
               <w:right w:val="single" w:color="BFC9D1" w:sz="4"/>
             </w:tcBorders>
+            <w:shd w:fill="F7F9FA" w:color="auto" w:val="clear"/>
+            <w:tcMar>
+              <w:top w:type="dxa" w:w="60"/>
+              <w:left w:type="dxa" w:w="110"/>
+              <w:bottom w:type="dxa" w:w="60"/>
+              <w:right w:type="dxa" w:w="110"/>
+            </w:tcMar>
+            <w:vAlign w:val="top"/>
+          </w:tcPr>
+          <w:p>
+            <w:pPr>
+              <w:spacing w:after="0"/>
+            </w:pPr>
+            <w:r>
+              <w:rPr>
+                <w:b/>
+                <w:bCs/>
+                <w:i w:val="false"/>
+                <w:iCs w:val="false"/>
+              </w:rPr>
+              <w:t xml:space="preserve">Grande Separação</w:t>
+            </w:r>
+            <w:r>
+              <w:rPr>
+                <w:b w:val="false"/>
+                <w:bCs w:val="false"/>
+                <w:i w:val="false"/>
+                <w:iCs w:val="false"/>
+              </w:rPr>
+              <w:t xml:space="preserve"> (a partida dos </w:t>
+            </w:r>
+            <w:r>
+              <w:rPr>
+                <w:b w:val="false"/>
+                <w:bCs w:val="false"/>
+                <w:i/>
+                <w:iCs/>
+              </w:rPr>
+              <w:t xml:space="preserve">Homo sideralis</w:t>
+            </w:r>
+            <w:r>
+              <w:rPr>
+                <w:b w:val="false"/>
+                <w:bCs w:val="false"/>
+                <w:i w:val="false"/>
+                <w:iCs w:val="false"/>
+              </w:rPr>
+              <w:t xml:space="preserve"> para outro planeta, que dividiu a humanidade)</w:t>
+            </w:r>
+          </w:p>
+        </w:tc>
+        <w:tc>
+          <w:tcPr>
+            <w:tcW w:type="dxa" w:w="3983"/>
+            <w:tcBorders>
+              <w:top w:val="single" w:color="BFC9D1" w:sz="4"/>
+              <w:left w:val="single" w:color="BFC9D1" w:sz="4"/>
+              <w:bottom w:val="single" w:color="BFC9D1" w:sz="4"/>
+              <w:right w:val="single" w:color="BFC9D1" w:sz="4"/>
+            </w:tcBorders>
+            <w:shd w:fill="F7F9FA" w:color="auto" w:val="clear"/>
+            <w:tcMar>
+              <w:top w:type="dxa" w:w="60"/>
+              <w:left w:type="dxa" w:w="110"/>
+              <w:bottom w:type="dxa" w:w="60"/>
+              <w:right w:type="dxa" w:w="110"/>
+            </w:tcMar>
+            <w:vAlign w:val="top"/>
+          </w:tcPr>
+          <w:p>
+            <w:pPr>
+              <w:spacing w:after="0"/>
+            </w:pPr>
+            <w:r>
+              <w:rPr>
+                <w:b w:val="false"/>
+                <w:bCs w:val="false"/>
+                <w:i w:val="false"/>
+                <w:iCs w:val="false"/>
+              </w:rPr>
+              <w:t xml:space="preserve">"o êxodo", "a partida" como nome próprio</w:t>
+            </w:r>
+          </w:p>
+        </w:tc>
+      </w:tr>
+      <w:tr>
+        <w:trPr>
+          <w:cantSplit/>
+        </w:trPr>
+        <w:tc>
+          <w:tcPr>
+            <w:tcW w:type="dxa" w:w="5655"/>
+            <w:tcBorders>
+              <w:top w:val="single" w:color="BFC9D1" w:sz="4"/>
+              <w:left w:val="single" w:color="BFC9D1" w:sz="4"/>
+              <w:bottom w:val="single" w:color="BFC9D1" w:sz="4"/>
+              <w:right w:val="single" w:color="BFC9D1" w:sz="4"/>
+            </w:tcBorders>
             <w:tcMar>
               <w:top w:type="dxa" w:w="60"/>
               <w:left w:type="dxa" w:w="110"/>
@@ -12575,7 +13094,7 @@
           <w:i w:val="false"/>
           <w:iCs w:val="false"/>
         </w:rPr>
-        <w:t xml:space="preserve">Qual a idade dele, como fala, o que teme, qual o defeito e qual o arco?</w:t>
+        <w:t xml:space="preserve">Qual a idade dele, qual o defeito e qual o arco?</w:t>
       </w:r>
     </w:p>
     <w:p>
@@ -12594,7 +13113,7 @@
           <w:i w:val="false"/>
           <w:iCs w:val="false"/>
         </w:rPr>
-        <w:t xml:space="preserve">Por que ele saiu dos Faroleiros, e há quantos anos está sozinho?</w:t>
+        <w:t xml:space="preserve">Qual foi o desentendimento com os Faroleiros (no jogo fica em aberto), e há quantos anos ele está sozinho?</w:t>
       </w:r>
     </w:p>
     <w:p>
@@ -12798,25 +13317,7 @@
           <w:i w:val="false"/>
           <w:iCs w:val="false"/>
         </w:rPr>
-        <w:t xml:space="preserve"> em que posição da ordem de chegada ele está? (Já decidido: o Henrique é o primeiro, o Zane vem antes da Clarice, a Diana depois da Clarice, e Gabriel é o último; não precisa seguir a ordem dos anos. Cada chegada vem 3 dias depois da anterior, então a posição dele muda quantos dias cada um está lá.) Já decidido: o esconderijo dele é a sala secreta do Labirinto, e o primeiro encontro é lá. Hoje a sala é secreta, então o encontro é </w:t>
-      </w:r>
-      <w:r>
-        <w:rPr>
-          <w:b/>
-          <w:bCs/>
-          <w:i w:val="false"/>
-          <w:iCs w:val="false"/>
-        </w:rPr>
-        <w:t xml:space="preserve">opcional</w:t>
-      </w:r>
-      <w:r>
-        <w:rPr>
-          <w:b w:val="false"/>
-          <w:bCs w:val="false"/>
-          <w:i w:val="false"/>
-          <w:iCs w:val="false"/>
-        </w:rPr>
-        <w:t xml:space="preserve">: ele precisa ser obrigatório, já que o Baltazar traz as estrelas para consertar a Âncora? Como ele sai do esconderijo e se junta ao grupo? E a sala de obras raras da Biblioteca, barrada por dentro, que era a candidata ao esconderijo dele: quem (ou o quê) está do outro lado agora?</w:t>
+        <w:t xml:space="preserve"> a quem ele escreve as cartas, em 1750? (Já decidido: não aparece em pessoa, só pelos rastros, e desaparece na Âncora; o parentesco aparece pelo anel desenhado numa carta.) E a sala de obras raras da Biblioteca, barrada por dentro, que era a candidata ao esconderijo dele: quem (ou o quê) está do outro lado agora?</w:t>
       </w:r>
     </w:p>
     <w:p>
@@ -12970,7 +13471,7 @@
           <w:i w:val="false"/>
           <w:iCs w:val="false"/>
         </w:rPr>
-        <w:t xml:space="preserve">Em que momento Gabriel descobre o parentesco com o Baltazar? (O primeiro encontro já é no Labirinto, Ato 2.)</w:t>
+        <w:t xml:space="preserve">Em que fase fica a carta com o anel desenhado, o momento em que Gabriel descobre o parentesco com o Baltazar?</w:t>
       </w:r>
     </w:p>
     <w:p>

</xml_diff>